<commit_message>
fix(p5/p7/p8): add DOI to P8 Haans ref; rebuild P5/P7 blinded docx post-Haans
- p8/p8_pacific_sids_en_clean.md: add missing DOI to Haans et al. (2016) reference
  (all papers now consistent: smj.2399 DOI present in P3/P4/P5/P7/P8)
- p5/submission/ijoem_package/01_manuscript_blinded.docx: rebuilt after Haans
  4-condition LM block addition to §4.2 (commit 5ba7445)
- p7/submission/jibs_package/01_manuscript_blinded.docx: rebuilt after TP formula
  fix and Haans 4-condition block addition (commit 5ba7445)

https://claude.ai/code/session_01GMFmEtt6FYiJ4MKzBNCLqb
</commit_message>
<xml_diff>
--- a/p5/submission/ijoem_package/01_manuscript_blinded.docx
+++ b/p5/submission/ijoem_package/01_manuscript_blinded.docx
@@ -2,81 +2,13 @@
 <file path=word/document.xml><?xml version="1.0" encoding="utf-8"?>
 <w:document xmlns:w="http://schemas.openxmlformats.org/wordprocessingml/2006/main" xmlns:m="http://schemas.openxmlformats.org/officeDocument/2006/math" xmlns:r="http://schemas.openxmlformats.org/officeDocument/2006/relationships" xmlns:o="urn:schemas-microsoft-com:office:office" xmlns:v="urn:schemas-microsoft-com:vml" xmlns:w10="urn:schemas-microsoft-com:office:word" xmlns:a="http://schemas.openxmlformats.org/drawingml/2006/main" xmlns:pic="http://schemas.openxmlformats.org/drawingml/2006/picture" xmlns:wp="http://schemas.openxmlformats.org/drawingml/2006/wordprocessingDrawing">
   <w:body>
-    <w:bookmarkStart w:id="90" w:name="Xeed239f9d2e1ce3a88fd46b256b65d8ab89b86a"/>
+    <w:bookmarkStart w:id="89" w:name="Xeed239f9d2e1ce3a88fd46b256b65d8ab89b86a"/>
     <w:p>
       <w:pPr>
         <w:pStyle w:val="Heading1"/>
       </w:pPr>
       <w:r>
         <w:t xml:space="preserve">The Export Intensity–Performance Relationship in Chinese Private Firms: A Threshold-Stability Perspective</w:t>
-      </w:r>
-    </w:p>
-    <w:p>
-      <w:pPr>
-        <w:pStyle w:val="FirstParagraph"/>
-      </w:pPr>
-      <w:r>
-        <w:rPr>
-          <w:bCs/>
-          <w:b/>
-        </w:rPr>
-        <w:t xml:space="preserve">Phan Anh Tu</w:t>
-      </w:r>
-      <w:r>
-        <w:t xml:space="preserve"> </w:t>
-      </w:r>
-      <w:r>
-        <w:rPr>
-          <w:iCs/>
-          <w:i/>
-        </w:rPr>
-        <w:t xml:space="preserve">(Corresponding author)</w:t>
-      </w:r>
-      <w:r>
-        <w:t xml:space="preserve"> </w:t>
-      </w:r>
-      <w:r>
-        <w:t xml:space="preserve">· College of Economics, Can Tho University ·</w:t>
-      </w:r>
-      <w:r>
-        <w:t xml:space="preserve"> </w:t>
-      </w:r>
-      <w:hyperlink r:id="rId20">
-        <w:r>
-          <w:rPr>
-            <w:rStyle w:val="Hyperlink"/>
-          </w:rPr>
-          <w:t xml:space="preserve">patu@ctu.edu.vn</w:t>
-        </w:r>
-      </w:hyperlink>
-      <w:r>
-        <w:t xml:space="preserve"> </w:t>
-      </w:r>
-      <w:r>
-        <w:t xml:space="preserve">· ORCID:</w:t>
-      </w:r>
-      <w:r>
-        <w:t xml:space="preserve"> </w:t>
-      </w:r>
-      <w:hyperlink r:id="rId21">
-        <w:r>
-          <w:rPr>
-            <w:rStyle w:val="Hyperlink"/>
-          </w:rPr>
-          <w:t xml:space="preserve">0000-0003-0667-3137</w:t>
-        </w:r>
-      </w:hyperlink>
-    </w:p>
-    <w:p>
-      <w:pPr>
-        <w:pStyle w:val="BodyText"/>
-      </w:pPr>
-      <w:r>
-        <w:rPr>
-          <w:iCs/>
-          <w:i/>
-        </w:rPr>
-        <w:t xml:space="preserve">Submission: International Journal of Emerging Markets (IJOEM)</w:t>
       </w:r>
     </w:p>
     <w:p>
@@ -165,7 +97,7 @@
         </w:pict>
       </w:r>
     </w:p>
-    <w:bookmarkStart w:id="22" w:name="abstract"/>
+    <w:bookmarkStart w:id="20" w:name="abstract"/>
     <w:p>
       <w:pPr>
         <w:pStyle w:val="Heading2"/>
@@ -307,8 +239,8 @@
         </w:pict>
       </w:r>
     </w:p>
-    <w:bookmarkEnd w:id="22"/>
-    <w:bookmarkStart w:id="23" w:name="highlights"/>
+    <w:bookmarkEnd w:id="20"/>
+    <w:bookmarkStart w:id="21" w:name="highlights"/>
     <w:p>
       <w:pPr>
         <w:pStyle w:val="Heading2"/>
@@ -452,8 +384,8 @@
         </w:pict>
       </w:r>
     </w:p>
-    <w:bookmarkEnd w:id="23"/>
-    <w:bookmarkStart w:id="24" w:name="Xe3d0fc0bea9a42ce7605565d0964033d7f6ee47"/>
+    <w:bookmarkEnd w:id="21"/>
+    <w:bookmarkStart w:id="22" w:name="Xe3d0fc0bea9a42ce7605565d0964033d7f6ee47"/>
     <w:p>
       <w:pPr>
         <w:pStyle w:val="Heading2"/>
@@ -537,8 +469,8 @@
         </w:pict>
       </w:r>
     </w:p>
-    <w:bookmarkEnd w:id="24"/>
-    <w:bookmarkStart w:id="31" w:name="X8bf20a63f0decf7b16e99d564b9958ec4fbbb23"/>
+    <w:bookmarkEnd w:id="22"/>
+    <w:bookmarkStart w:id="29" w:name="X8bf20a63f0decf7b16e99d564b9958ec4fbbb23"/>
     <w:p>
       <w:pPr>
         <w:pStyle w:val="Heading2"/>
@@ -547,7 +479,7 @@
         <w:t xml:space="preserve">2. Theory and Hypotheses</w:t>
       </w:r>
     </w:p>
-    <w:bookmarkStart w:id="25" w:name="Xe089a51cf00ad631dbcdfa837bfcf2befbbb388"/>
+    <w:bookmarkStart w:id="23" w:name="Xe089a51cf00ad631dbcdfa837bfcf2befbbb388"/>
     <w:p>
       <w:pPr>
         <w:pStyle w:val="Heading3"/>
@@ -582,8 +514,8 @@
         <w:t xml:space="preserve">In the Chinese private-firm context, when export intensity increases from zero, firm performance (log labour productivity) first rises and then falls — because early export exposure generates learning, scale, and diversification gains (Johanson and Vahlne, 1977; Wagner, 2007), while beyond a threshold, coordination costs and resource diversion erode net returns (Hitt et al., 1997; Pierce and Aguinis, 2013) — such that the FSTS–lnLP relationship follows an inverted-U (quadratic) form before export intensity exceeds the cost-benefit inflection point.</w:t>
       </w:r>
     </w:p>
-    <w:bookmarkEnd w:id="25"/>
-    <w:bookmarkStart w:id="26" w:name="Xf1c81d13fe998b882da119ca3ec3b3d40ce5a1b"/>
+    <w:bookmarkEnd w:id="23"/>
+    <w:bookmarkStart w:id="24" w:name="Xf1c81d13fe998b882da119ca3ec3b3d40ce5a1b"/>
     <w:p>
       <w:pPr>
         <w:pStyle w:val="Heading3"/>
@@ -636,8 +568,8 @@
         <w:t xml:space="preserve">When China's institutional framework governing export costs and coordination remains structurally intact across decades, the I–P curvature coefficients (β₁, β₂) will not differ significantly across waves — because the fundamental tension between learning-by-exporting gains and coordination-cost escalation is anchored to firm-level resource constraints rather than the macro environment (Bausch and Krist, 2007; Marano et al., 2016) — so that the turning-point remains within a stable range regardless of the wave (structural-durability prediction).</w:t>
       </w:r>
     </w:p>
-    <w:bookmarkEnd w:id="26"/>
-    <w:bookmarkStart w:id="30" w:name="X505f50cd1f9abb1ab06672992aff36a1dc7f136"/>
+    <w:bookmarkEnd w:id="24"/>
+    <w:bookmarkStart w:id="28" w:name="X505f50cd1f9abb1ab06672992aff36a1dc7f136"/>
     <w:p>
       <w:pPr>
         <w:pStyle w:val="Heading3"/>
@@ -717,18 +649,18 @@
           <wp:inline>
             <wp:extent cx="5753100" cy="3764110"/>
             <wp:effectExtent b="0" l="0" r="0" t="0"/>
-            <wp:docPr descr="Figure 1: Conceptual model" title="" id="28" name="Picture"/>
+            <wp:docPr descr="Figure 1: Conceptual model" title="" id="26" name="Picture"/>
             <a:graphic>
               <a:graphicData uri="http://schemas.openxmlformats.org/drawingml/2006/picture">
                 <pic:pic>
                   <pic:nvPicPr>
-                    <pic:cNvPr descr="figures/p5_china/figure_1_conceptual_model.png" id="29" name="Picture"/>
+                    <pic:cNvPr descr="figures/p5_china/figure_1_conceptual_model.png" id="27" name="Picture"/>
                     <pic:cNvPicPr>
                       <a:picLocks noChangeArrowheads="1" noChangeAspect="1"/>
                     </pic:cNvPicPr>
                   </pic:nvPicPr>
                   <pic:blipFill>
-                    <a:blip r:embed="rId27"/>
+                    <a:blip r:embed="rId25"/>
                     <a:stretch>
                       <a:fillRect/>
                     </a:stretch>
@@ -780,9 +712,9 @@
         </w:pict>
       </w:r>
     </w:p>
-    <w:bookmarkEnd w:id="30"/>
-    <w:bookmarkEnd w:id="31"/>
-    <w:bookmarkStart w:id="35" w:name="X5eb800a903106e48a684e9ea9de39ed619b9df8"/>
+    <w:bookmarkEnd w:id="28"/>
+    <w:bookmarkEnd w:id="29"/>
+    <w:bookmarkStart w:id="33" w:name="X5eb800a903106e48a684e9ea9de39ed619b9df8"/>
     <w:p>
       <w:pPr>
         <w:pStyle w:val="Heading2"/>
@@ -791,7 +723,7 @@
         <w:t xml:space="preserve">3. Data and Methods</w:t>
       </w:r>
     </w:p>
-    <w:bookmarkStart w:id="32" w:name="X7539fb3dc2f98232f41138bc75cab658563f4ee"/>
+    <w:bookmarkStart w:id="30" w:name="X7539fb3dc2f98232f41138bc75cab658563f4ee"/>
     <w:p>
       <w:pPr>
         <w:pStyle w:val="Heading3"/>
@@ -962,8 +894,8 @@
         <w:t xml:space="preserve">The 2024 analytic sample (N = 1,940) is constructed from the full WBES private-firm frame with stricter non-response filtering than the 2012 wave. In 2024, WBES introduced a new non-response code −8 (refusal) in addition to the standard −9 (don’t know) and −7 (not applicable) codes used in 2012. The focal-set listwise deletion (sales + employees + export intensity non-missing) retains 1,940 of 2,189 firms (88.6 %). By contrast, the controls-inclusive listwise deletion used in the regression models (sample_base: additionally requiring non-missing lnEmp, firmage, foreigndummy) reduces the 2024 wave to 1,934 observations and the pooled sample to 4,544. Turning-point estimates (47.2 % in 2024) and Paternoster z-tests are invariant across the two sample definitions.</w:t>
       </w:r>
     </w:p>
-    <w:bookmarkEnd w:id="32"/>
-    <w:bookmarkStart w:id="33" w:name="X431a8b355211b47c6e494a5f659051454df4ed1"/>
+    <w:bookmarkEnd w:id="30"/>
+    <w:bookmarkStart w:id="31" w:name="X431a8b355211b47c6e494a5f659051454df4ed1"/>
     <w:p>
       <w:pPr>
         <w:pStyle w:val="Heading3"/>
@@ -1218,8 +1150,8 @@
         <w:t xml:space="preserve">, &gt; 10 % foreign equity); (d) ISIC 2-digit industry stratum dummies.</w:t>
       </w:r>
     </w:p>
-    <w:bookmarkEnd w:id="33"/>
-    <w:bookmarkStart w:id="34" w:name="X88d3b635b18ee197bee6ec760e4576787847be1"/>
+    <w:bookmarkEnd w:id="31"/>
+    <w:bookmarkStart w:id="32" w:name="X88d3b635b18ee197bee6ec760e4576787847be1"/>
     <w:p>
       <w:pPr>
         <w:pStyle w:val="Heading3"/>
@@ -1466,9 +1398,9 @@
         </w:pict>
       </w:r>
     </w:p>
-    <w:bookmarkEnd w:id="34"/>
-    <w:bookmarkEnd w:id="35"/>
-    <w:bookmarkStart w:id="51" w:name="X121719332867ee227f0a04b486098cee978c6e6"/>
+    <w:bookmarkEnd w:id="32"/>
+    <w:bookmarkEnd w:id="33"/>
+    <w:bookmarkStart w:id="49" w:name="X121719332867ee227f0a04b486098cee978c6e6"/>
     <w:p>
       <w:pPr>
         <w:pStyle w:val="Heading2"/>
@@ -1477,7 +1409,7 @@
         <w:t xml:space="preserve">4. Results</w:t>
       </w:r>
     </w:p>
-    <w:bookmarkStart w:id="36" w:name="Xcfcbc1028680fbd618b9b585dd17cf608861803"/>
+    <w:bookmarkStart w:id="34" w:name="Xcfcbc1028680fbd618b9b585dd17cf608861803"/>
     <w:p>
       <w:pPr>
         <w:pStyle w:val="Heading3"/>
@@ -1878,8 +1810,8 @@
         <w:t xml:space="preserve">Means with standard deviations in parentheses. Conditional on FSTS &gt; 0, mean FSTS is 0.269 in 2012 and 0.289 in 2024, indicating that conditional intensity is slightly higher in 2024 despite a lower share of exporters.</w:t>
       </w:r>
     </w:p>
-    <w:bookmarkEnd w:id="36"/>
-    <w:bookmarkStart w:id="40" w:name="X34b83cd764295e21fd4e71e3151b388b8f2159e"/>
+    <w:bookmarkEnd w:id="34"/>
+    <w:bookmarkStart w:id="38" w:name="X34b83cd764295e21fd4e71e3151b388b8f2159e"/>
     <w:p>
       <w:pPr>
         <w:pStyle w:val="Heading3"/>
@@ -1893,7 +1825,7 @@
         <w:pStyle w:val="FirstParagraph"/>
       </w:pPr>
       <w:r>
-        <w:t xml:space="preserve">Table 2 presents the main OLS results (M2 specification) for each wave and the pooled sample. FSTS carries a positive coefficient in both waves (2012: β = +1.28, SE = 0.38, p = .001; 2024: β = +1.19, SE = 0.46, p = .010), and FSTS² carries a negative coefficient in both waves (2012: β = −1.53, SE = 0.42, p &lt; .001; 2024: β = −1.58, SE = 0.50, p = .002); this positive linear and negative quadratic pattern is consistent with an inverted-U relationship in both waves, supporting H1. Lind–Mehlum criteria are satisfied in both waves.</w:t>
+        <w:t xml:space="preserve">Table 2 presents the main OLS results (M2 specification) for each wave and the pooled sample. FSTS carries a positive coefficient in both waves (2012: β = +1.28, SE = 0.38, p = .001; 2024: β = +1.19, SE = 0.46, p = .010), and FSTS² carries a negative coefficient in both waves (2012: β = −1.53, SE = 0.42, p &lt; .001; 2024: β = −1.58, SE = 0.50, p = .002); this positive linear and negative quadratic pattern is consistent with an inverted-U relationship in both waves, supporting H1. Following Haans, Pieters, and He (2016), all four formal conditions for a genuine inverted-U are satisfied in both waves. For the 2012 wave: (C1) β₁ = +1.28 (p = .001), confirming a positive ascending limb; (C2) β₂ = −1.53 (p &lt; .001), confirming concavity; (C3) the turning point TP* = 49.4% lies within the observed FSTS range [0%, 100%]; and (C4) the marginal effect is positive at the lower data bound (FSTS ≈ 0%) and negative at the upper bound (FSTS ≈ 100%), with opposite signs confirmed by the Lind–Mehlum (2010) u-test. These four conditions hold equivalently for the 2024 wave (β₁ = +1.19, β₂ = −1.58, TP* = 47.2%, LM p &lt; .001) and the pooled specification.</w:t>
       </w:r>
     </w:p>
     <w:p>
@@ -2536,18 +2468,18 @@
           <wp:inline>
             <wp:extent cx="5753100" cy="3010157"/>
             <wp:effectExtent b="0" l="0" r="0" t="0"/>
-            <wp:docPr descr="Figure 2: Turning-point estimates with 95% CIs by wave (China)" title="" id="38" name="Picture"/>
+            <wp:docPr descr="Figure 2: Turning-point estimates with 95% CIs by wave (China)" title="" id="36" name="Picture"/>
             <a:graphic>
               <a:graphicData uri="http://schemas.openxmlformats.org/drawingml/2006/picture">
                 <pic:pic>
                   <pic:nvPicPr>
-                    <pic:cNvPr descr="figures/p5_china/figure_2_turning_points.png" id="39" name="Picture"/>
+                    <pic:cNvPr descr="figures/p5_china/figure_2_turning_points.png" id="37" name="Picture"/>
                     <pic:cNvPicPr>
                       <a:picLocks noChangeArrowheads="1" noChangeAspect="1"/>
                     </pic:cNvPicPr>
                   </pic:nvPicPr>
                   <pic:blipFill>
-                    <a:blip r:embed="rId37"/>
+                    <a:blip r:embed="rId35"/>
                     <a:stretch>
                       <a:fillRect/>
                     </a:stretch>
@@ -2592,8 +2524,8 @@
         <w:t xml:space="preserve">Delta-method 95 % confidence intervals for the turning-point estimates in 2012 (49.4 %) and 2024 (47.2 %). The substantial overlap is consistent with structural durability (H2b).</w:t>
       </w:r>
     </w:p>
-    <w:bookmarkEnd w:id="40"/>
-    <w:bookmarkStart w:id="44" w:name="Xfe3c331420c241aa73c6296372277a6d3f913cb"/>
+    <w:bookmarkEnd w:id="38"/>
+    <w:bookmarkStart w:id="42" w:name="Xfe3c331420c241aa73c6296372277a6d3f913cb"/>
     <w:p>
       <w:pPr>
         <w:pStyle w:val="Heading3"/>
@@ -2619,18 +2551,18 @@
           <wp:inline>
             <wp:extent cx="5753100" cy="3330862"/>
             <wp:effectExtent b="0" l="0" r="0" t="0"/>
-            <wp:docPr descr="Figure 3: Predicted I–P curves by wave (China)" title="" id="42" name="Picture"/>
+            <wp:docPr descr="Figure 3: Predicted I–P curves by wave (China)" title="" id="40" name="Picture"/>
             <a:graphic>
               <a:graphicData uri="http://schemas.openxmlformats.org/drawingml/2006/picture">
                 <pic:pic>
                   <pic:nvPicPr>
-                    <pic:cNvPr descr="figures/p5_china/figure_3_predicted_curves.png" id="43" name="Picture"/>
+                    <pic:cNvPr descr="figures/p5_china/figure_3_predicted_curves.png" id="41" name="Picture"/>
                     <pic:cNvPicPr>
                       <a:picLocks noChangeArrowheads="1" noChangeAspect="1"/>
                     </pic:cNvPicPr>
                   </pic:nvPicPr>
                   <pic:blipFill>
-                    <a:blip r:embed="rId41"/>
+                    <a:blip r:embed="rId39"/>
                     <a:stretch>
                       <a:fillRect/>
                     </a:stretch>
@@ -2675,8 +2607,8 @@
         <w:t xml:space="preserve">Predicted log labour productivity as a function of export intensity (FSTS) for each wave, with controls held at wave-specific means. Dashed lines indicate turning-point locations; shaded bands are 95 % pointwise CIs.</w:t>
       </w:r>
     </w:p>
-    <w:bookmarkEnd w:id="44"/>
-    <w:bookmarkStart w:id="48" w:name="X86f6006676d1e9a822b51b562b1655386d9e86b"/>
+    <w:bookmarkEnd w:id="42"/>
+    <w:bookmarkStart w:id="46" w:name="X86f6006676d1e9a822b51b562b1655386d9e86b"/>
     <w:p>
       <w:pPr>
         <w:pStyle w:val="Heading3"/>
@@ -3489,18 +3421,18 @@
           <wp:inline>
             <wp:extent cx="5753100" cy="2591800"/>
             <wp:effectExtent b="0" l="0" r="0" t="0"/>
-            <wp:docPr descr="Figure 4: TCI and DAI direct-effect coefficients by wave (China, standardised OLS)" title="" id="46" name="Picture"/>
+            <wp:docPr descr="Figure 4: TCI and DAI direct-effect coefficients by wave (China, standardised OLS)" title="" id="44" name="Picture"/>
             <a:graphic>
               <a:graphicData uri="http://schemas.openxmlformats.org/drawingml/2006/picture">
                 <pic:pic>
                   <pic:nvPicPr>
-                    <pic:cNvPr descr="figures/p5_china/figure_4_level_shifts.png" id="47" name="Picture"/>
+                    <pic:cNvPr descr="figures/p5_china/figure_4_level_shifts.png" id="45" name="Picture"/>
                     <pic:cNvPicPr>
                       <a:picLocks noChangeArrowheads="1" noChangeAspect="1"/>
                     </pic:cNvPicPr>
                   </pic:nvPicPr>
                   <pic:blipFill>
-                    <a:blip r:embed="rId45"/>
+                    <a:blip r:embed="rId43"/>
                     <a:stretch>
                       <a:fillRect/>
                     </a:stretch>
@@ -3545,8 +3477,8 @@
         <w:t xml:space="preserve">Direct level‑shift coefficients of technological capability (TCI_full) and digital adoption (DAI_core) by wave for Chinese private firms. Error bars are 95 % HC1-robust confidence intervals. Both TCI_full and DAI_core are positive and significant in both waves.</w:t>
       </w:r>
     </w:p>
-    <w:bookmarkEnd w:id="48"/>
-    <w:bookmarkStart w:id="49" w:name="Xdf31b4a83ae47f030a08265332b3138989411fc"/>
+    <w:bookmarkEnd w:id="46"/>
+    <w:bookmarkStart w:id="47" w:name="Xdf31b4a83ae47f030a08265332b3138989411fc"/>
     <w:p>
       <w:pPr>
         <w:pStyle w:val="Heading3"/>
@@ -3563,8 +3495,8 @@
         <w:t xml:space="preserve">DAI_core (own-website) is positive and significant in both waves (β_z ≈ +0.10 in 2012, p = .002; +0.12 in 2024, p &lt; .001) when entered as a control in M2. A separate mechanism-exploration model (M7) tests whether DAI_core mediates the TCI_full → lnLP relationship via a sequential mediation path (TCI_full → DAI_core → lnLP). Bootstrap indirect-effect estimates (n = 1,000 draws) yield small but positive indirect effects (2012: +0.018, 95 % CI [0.004, 0.039]; 2024: +0.022, 95 % CI [0.007, 0.043]), consistent with a partial-mediation reading. However, because DAI_core is a single-item binary proxy and because the WBES does not allow attribution of causality, this analysis is exploratory and reported as a “descriptive mechanism sketch” rather than a causal identification claim (Antonakis et al., 2010; Shaver, 2020).</w:t>
       </w:r>
     </w:p>
-    <w:bookmarkEnd w:id="49"/>
-    <w:bookmarkStart w:id="50" w:name="X7b68f907ed55e65a2ee44288bf21fafeaedb955"/>
+    <w:bookmarkEnd w:id="47"/>
+    <w:bookmarkStart w:id="48" w:name="X7b68f907ed55e65a2ee44288bf21fafeaedb955"/>
     <w:p>
       <w:pPr>
         <w:pStyle w:val="Heading3"/>
@@ -3670,24 +3602,84 @@
         </w:pict>
       </w:r>
     </w:p>
+    <w:bookmarkEnd w:id="48"/>
+    <w:bookmarkEnd w:id="49"/>
+    <w:bookmarkStart w:id="55" w:name="X735612638e4e736e4693e459c258977262c0dfc"/>
+    <w:p>
+      <w:pPr>
+        <w:pStyle w:val="Heading2"/>
+      </w:pPr>
+      <w:r>
+        <w:t xml:space="preserve">5. Discussion</w:t>
+      </w:r>
+    </w:p>
+    <w:bookmarkStart w:id="50" w:name="Xa0c03496b4c04a1649263a3e01d0b00bd039955"/>
+    <w:p>
+      <w:pPr>
+        <w:pStyle w:val="Heading3"/>
+      </w:pPr>
+      <w:r>
+        <w:t xml:space="preserve">5.1 Temporal Stability of the I–P Threshold</w:t>
+      </w:r>
+    </w:p>
+    <w:p>
+      <w:pPr>
+        <w:pStyle w:val="FirstParagraph"/>
+      </w:pPr>
+      <w:r>
+        <w:t xml:space="preserve">The central finding is that the inverted-U I–P threshold in Chinese private firms is structurally durable. Turning points of 49.4 % (2012) and 47.2 % (2024) are statistically indistinguishable by the Paternoster test, and the pooled estimate (48.8 %) sits within both wave-specific confidence intervals. This durability is notable given the scale of structural change between the two survey waves—BRI reorientation, trade friction, COVID-19—and challenges the environmental-determinism reading of I–P curvature (H2a). The result is consistent with Bausch and Krist (2007) meta-analytic evidence and Marano et al. (2016) institutional moderator synthesis, which together suggest that inverted-U curvature is a robust cross-context regularity rather than a sample-specific artifact.</w:t>
+      </w:r>
+    </w:p>
+    <w:p>
+      <w:pPr>
+        <w:pStyle w:val="BodyText"/>
+      </w:pPr>
+      <w:r>
+        <w:t xml:space="preserve">For Chinese private firms, the threshold around 48 % export intensity reflects a structural tension between learning-by-exporting gains (active below threshold) and coordination cost escalation (active above threshold) that is not mediated by a decade of policy and macroeconomic change. The implication for managers is that allocating more than roughly half of sales to direct exports tends to erode productivity regardless of decade or external environment.</w:t>
+      </w:r>
+    </w:p>
     <w:bookmarkEnd w:id="50"/>
+    <w:bookmarkStart w:id="51" w:name="X662147d669ae611953db259d7b4d93f76a97e61"/>
+    <w:p>
+      <w:pPr>
+        <w:pStyle w:val="Heading3"/>
+      </w:pPr>
+      <w:r>
+        <w:t xml:space="preserve">5.2 Technological Capability as Level-Shifter</w:t>
+      </w:r>
+    </w:p>
+    <w:p>
+      <w:pPr>
+        <w:pStyle w:val="FirstParagraph"/>
+      </w:pPr>
+      <w:r>
+        <w:t xml:space="preserve">The null moderation finding — F2 = 3.26, p = .039, not surviving Bonferroni correction at α* = .017, consistent with H4b — has a precise interpretation: TCI_full raises the productivity intercept in both waves (β_z = +0.28 in 2012, +0.43 in 2024) but does not shift the turning-point location or change the curvature. This is inconsistent with H3 (rightward turning-point shift for high-capability firms) and marginally consistent with H4a only under a non-Bonferroni threshold (F2 p = .039). The finding recasts the role of technological capability from a curvature-moderator to a “level-shifter”: capability elevates performance at every export-intensity level but does not allow firms to safely exceed the threshold. The direct-effect strengthening from +0.28 to +0.43 (standardised) between 2012 and 2024 is consistent with the hypothesis that digital and knowledge capital became more complementary to productivity during this period (Nambisan et al., 2019; Volberda et al., 2021), but the mechanism remains exploratory.</w:t>
+      </w:r>
+    </w:p>
+    <w:p>
+      <w:pPr>
+        <w:pStyle w:val="BodyText"/>
+      </w:pPr>
+      <w:r>
+        <w:t xml:space="preserve">This finding is consistent with Avenyo et al. (2021), who find that productive capabilities affect export performance levels but not the shape of the export–productivity curve in African manufacturing firms. The parallel is noteworthy: capability may be a universal level-shifter but not a universal curvature-moderator across emerging economy contexts.</w:t>
+      </w:r>
+    </w:p>
+    <w:p>
+      <w:pPr>
+        <w:pStyle w:val="BodyText"/>
+      </w:pPr>
+      <w:r>
+        <w:t xml:space="preserve">The null TCI moderation of curvature in China is consistent with P4 Singapore (where TCI operates only as a direct productivity enhancer without moderating the I→P slope). This pattern emerges across two institutionally distinct economies: China (Emerging/Upper-middle transition) and Singapore (Advanced innovation-driven). The ICRV-contingency interpretation suggests that TCI moderation of curvature may be concentrated in transitional economies with fragmented markets (P3 Vietnam: significant; Institutional voids create heterogeneous absorption of TCI rents). The finding constitutes an institutional specification that identifies when TCI matters for the slope versus the intercept.</w:t>
+      </w:r>
+    </w:p>
     <w:bookmarkEnd w:id="51"/>
-    <w:bookmarkStart w:id="57" w:name="X735612638e4e736e4693e459c258977262c0dfc"/>
-    <w:p>
-      <w:pPr>
-        <w:pStyle w:val="Heading2"/>
-      </w:pPr>
-      <w:r>
-        <w:t xml:space="preserve">5. Discussion</w:t>
-      </w:r>
-    </w:p>
-    <w:bookmarkStart w:id="52" w:name="Xa0c03496b4c04a1649263a3e01d0b00bd039955"/>
+    <w:bookmarkStart w:id="52" w:name="Xeab358fda242154d2e818677c8845f988021d48"/>
     <w:p>
       <w:pPr>
         <w:pStyle w:val="Heading3"/>
       </w:pPr>
       <w:r>
-        <w:t xml:space="preserve">5.1 Temporal Stability of the I–P Threshold</w:t>
+        <w:t xml:space="preserve">5.3 Digital Adoption as Baseline Control</w:t>
       </w:r>
     </w:p>
     <w:p>
@@ -3695,25 +3687,17 @@
         <w:pStyle w:val="FirstParagraph"/>
       </w:pPr>
       <w:r>
-        <w:t xml:space="preserve">The central finding is that the inverted-U I–P threshold in Chinese private firms is structurally durable. Turning points of 49.4 % (2012) and 47.2 % (2024) are statistically indistinguishable by the Paternoster test, and the pooled estimate (48.8 %) sits within both wave-specific confidence intervals. This durability is notable given the scale of structural change between the two survey waves—BRI reorientation, trade friction, COVID-19—and challenges the environmental-determinism reading of I–P curvature (H2a). The result is consistent with Bausch and Krist (2007) meta-analytic evidence and Marano et al. (2016) institutional moderator synthesis, which together suggest that inverted-U curvature is a robust cross-context regularity rather than a sample-specific artifact.</w:t>
-      </w:r>
-    </w:p>
-    <w:p>
-      <w:pPr>
-        <w:pStyle w:val="BodyText"/>
-      </w:pPr>
-      <w:r>
-        <w:t xml:space="preserve">For Chinese private firms, the threshold around 48 % export intensity reflects a structural tension between learning-by-exporting gains (active below threshold) and coordination cost escalation (active above threshold) that is not mediated by a decade of policy and macroeconomic change. The implication for managers is that allocating more than roughly half of sales to direct exports tends to erode productivity regardless of decade or external environment.</w:t>
+        <w:t xml:space="preserve">DAI_core (own-website) enters positively and significantly in both waves but does not add explanatory power to the inverted-U curvature beyond TCI_full. The mechanism sketch (§4.5) suggests a partial mediation pathway (TCI → DAI → lnLP), but the effect is small and the identification assumptions are not fully met with a single-wave cross-section. The correct interpretation is that digital presence is a complement to productivity rather than a capability construct in this setting. Researchers seeking to operationalise digital capability in future WBES-based work should consider a richer composite (Verhoef et al., 2021; Vial, 2019) once multi-item digital items become available across waves.</w:t>
       </w:r>
     </w:p>
     <w:bookmarkEnd w:id="52"/>
-    <w:bookmarkStart w:id="53" w:name="X662147d669ae611953db259d7b4d93f76a97e61"/>
+    <w:bookmarkStart w:id="53" w:name="X47b33dbf897054d79ce3d759da46f0a1ef21be8"/>
     <w:p>
       <w:pPr>
         <w:pStyle w:val="Heading3"/>
       </w:pPr>
       <w:r>
-        <w:t xml:space="preserve">5.2 Technological Capability as Level-Shifter</w:t>
+        <w:t xml:space="preserve">5.4 Limitations</w:t>
       </w:r>
     </w:p>
     <w:p>
@@ -3721,63 +3705,11 @@
         <w:pStyle w:val="FirstParagraph"/>
       </w:pPr>
       <w:r>
-        <w:t xml:space="preserve">The null moderation finding — F2 = 3.26, p = .039, not surviving Bonferroni correction at α* = .017, consistent with H4b — has a precise interpretation: TCI_full raises the productivity intercept in both waves (β_z = +0.28 in 2012, +0.43 in 2024) but does not shift the turning-point location or change the curvature. This is inconsistent with H3 (rightward turning-point shift for high-capability firms) and marginally consistent with H4a only under a non-Bonferroni threshold (F2 p = .039). The finding recasts the role of technological capability from a curvature-moderator to a “level-shifter”: capability elevates performance at every export-intensity level but does not allow firms to safely exceed the threshold. The direct-effect strengthening from +0.28 to +0.43 (standardised) between 2012 and 2024 is consistent with the hypothesis that digital and knowledge capital became more complementary to productivity during this period (Nambisan et al., 2019; Volberda et al., 2021), but the mechanism remains exploratory.</w:t>
-      </w:r>
-    </w:p>
-    <w:p>
-      <w:pPr>
-        <w:pStyle w:val="BodyText"/>
-      </w:pPr>
-      <w:r>
-        <w:t xml:space="preserve">This finding is consistent with Avenyo et al. (2021), who find that productive capabilities affect export performance levels but not the shape of the export–productivity curve in African manufacturing firms. The parallel is noteworthy: capability may be a universal level-shifter but not a universal curvature-moderator across emerging economy contexts.</w:t>
-      </w:r>
-    </w:p>
-    <w:p>
-      <w:pPr>
-        <w:pStyle w:val="BodyText"/>
-      </w:pPr>
-      <w:r>
-        <w:t xml:space="preserve">The null TCI moderation of curvature in China is consistent with P4 Singapore (where TCI operates only as a direct productivity enhancer without moderating the I→P slope). This pattern emerges across two institutionally distinct economies: China (Emerging/Upper-middle transition) and Singapore (Advanced innovation-driven). The ICRV-contingency interpretation suggests that TCI moderation of curvature may be concentrated in transitional economies with fragmented markets (P3 Vietnam: significant; Institutional voids create heterogeneous absorption of TCI rents). The finding constitutes an institutional specification that identifies when TCI matters for the slope versus the intercept.</w:t>
+        <w:t xml:space="preserve">Four inferential bounds apply. First, because WBES data are cross-sectional within each wave and panel matching across 2012 and 2024 is not possible due to WBES anonymisation, the temporal stability analysis cannot be interpreted as within-firm change; it compares population-representative cross-sections, and longitudinal causal claims require matched-panel designs such as those available in some country-specific WBES supplements (Hitt et al., 1997). Second, labour productivity (log sales/employees) conflates wage trends and capital deepening, so conclusions about productive efficiency rather than revenue-per-employee ratios remain tentative; the Levinsohn–Petrin TFP robustness check (§4.6) partially addresses this concern, though it introduces its own production-function assumptions (Shaver, 2020). Third, the TCI_full composite relies on self-reported WBES items, which introduces common-method bias within each wave; future work could triangulate with administrative patent or certification registry data to validate the composite. Fourth, the single-item DAI_core binary proxy cannot support strong conclusions about digital capability as a construct; a multi-item composite (Verhoef et al., 2021) would be needed to test the TCI–DAI mediation pathway rigorously.</w:t>
       </w:r>
     </w:p>
     <w:bookmarkEnd w:id="53"/>
-    <w:bookmarkStart w:id="54" w:name="Xeab358fda242154d2e818677c8845f988021d48"/>
-    <w:p>
-      <w:pPr>
-        <w:pStyle w:val="Heading3"/>
-      </w:pPr>
-      <w:r>
-        <w:t xml:space="preserve">5.3 Digital Adoption as Baseline Control</w:t>
-      </w:r>
-    </w:p>
-    <w:p>
-      <w:pPr>
-        <w:pStyle w:val="FirstParagraph"/>
-      </w:pPr>
-      <w:r>
-        <w:t xml:space="preserve">DAI_core (own-website) enters positively and significantly in both waves but does not add explanatory power to the inverted-U curvature beyond TCI_full. The mechanism sketch (§4.5) suggests a partial mediation pathway (TCI → DAI → lnLP), but the effect is small and the identification assumptions are not fully met with a single-wave cross-section. The correct interpretation is that digital presence is a complement to productivity rather than a capability construct in this setting. Researchers seeking to operationalise digital capability in future WBES-based work should consider a richer composite (Verhoef et al., 2021; Vial, 2019) once multi-item digital items become available across waves.</w:t>
-      </w:r>
-    </w:p>
-    <w:bookmarkEnd w:id="54"/>
-    <w:bookmarkStart w:id="55" w:name="X47b33dbf897054d79ce3d759da46f0a1ef21be8"/>
-    <w:p>
-      <w:pPr>
-        <w:pStyle w:val="Heading3"/>
-      </w:pPr>
-      <w:r>
-        <w:t xml:space="preserve">5.4 Limitations</w:t>
-      </w:r>
-    </w:p>
-    <w:p>
-      <w:pPr>
-        <w:pStyle w:val="FirstParagraph"/>
-      </w:pPr>
-      <w:r>
-        <w:t xml:space="preserve">Four inferential bounds apply. First, because WBES data are cross-sectional within each wave and panel matching across 2012 and 2024 is not possible due to WBES anonymisation, the temporal stability analysis cannot be interpreted as within-firm change; it compares population-representative cross-sections, and longitudinal causal claims require matched-panel designs such as those available in some country-specific WBES supplements (Hitt et al., 1997). Second, labour productivity (log sales/employees) conflates wage trends and capital deepening, so conclusions about productive efficiency rather than revenue-per-employee ratios remain tentative; the Levinsohn–Petrin TFP robustness check (§4.6) partially addresses this concern, though it introduces its own production-function assumptions (Shaver, 2020). Third, the TCI_full composite relies on self-reported WBES items, which introduces common-method bias within each wave; future work could triangulate with administrative patent or certification registry data to validate the composite. Fourth, the single-item DAI_core binary proxy cannot support strong conclusions about digital capability as a construct; a multi-item composite (Verhoef et al., 2021) would be needed to test the TCI–DAI mediation pathway rigorously.</w:t>
-      </w:r>
-    </w:p>
-    <w:bookmarkEnd w:id="55"/>
-    <w:bookmarkStart w:id="56" w:name="X6239b91c09f491af0efd332004cb71e9de7a16c"/>
+    <w:bookmarkStart w:id="54" w:name="X6239b91c09f491af0efd332004cb71e9de7a16c"/>
     <w:p>
       <w:pPr>
         <w:pStyle w:val="Heading3"/>
@@ -3801,9 +3733,9 @@
         </w:pict>
       </w:r>
     </w:p>
-    <w:bookmarkEnd w:id="56"/>
-    <w:bookmarkEnd w:id="57"/>
-    <w:bookmarkStart w:id="58" w:name="X6b297cc947e0db5526be369b1f0f4ddc67b2415"/>
+    <w:bookmarkEnd w:id="54"/>
+    <w:bookmarkEnd w:id="55"/>
+    <w:bookmarkStart w:id="56" w:name="X6b297cc947e0db5526be369b1f0f4ddc67b2415"/>
     <w:p>
       <w:pPr>
         <w:pStyle w:val="Heading2"/>
@@ -3827,8 +3759,8 @@
         </w:pict>
       </w:r>
     </w:p>
-    <w:bookmarkEnd w:id="58"/>
-    <w:bookmarkStart w:id="60" w:name="acknowledgements"/>
+    <w:bookmarkEnd w:id="56"/>
+    <w:bookmarkStart w:id="58" w:name="acknowledgements"/>
     <w:p>
       <w:pPr>
         <w:pStyle w:val="Heading2"/>
@@ -3847,7 +3779,7 @@
       <w:r>
         <w:t xml:space="preserve"> </w:t>
       </w:r>
-      <w:hyperlink r:id="rId59">
+      <w:hyperlink r:id="rId57">
         <w:r>
           <w:rPr>
             <w:rStyle w:val="Hyperlink"/>
@@ -3874,8 +3806,8 @@
         </w:pict>
       </w:r>
     </w:p>
-    <w:bookmarkEnd w:id="60"/>
-    <w:bookmarkStart w:id="62" w:name="data-availability"/>
+    <w:bookmarkEnd w:id="58"/>
+    <w:bookmarkStart w:id="60" w:name="data-availability"/>
     <w:p>
       <w:pPr>
         <w:pStyle w:val="Heading2"/>
@@ -3894,7 +3826,7 @@
       <w:r>
         <w:t xml:space="preserve"> </w:t>
       </w:r>
-      <w:hyperlink r:id="rId61">
+      <w:hyperlink r:id="rId59">
         <w:r>
           <w:rPr>
             <w:rStyle w:val="Hyperlink"/>
@@ -3906,8 +3838,8 @@
         <w:t xml:space="preserve">. Variable construction code and processed datasets are available from the corresponding author upon reasonable request.</w:t>
       </w:r>
     </w:p>
-    <w:bookmarkEnd w:id="62"/>
-    <w:bookmarkStart w:id="63" w:name="ai-use-disclosure"/>
+    <w:bookmarkEnd w:id="60"/>
+    <w:bookmarkStart w:id="61" w:name="ai-use-disclosure"/>
     <w:p>
       <w:pPr>
         <w:pStyle w:val="Heading2"/>
@@ -3931,8 +3863,8 @@
         </w:pict>
       </w:r>
     </w:p>
-    <w:bookmarkEnd w:id="63"/>
-    <w:bookmarkStart w:id="89" w:name="references"/>
+    <w:bookmarkEnd w:id="61"/>
+    <w:bookmarkStart w:id="88" w:name="references"/>
     <w:p>
       <w:pPr>
         <w:pStyle w:val="Heading2"/>
@@ -3964,7 +3896,7 @@
       <w:r>
         <w:t xml:space="preserve"> </w:t>
       </w:r>
-      <w:hyperlink r:id="rId64">
+      <w:hyperlink r:id="rId62">
         <w:r>
           <w:rPr>
             <w:rStyle w:val="Hyperlink"/>
@@ -3996,7 +3928,7 @@
       <w:r>
         <w:t xml:space="preserve"> </w:t>
       </w:r>
-      <w:hyperlink r:id="rId65">
+      <w:hyperlink r:id="rId63">
         <w:r>
           <w:rPr>
             <w:rStyle w:val="Hyperlink"/>
@@ -4028,7 +3960,7 @@
       <w:r>
         <w:t xml:space="preserve"> </w:t>
       </w:r>
-      <w:hyperlink r:id="rId66">
+      <w:hyperlink r:id="rId64">
         <w:r>
           <w:rPr>
             <w:rStyle w:val="Hyperlink"/>
@@ -4063,7 +3995,7 @@
         <w:pStyle w:val="BodyText"/>
       </w:pPr>
       <w:r>
-        <w:t xml:space="preserve">Hitt, M. A., Hoskisson, R. E., &amp; Kim, H. (1997). International diversification: Effects on innovation and firm performance in product-diversified firms.</w:t>
+        <w:t xml:space="preserve">Haans, R. F. J., Pieters, C., &amp; He, Z.-L. (2016). Thinking about U: Theorizing and testing U- and inverted U-shaped relationships in strategy research.</w:t>
       </w:r>
       <w:r>
         <w:t xml:space="preserve"> </w:t>
@@ -4073,6 +4005,38 @@
           <w:iCs/>
           <w:i/>
         </w:rPr>
+        <w:t xml:space="preserve">Strategic Management Journal, 37</w:t>
+      </w:r>
+      <w:r>
+        <w:t xml:space="preserve">(7), 1177–1195.</w:t>
+      </w:r>
+      <w:r>
+        <w:t xml:space="preserve"> </w:t>
+      </w:r>
+      <w:hyperlink r:id="rId65">
+        <w:r>
+          <w:rPr>
+            <w:rStyle w:val="Hyperlink"/>
+          </w:rPr>
+          <w:t xml:space="preserve">https://doi.org/10.1002/smj.2399</w:t>
+        </w:r>
+      </w:hyperlink>
+    </w:p>
+    <w:p>
+      <w:pPr>
+        <w:pStyle w:val="BodyText"/>
+      </w:pPr>
+      <w:r>
+        <w:t xml:space="preserve">Hitt, M. A., Hoskisson, R. E., &amp; Kim, H. (1997). International diversification: Effects on innovation and firm performance in product-diversified firms.</w:t>
+      </w:r>
+      <w:r>
+        <w:t xml:space="preserve"> </w:t>
+      </w:r>
+      <w:r>
+        <w:rPr>
+          <w:iCs/>
+          <w:i/>
+        </w:rPr>
         <w:t xml:space="preserve">Academy of Management Journal, 40</w:t>
       </w:r>
       <w:r>
@@ -4081,7 +4045,7 @@
       <w:r>
         <w:t xml:space="preserve"> </w:t>
       </w:r>
-      <w:hyperlink r:id="rId67">
+      <w:hyperlink r:id="rId66">
         <w:r>
           <w:rPr>
             <w:rStyle w:val="Hyperlink"/>
@@ -4113,7 +4077,7 @@
       <w:r>
         <w:t xml:space="preserve"> </w:t>
       </w:r>
-      <w:hyperlink r:id="rId68">
+      <w:hyperlink r:id="rId67">
         <w:r>
           <w:rPr>
             <w:rStyle w:val="Hyperlink"/>
@@ -4145,7 +4109,7 @@
       <w:r>
         <w:t xml:space="preserve"> </w:t>
       </w:r>
-      <w:hyperlink r:id="rId69">
+      <w:hyperlink r:id="rId68">
         <w:r>
           <w:rPr>
             <w:rStyle w:val="Hyperlink"/>
@@ -4177,7 +4141,7 @@
       <w:r>
         <w:t xml:space="preserve"> </w:t>
       </w:r>
-      <w:hyperlink r:id="rId70">
+      <w:hyperlink r:id="rId69">
         <w:r>
           <w:rPr>
             <w:rStyle w:val="Hyperlink"/>
@@ -4209,7 +4173,7 @@
       <w:r>
         <w:t xml:space="preserve"> </w:t>
       </w:r>
-      <w:hyperlink r:id="rId71">
+      <w:hyperlink r:id="rId70">
         <w:r>
           <w:rPr>
             <w:rStyle w:val="Hyperlink"/>
@@ -4241,7 +4205,7 @@
       <w:r>
         <w:t xml:space="preserve"> </w:t>
       </w:r>
-      <w:hyperlink r:id="rId72">
+      <w:hyperlink r:id="rId71">
         <w:r>
           <w:rPr>
             <w:rStyle w:val="Hyperlink"/>
@@ -4273,7 +4237,7 @@
       <w:r>
         <w:t xml:space="preserve"> </w:t>
       </w:r>
-      <w:hyperlink r:id="rId73">
+      <w:hyperlink r:id="rId72">
         <w:r>
           <w:rPr>
             <w:rStyle w:val="Hyperlink"/>
@@ -4305,7 +4269,7 @@
       <w:r>
         <w:t xml:space="preserve"> </w:t>
       </w:r>
-      <w:hyperlink r:id="rId74">
+      <w:hyperlink r:id="rId73">
         <w:r>
           <w:rPr>
             <w:rStyle w:val="Hyperlink"/>
@@ -4337,7 +4301,7 @@
       <w:r>
         <w:t xml:space="preserve"> </w:t>
       </w:r>
-      <w:hyperlink r:id="rId75">
+      <w:hyperlink r:id="rId74">
         <w:r>
           <w:rPr>
             <w:rStyle w:val="Hyperlink"/>
@@ -4369,7 +4333,7 @@
       <w:r>
         <w:t xml:space="preserve"> </w:t>
       </w:r>
-      <w:hyperlink r:id="rId76">
+      <w:hyperlink r:id="rId75">
         <w:r>
           <w:rPr>
             <w:rStyle w:val="Hyperlink"/>
@@ -4401,7 +4365,7 @@
       <w:r>
         <w:t xml:space="preserve"> </w:t>
       </w:r>
-      <w:hyperlink r:id="rId77">
+      <w:hyperlink r:id="rId76">
         <w:r>
           <w:rPr>
             <w:rStyle w:val="Hyperlink"/>
@@ -4433,7 +4397,7 @@
       <w:r>
         <w:t xml:space="preserve"> </w:t>
       </w:r>
-      <w:hyperlink r:id="rId78">
+      <w:hyperlink r:id="rId77">
         <w:r>
           <w:rPr>
             <w:rStyle w:val="Hyperlink"/>
@@ -4465,7 +4429,7 @@
       <w:r>
         <w:t xml:space="preserve"> </w:t>
       </w:r>
-      <w:hyperlink r:id="rId79">
+      <w:hyperlink r:id="rId78">
         <w:r>
           <w:rPr>
             <w:rStyle w:val="Hyperlink"/>
@@ -4497,7 +4461,7 @@
       <w:r>
         <w:t xml:space="preserve"> </w:t>
       </w:r>
-      <w:hyperlink r:id="rId80">
+      <w:hyperlink r:id="rId79">
         <w:r>
           <w:rPr>
             <w:rStyle w:val="Hyperlink"/>
@@ -4529,7 +4493,7 @@
       <w:r>
         <w:t xml:space="preserve"> </w:t>
       </w:r>
-      <w:hyperlink r:id="rId81">
+      <w:hyperlink r:id="rId80">
         <w:r>
           <w:rPr>
             <w:rStyle w:val="Hyperlink"/>
@@ -4561,7 +4525,7 @@
       <w:r>
         <w:t xml:space="preserve"> </w:t>
       </w:r>
-      <w:hyperlink r:id="rId82">
+      <w:hyperlink r:id="rId81">
         <w:r>
           <w:rPr>
             <w:rStyle w:val="Hyperlink"/>
@@ -4593,7 +4557,7 @@
       <w:r>
         <w:t xml:space="preserve"> </w:t>
       </w:r>
-      <w:hyperlink r:id="rId83">
+      <w:hyperlink r:id="rId82">
         <w:r>
           <w:rPr>
             <w:rStyle w:val="Hyperlink"/>
@@ -4625,7 +4589,7 @@
       <w:r>
         <w:t xml:space="preserve"> </w:t>
       </w:r>
-      <w:hyperlink r:id="rId84">
+      <w:hyperlink r:id="rId83">
         <w:r>
           <w:rPr>
             <w:rStyle w:val="Hyperlink"/>
@@ -4657,7 +4621,7 @@
       <w:r>
         <w:t xml:space="preserve"> </w:t>
       </w:r>
-      <w:hyperlink r:id="rId85">
+      <w:hyperlink r:id="rId84">
         <w:r>
           <w:rPr>
             <w:rStyle w:val="Hyperlink"/>
@@ -4689,7 +4653,7 @@
       <w:r>
         <w:t xml:space="preserve"> </w:t>
       </w:r>
-      <w:hyperlink r:id="rId86">
+      <w:hyperlink r:id="rId85">
         <w:r>
           <w:rPr>
             <w:rStyle w:val="Hyperlink"/>
@@ -4721,7 +4685,7 @@
       <w:r>
         <w:t xml:space="preserve"> </w:t>
       </w:r>
-      <w:hyperlink r:id="rId87">
+      <w:hyperlink r:id="rId86">
         <w:r>
           <w:rPr>
             <w:rStyle w:val="Hyperlink"/>
@@ -4756,7 +4720,7 @@
       <w:r>
         <w:t xml:space="preserve"> </w:t>
       </w:r>
-      <w:hyperlink r:id="rId61">
+      <w:hyperlink r:id="rId59">
         <w:r>
           <w:rPr>
             <w:rStyle w:val="Hyperlink"/>
@@ -4791,7 +4755,7 @@
       <w:r>
         <w:t xml:space="preserve"> </w:t>
       </w:r>
-      <w:hyperlink r:id="rId61">
+      <w:hyperlink r:id="rId59">
         <w:r>
           <w:rPr>
             <w:rStyle w:val="Hyperlink"/>
@@ -4823,7 +4787,7 @@
       <w:r>
         <w:t xml:space="preserve"> </w:t>
       </w:r>
-      <w:hyperlink r:id="rId88">
+      <w:hyperlink r:id="rId87">
         <w:r>
           <w:rPr>
             <w:rStyle w:val="Hyperlink"/>
@@ -5049,8 +5013,8 @@
         <w:t xml:space="preserve">), and figure-rendering scripts are documented in the repository README.</w:t>
       </w:r>
     </w:p>
+    <w:bookmarkEnd w:id="88"/>
     <w:bookmarkEnd w:id="89"/>
-    <w:bookmarkEnd w:id="90"/>
     <w:sectPr>
       <w:pgSz w:h="16838" w:w="11906"/>
       <w:pgMar w:bottom="1417" w:left="1417" w:right="1417" w:top="1417"/>

</xml_diff>

<commit_message>
fix(P5,P6): resolve panel-core contradiction + Regime-I count (data-verified)
P5: resolve §3.3-vs-§5.4 contradiction (remove '217-firm panel core'; state
independent repeated cross-sections, anonymisation precludes panel linking);
add Helpman et al. (2004) ref (verbatim from dissertation refs).
P6: Regime-I composition 140/108 -> 139/107 in ibr/jwb/apjm (CSV-verified:
K=139,k=107; jim already correct); replace undefined CDCM -> 'cDAI amplification
(H3)'; reconcile to 5-regime scheme (drop dangling 'Regime V', 6->5 codes);
remove 3 true orphan refs (Jensen&Meckling, Lakens, Paternoster - not used in P6);
fix 3 run-ons. Flagged for author: Regime-III 90/78 vs CSV 91/79, cDAI-M 75/76,
DPL-Span 107/108 off-by-one (feed Q_M; need recompute).
</commit_message>
<xml_diff>
--- a/p5/submission/ijoem_package/01_manuscript_blinded.docx
+++ b/p5/submission/ijoem_package/01_manuscript_blinded.docx
@@ -2,7 +2,7 @@
 <file path=word/document.xml><?xml version="1.0" encoding="utf-8"?>
 <w:document xmlns:w="http://schemas.openxmlformats.org/wordprocessingml/2006/main" xmlns:m="http://schemas.openxmlformats.org/officeDocument/2006/math" xmlns:r="http://schemas.openxmlformats.org/officeDocument/2006/relationships" xmlns:o="urn:schemas-microsoft-com:office:office" xmlns:v="urn:schemas-microsoft-com:vml" xmlns:w10="urn:schemas-microsoft-com:office:word" xmlns:a="http://schemas.openxmlformats.org/drawingml/2006/main" xmlns:pic="http://schemas.openxmlformats.org/drawingml/2006/picture" xmlns:wp="http://schemas.openxmlformats.org/drawingml/2006/wordprocessingDrawing">
   <w:body>
-    <w:bookmarkStart w:id="77" w:name="Xeed239f9d2e1ce3a88fd46b256b65d8ab89b86a"/>
+    <w:bookmarkStart w:id="78" w:name="Xeed239f9d2e1ce3a88fd46b256b65d8ab89b86a"/>
     <w:p>
       <w:pPr>
         <w:pStyle w:val="Heading1"/>
@@ -677,7 +677,7 @@
       </w:r>
     </w:p>
     <w:bookmarkEnd w:id="21"/>
-    <w:bookmarkStart w:id="22" w:name="Xe3d0fc0bea9a42ce7605565d0964033d7f6ee47"/>
+    <w:bookmarkStart w:id="22" w:name="introduction"/>
     <w:p>
       <w:pPr>
         <w:pStyle w:val="Heading2"/>
@@ -947,7 +947,7 @@
       </w:r>
     </w:p>
     <w:bookmarkEnd w:id="22"/>
-    <w:bookmarkStart w:id="26" w:name="X8bf20a63f0decf7b16e99d564b9958ec4fbbb23"/>
+    <w:bookmarkStart w:id="26" w:name="theory-and-hypotheses"/>
     <w:p>
       <w:pPr>
         <w:pStyle w:val="Heading2"/>
@@ -956,7 +956,7 @@
         <w:t xml:space="preserve">2. Theory and Hypotheses</w:t>
       </w:r>
     </w:p>
-    <w:bookmarkStart w:id="23" w:name="Xe089a51cf00ad631dbcdfa837bfcf2befbbb388"/>
+    <w:bookmarkStart w:id="23" w:name="X80f1b9a6838da6506200db77e2279c8969787f1"/>
     <w:p>
       <w:pPr>
         <w:pStyle w:val="Heading3"/>
@@ -1106,7 +1106,7 @@
       </w:r>
     </w:p>
     <w:bookmarkEnd w:id="23"/>
-    <w:bookmarkStart w:id="24" w:name="Xf1c81d13fe998b882da119ca3ec3b3d40ce5a1b"/>
+    <w:bookmarkStart w:id="24" w:name="temporal-stability-of-the-ip-curvature"/>
     <w:p>
       <w:pPr>
         <w:pStyle w:val="Heading3"/>
@@ -1150,7 +1150,25 @@
         <w:t xml:space="preserve"> </w:t>
       </w:r>
       <w:r>
-        <w:t xml:space="preserve">sensitive to structural context, generating a “wave-specific” pattern</w:t>
+        <w:t xml:space="preserve">sensitive to structural context, generating a</w:t>
+      </w:r>
+      <w:r>
+        <w:t xml:space="preserve"> </w:t>
+      </w:r>
+      <w:r>
+        <w:t xml:space="preserve">“</w:t>
+      </w:r>
+      <w:r>
+        <w:t xml:space="preserve">wave-specific</w:t>
+      </w:r>
+      <w:r>
+        <w:t xml:space="preserve">”</w:t>
+      </w:r>
+      <w:r>
+        <w:t xml:space="preserve"> </w:t>
+      </w:r>
+      <w:r>
+        <w:t xml:space="preserve">pattern</w:t>
       </w:r>
       <w:r>
         <w:t xml:space="preserve"> </w:t>
@@ -1186,7 +1204,7 @@
         <w:t xml:space="preserve"> </w:t>
       </w:r>
       <w:r>
-        <w:t xml:space="preserve">When China's export environment shifts substantially between</w:t>
+        <w:t xml:space="preserve">When China’s export environment shifts substantially between</w:t>
       </w:r>
       <w:r>
         <w:t xml:space="preserve"> </w:t>
@@ -1246,7 +1264,7 @@
         <w:t xml:space="preserve"> </w:t>
       </w:r>
       <w:r>
-        <w:t xml:space="preserve">When China's institutional framework governing export costs</w:t>
+        <w:t xml:space="preserve">When China’s institutional framework governing export costs</w:t>
       </w:r>
       <w:r>
         <w:t xml:space="preserve"> </w:t>
@@ -1298,7 +1316,7 @@
       </w:r>
     </w:p>
     <w:bookmarkEnd w:id="24"/>
-    <w:bookmarkStart w:id="25" w:name="X505f50cd1f9abb1ab06672992aff36a1dc7f136"/>
+    <w:bookmarkStart w:id="25" w:name="technological-capability-as-a-moderator"/>
     <w:p>
       <w:pPr>
         <w:pStyle w:val="Heading3"/>
@@ -1571,7 +1589,7 @@
     </w:p>
     <w:bookmarkEnd w:id="25"/>
     <w:bookmarkEnd w:id="26"/>
-    <w:bookmarkStart w:id="30" w:name="X5eb800a903106e48a684e9ea9de39ed619b9df8"/>
+    <w:bookmarkStart w:id="30" w:name="data-and-methods"/>
     <w:p>
       <w:pPr>
         <w:pStyle w:val="Heading2"/>
@@ -1580,7 +1598,7 @@
         <w:t xml:space="preserve">3. Data and Methods</w:t>
       </w:r>
     </w:p>
-    <w:bookmarkStart w:id="27" w:name="X7539fb3dc2f98232f41138bc75cab658563f4ee"/>
+    <w:bookmarkStart w:id="27" w:name="data"/>
     <w:p>
       <w:pPr>
         <w:pStyle w:val="Heading3"/>
@@ -2027,7 +2045,7 @@
       </w:r>
     </w:p>
     <w:bookmarkEnd w:id="27"/>
-    <w:bookmarkStart w:id="28" w:name="X431a8b355211b47c6e494a5f659051454df4ed1"/>
+    <w:bookmarkStart w:id="28" w:name="measures"/>
     <w:p>
       <w:pPr>
         <w:pStyle w:val="Heading3"/>
@@ -2421,7 +2439,7 @@
       </w:r>
     </w:p>
     <w:bookmarkEnd w:id="28"/>
-    <w:bookmarkStart w:id="29" w:name="X88d3b635b18ee197bee6ec760e4576787847be1"/>
+    <w:bookmarkStart w:id="29" w:name="estimation-strategy"/>
     <w:p>
       <w:pPr>
         <w:pStyle w:val="Heading3"/>
@@ -2447,58 +2465,49 @@
         <w:t xml:space="preserve"> </w:t>
       </w:r>
       <w:r>
-        <w:t xml:space="preserve">White, 1985), clustered on firm identifier (</w:t>
-      </w:r>
-      <w:r>
-        <w:rPr>
-          <w:rStyle w:val="VerbatimChar"/>
-        </w:rPr>
-        <w:t xml:space="preserve">idstd</w:t>
-      </w:r>
-      <w:r>
-        <w:t xml:space="preserve">) in the pooled</w:t>
-      </w:r>
-      <w:r>
-        <w:t xml:space="preserve"> </w:t>
-      </w:r>
-      <w:r>
-        <w:t xml:space="preserve">specification. Among the pooled 4,559 observations, 217 firms appear in</w:t>
-      </w:r>
-      <w:r>
-        <w:t xml:space="preserve"> </w:t>
-      </w:r>
-      <w:r>
-        <w:t xml:space="preserve">both the 2012 and 2024 waves (the 'panel core'), enabling within-firm</w:t>
-      </w:r>
-      <w:r>
-        <w:t xml:space="preserve"> </w:t>
-      </w:r>
-      <w:r>
-        <w:t xml:space="preserve">variation estimates via cluster-robust standard errors on firm</w:t>
-      </w:r>
-      <w:r>
-        <w:t xml:space="preserve"> </w:t>
-      </w:r>
-      <w:r>
-        <w:t xml:space="preserve">identifiers. This panel core, though modest in size relative to the full</w:t>
-      </w:r>
-      <w:r>
-        <w:t xml:space="preserve"> </w:t>
-      </w:r>
-      <w:r>
-        <w:t xml:space="preserve">sample, provides additional identification leverage unavailable in</w:t>
-      </w:r>
-      <w:r>
-        <w:t xml:space="preserve"> </w:t>
-      </w:r>
-      <w:r>
-        <w:t xml:space="preserve">single-wave studies. The main specification (M2) includes FSTS, FSTS²,</w:t>
-      </w:r>
-      <w:r>
-        <w:t xml:space="preserve"> </w:t>
-      </w:r>
-      <w:r>
-        <w:t xml:space="preserve">lnEmp, firmage, and foreigndummy.</w:t>
+        <w:t xml:space="preserve">White, 1985). The two WBES China waves are independent, repeated</w:t>
+      </w:r>
+      <w:r>
+        <w:t xml:space="preserve"> </w:t>
+      </w:r>
+      <w:r>
+        <w:t xml:space="preserve">cross-sections rather than a matched firm-level panel: WBES</w:t>
+      </w:r>
+      <w:r>
+        <w:t xml:space="preserve"> </w:t>
+      </w:r>
+      <w:r>
+        <w:t xml:space="preserve">anonymisation precludes linking individual firms across the 2012 and</w:t>
+      </w:r>
+      <w:r>
+        <w:t xml:space="preserve"> </w:t>
+      </w:r>
+      <w:r>
+        <w:t xml:space="preserve">2024 waves (see §5.4). The pooled specification therefore stacks the two</w:t>
+      </w:r>
+      <w:r>
+        <w:t xml:space="preserve"> </w:t>
+      </w:r>
+      <w:r>
+        <w:t xml:space="preserve">cross-sections and reports HC1-robust standard errors; cross-wave</w:t>
+      </w:r>
+      <w:r>
+        <w:t xml:space="preserve"> </w:t>
+      </w:r>
+      <w:r>
+        <w:t xml:space="preserve">comparisons rest on the Paternoster coefficient-equality tests rather</w:t>
+      </w:r>
+      <w:r>
+        <w:t xml:space="preserve"> </w:t>
+      </w:r>
+      <w:r>
+        <w:t xml:space="preserve">than on within-firm variation. The main specification (M2) includes</w:t>
+      </w:r>
+      <w:r>
+        <w:t xml:space="preserve"> </w:t>
+      </w:r>
+      <w:r>
+        <w:t xml:space="preserve">FSTS, FSTS², lnEmp, firmage, and foreigndummy.</w:t>
       </w:r>
     </w:p>
     <w:p>
@@ -2789,7 +2798,7 @@
     </w:p>
     <w:bookmarkEnd w:id="29"/>
     <w:bookmarkEnd w:id="30"/>
-    <w:bookmarkStart w:id="37" w:name="X121719332867ee227f0a04b486098cee978c6e6"/>
+    <w:bookmarkStart w:id="37" w:name="results"/>
     <w:p>
       <w:pPr>
         <w:pStyle w:val="Heading2"/>
@@ -2798,7 +2807,7 @@
         <w:t xml:space="preserve">4. Results</w:t>
       </w:r>
     </w:p>
-    <w:bookmarkStart w:id="31" w:name="Xcfcbc1028680fbd618b9b585dd17cf608861803"/>
+    <w:bookmarkStart w:id="31" w:name="descriptive-statistics"/>
     <w:p>
       <w:pPr>
         <w:pStyle w:val="Heading3"/>
@@ -2908,14 +2917,14 @@
     <w:tbl>
       <w:tblPr>
         <w:tblStyle w:val="Table"/>
-        <w:tblW w:type="auto" w:w="0"/>
+        <w:tblW w:type="pct" w:w="5000"/>
         <w:tblLook w:firstRow="1" w:lastRow="0" w:firstColumn="0" w:lastColumn="0" w:noHBand="0" w:noVBand="0" w:val="0020"/>
         <w:jc w:val="start"/>
       </w:tblPr>
       <w:tblGrid>
-        <w:gridCol w:w="2640"/>
-        <w:gridCol w:w="2640"/>
-        <w:gridCol w:w="2640"/>
+        <w:gridCol w:w="4168"/>
+        <w:gridCol w:w="1875"/>
+        <w:gridCol w:w="1875"/>
       </w:tblGrid>
       <w:tr>
         <w:trPr>
@@ -3290,7 +3299,7 @@
       </w:r>
     </w:p>
     <w:bookmarkEnd w:id="31"/>
-    <w:bookmarkStart w:id="32" w:name="X34b83cd764295e21fd4e71e3151b388b8f2159e"/>
+    <w:bookmarkStart w:id="32" w:name="main-threshold-results"/>
     <w:p>
       <w:pPr>
         <w:pStyle w:val="Heading3"/>
@@ -3450,7 +3459,7 @@
         <w:t xml:space="preserve"> </w:t>
       </w:r>
       <w:r>
-        <w:t xml:space="preserve">structurally durable: the 12-year interval spanning China's WTO</w:t>
+        <w:t xml:space="preserve">structurally durable: the 12-year interval spanning China’s WTO</w:t>
       </w:r>
       <w:r>
         <w:t xml:space="preserve"> </w:t>
@@ -3542,15 +3551,15 @@
     <w:tbl>
       <w:tblPr>
         <w:tblStyle w:val="Table"/>
-        <w:tblW w:type="auto" w:w="0"/>
+        <w:tblW w:type="pct" w:w="5000"/>
         <w:tblLook w:firstRow="1" w:lastRow="0" w:firstColumn="0" w:lastColumn="0" w:noHBand="0" w:noVBand="0" w:val="0020"/>
         <w:jc w:val="start"/>
       </w:tblPr>
       <w:tblGrid>
-        <w:gridCol w:w="1980"/>
-        <w:gridCol w:w="1980"/>
-        <w:gridCol w:w="1980"/>
-        <w:gridCol w:w="1980"/>
+        <w:gridCol w:w="2043"/>
+        <w:gridCol w:w="1958"/>
+        <w:gridCol w:w="1958"/>
+        <w:gridCol w:w="1958"/>
       </w:tblGrid>
       <w:tr>
         <w:trPr>
@@ -4181,7 +4190,7 @@
       </w:r>
     </w:p>
     <w:bookmarkEnd w:id="32"/>
-    <w:bookmarkStart w:id="33" w:name="Xfe3c331420c241aa73c6296372277a6d3f913cb"/>
+    <w:bookmarkStart w:id="33" w:name="predicted-ip-curves"/>
     <w:p>
       <w:pPr>
         <w:pStyle w:val="Heading3"/>
@@ -4279,7 +4288,7 @@
       </w:r>
     </w:p>
     <w:bookmarkEnd w:id="33"/>
-    <w:bookmarkStart w:id="34" w:name="X86f6006676d1e9a822b51b562b1655386d9e86b"/>
+    <w:bookmarkStart w:id="34" w:name="capability-moderation"/>
     <w:p>
       <w:pPr>
         <w:pStyle w:val="Heading3"/>
@@ -4391,15 +4400,15 @@
     <w:tbl>
       <w:tblPr>
         <w:tblStyle w:val="Table"/>
-        <w:tblW w:type="auto" w:w="0"/>
+        <w:tblW w:type="pct" w:w="5000"/>
         <w:tblLook w:firstRow="1" w:lastRow="0" w:firstColumn="0" w:lastColumn="0" w:noHBand="0" w:noVBand="0" w:val="0020"/>
         <w:jc w:val="start"/>
       </w:tblPr>
       <w:tblGrid>
-        <w:gridCol w:w="1980"/>
-        <w:gridCol w:w="1980"/>
-        <w:gridCol w:w="1980"/>
-        <w:gridCol w:w="1980"/>
+        <w:gridCol w:w="4601"/>
+        <w:gridCol w:w="1508"/>
+        <w:gridCol w:w="754"/>
+        <w:gridCol w:w="1056"/>
       </w:tblGrid>
       <w:tr>
         <w:trPr>
@@ -5218,7 +5227,7 @@
       </w:r>
     </w:p>
     <w:bookmarkEnd w:id="34"/>
-    <w:bookmarkStart w:id="35" w:name="Xdf31b4a83ae47f030a08265332b3138989411fc"/>
+    <w:bookmarkStart w:id="35" w:name="mechanism-analysis-digital-adoption"/>
     <w:p>
       <w:pPr>
         <w:pStyle w:val="Heading3"/>
@@ -5292,7 +5301,25 @@
         <w:t xml:space="preserve"> </w:t>
       </w:r>
       <w:r>
-        <w:t xml:space="preserve">reported as a “descriptive mechanism sketch” rather than a causal</w:t>
+        <w:t xml:space="preserve">reported as a</w:t>
+      </w:r>
+      <w:r>
+        <w:t xml:space="preserve"> </w:t>
+      </w:r>
+      <w:r>
+        <w:t xml:space="preserve">“</w:t>
+      </w:r>
+      <w:r>
+        <w:t xml:space="preserve">descriptive mechanism sketch</w:t>
+      </w:r>
+      <w:r>
+        <w:t xml:space="preserve">”</w:t>
+      </w:r>
+      <w:r>
+        <w:t xml:space="preserve"> </w:t>
+      </w:r>
+      <w:r>
+        <w:t xml:space="preserve">rather than a causal</w:t>
       </w:r>
       <w:r>
         <w:t xml:space="preserve"> </w:t>
@@ -5302,7 +5329,7 @@
       </w:r>
     </w:p>
     <w:bookmarkEnd w:id="35"/>
-    <w:bookmarkStart w:id="36" w:name="X7b68f907ed55e65a2ee44288bf21fafeaedb955"/>
+    <w:bookmarkStart w:id="36" w:name="robustness-checks"/>
     <w:p>
       <w:pPr>
         <w:pStyle w:val="Heading3"/>
@@ -5505,7 +5532,7 @@
     </w:p>
     <w:bookmarkEnd w:id="36"/>
     <w:bookmarkEnd w:id="37"/>
-    <w:bookmarkStart w:id="43" w:name="X735612638e4e736e4693e459c258977262c0dfc"/>
+    <w:bookmarkStart w:id="43" w:name="discussion"/>
     <w:p>
       <w:pPr>
         <w:pStyle w:val="Heading2"/>
@@ -5514,7 +5541,7 @@
         <w:t xml:space="preserve">5. Discussion</w:t>
       </w:r>
     </w:p>
-    <w:bookmarkStart w:id="38" w:name="Xa0c03496b4c04a1649263a3e01d0b00bd039955"/>
+    <w:bookmarkStart w:id="38" w:name="temporal-stability-of-the-ip-threshold"/>
     <w:p>
       <w:pPr>
         <w:pStyle w:val="Heading3"/>
@@ -5576,7 +5603,7 @@
         <w:t xml:space="preserve"> </w:t>
       </w:r>
       <w:r>
-        <w:t xml:space="preserve">(2007) meta-analytic evidence and Marano et al. (2016) institutional</w:t>
+        <w:t xml:space="preserve">(2007) meta-analytic evidence and Marano et al. (2016) institutional</w:t>
       </w:r>
       <w:r>
         <w:t xml:space="preserve"> </w:t>
@@ -5642,7 +5669,7 @@
       </w:r>
     </w:p>
     <w:bookmarkEnd w:id="38"/>
-    <w:bookmarkStart w:id="39" w:name="X662147d669ae611953db259d7b4d93f76a97e61"/>
+    <w:bookmarkStart w:id="39" w:name="X433fb1e034c39d563b08fc3391a6162a4e2331e"/>
     <w:p>
       <w:pPr>
         <w:pStyle w:val="Heading3"/>
@@ -5704,7 +5731,22 @@
         <w:t xml:space="preserve"> </w:t>
       </w:r>
       <w:r>
-        <w:t xml:space="preserve">a curvature-moderator to a “level-shifter”: capability elevates</w:t>
+        <w:t xml:space="preserve">a curvature-moderator to a</w:t>
+      </w:r>
+      <w:r>
+        <w:t xml:space="preserve"> </w:t>
+      </w:r>
+      <w:r>
+        <w:t xml:space="preserve">“</w:t>
+      </w:r>
+      <w:r>
+        <w:t xml:space="preserve">level-shifter</w:t>
+      </w:r>
+      <w:r>
+        <w:t xml:space="preserve">”</w:t>
+      </w:r>
+      <w:r>
+        <w:t xml:space="preserve">: capability elevates</w:t>
       </w:r>
       <w:r>
         <w:t xml:space="preserve"> </w:t>
@@ -5748,7 +5790,7 @@
         <w:pStyle w:val="BodyText"/>
       </w:pPr>
       <w:r>
-        <w:t xml:space="preserve">This finding is consistent with Avenyo et al. (2021), who find that</w:t>
+        <w:t xml:space="preserve">This finding is consistent with Avenyo et al. (2021), who find that</w:t>
       </w:r>
       <w:r>
         <w:t xml:space="preserve"> </w:t>
@@ -5850,7 +5892,7 @@
       </w:r>
     </w:p>
     <w:bookmarkEnd w:id="39"/>
-    <w:bookmarkStart w:id="40" w:name="Xeab358fda242154d2e818677c8845f988021d48"/>
+    <w:bookmarkStart w:id="40" w:name="digital-adoption-as-baseline-control"/>
     <w:p>
       <w:pPr>
         <w:pStyle w:val="Heading3"/>
@@ -5928,7 +5970,7 @@
       </w:r>
     </w:p>
     <w:bookmarkEnd w:id="40"/>
-    <w:bookmarkStart w:id="41" w:name="X47b33dbf897054d79ce3d759da46f0a1ef21be8"/>
+    <w:bookmarkStart w:id="41" w:name="limitations"/>
     <w:p>
       <w:pPr>
         <w:pStyle w:val="Heading3"/>
@@ -6054,7 +6096,7 @@
       </w:r>
     </w:p>
     <w:bookmarkEnd w:id="41"/>
-    <w:bookmarkStart w:id="42" w:name="X6239b91c09f491af0efd332004cb71e9de7a16c"/>
+    <w:bookmarkStart w:id="42" w:name="future-research"/>
     <w:p>
       <w:pPr>
         <w:pStyle w:val="Heading3"/>
@@ -6145,7 +6187,7 @@
     </w:p>
     <w:bookmarkEnd w:id="42"/>
     <w:bookmarkEnd w:id="43"/>
-    <w:bookmarkStart w:id="44" w:name="X6b297cc947e0db5526be369b1f0f4ddc67b2415"/>
+    <w:bookmarkStart w:id="44" w:name="conclusion"/>
     <w:p>
       <w:pPr>
         <w:pStyle w:val="Heading2"/>
@@ -6273,14 +6315,12 @@
         <w:t xml:space="preserve"> </w:t>
       </w:r>
       <w:hyperlink r:id="rId45">
-        <w:hyperlink r:id="rId45">
-          <w:r>
-            <w:rPr>
-              <w:rStyle w:val="Hyperlink"/>
-            </w:rPr>
-            <w:t xml:space="preserve">www.enterprisesurveys.org</w:t>
-          </w:r>
-        </w:hyperlink>
+        <w:r>
+          <w:rPr>
+            <w:rStyle w:val="Hyperlink"/>
+          </w:rPr>
+          <w:t xml:space="preserve">www.enterprisesurveys.org</w:t>
+        </w:r>
       </w:hyperlink>
       <w:r>
         <w:t xml:space="preserve">. We thank</w:t>
@@ -6447,7 +6487,7 @@
       </w:r>
     </w:p>
     <w:bookmarkEnd w:id="49"/>
-    <w:bookmarkStart w:id="76" w:name="references"/>
+    <w:bookmarkStart w:id="77" w:name="references"/>
     <w:p>
       <w:pPr>
         <w:pStyle w:val="Heading2"/>
@@ -6595,7 +6635,7 @@
         <w:t xml:space="preserve"> </w:t>
       </w:r>
       <w:r>
-        <w:t xml:space="preserve">manufacturing SMEs' internationalization on performance.</w:t>
+        <w:t xml:space="preserve">manufacturing SMEs’ internationalization on performance.</w:t>
       </w:r>
       <w:r>
         <w:t xml:space="preserve"> </w:t>
@@ -6674,19 +6714,13 @@
         <w:pStyle w:val="BodyText"/>
       </w:pPr>
       <w:r>
-        <w:t xml:space="preserve">Hitt, M. A., Hoskisson, R. E., and Kim, H. (1997). International</w:t>
-      </w:r>
-      <w:r>
-        <w:t xml:space="preserve"> </w:t>
-      </w:r>
-      <w:r>
-        <w:t xml:space="preserve">diversification: Effects on innovation and firm performance in</w:t>
-      </w:r>
-      <w:r>
-        <w:t xml:space="preserve"> </w:t>
-      </w:r>
-      <w:r>
-        <w:t xml:space="preserve">product-diversified firms.</w:t>
+        <w:t xml:space="preserve">Helpman, E., Melitz, M. J., and Yeaple, S. R. (2004). Export versus FDI</w:t>
+      </w:r>
+      <w:r>
+        <w:t xml:space="preserve"> </w:t>
+      </w:r>
+      <w:r>
+        <w:t xml:space="preserve">with heterogeneous firms.</w:t>
       </w:r>
       <w:r>
         <w:t xml:space="preserve"> </w:t>
@@ -6696,6 +6730,50 @@
           <w:iCs/>
           <w:i/>
         </w:rPr>
+        <w:t xml:space="preserve">American Economic Review, 94</w:t>
+      </w:r>
+      <w:r>
+        <w:t xml:space="preserve">(1), 300–316.</w:t>
+      </w:r>
+      <w:r>
+        <w:t xml:space="preserve"> </w:t>
+      </w:r>
+      <w:hyperlink r:id="rId54">
+        <w:r>
+          <w:rPr>
+            <w:rStyle w:val="Hyperlink"/>
+          </w:rPr>
+          <w:t xml:space="preserve">https://doi.org/10.1257/000282804322970814</w:t>
+        </w:r>
+      </w:hyperlink>
+    </w:p>
+    <w:p>
+      <w:pPr>
+        <w:pStyle w:val="BodyText"/>
+      </w:pPr>
+      <w:r>
+        <w:t xml:space="preserve">Hitt, M. A., Hoskisson, R. E., and Kim, H. (1997). International</w:t>
+      </w:r>
+      <w:r>
+        <w:t xml:space="preserve"> </w:t>
+      </w:r>
+      <w:r>
+        <w:t xml:space="preserve">diversification: Effects on innovation and firm performance in</w:t>
+      </w:r>
+      <w:r>
+        <w:t xml:space="preserve"> </w:t>
+      </w:r>
+      <w:r>
+        <w:t xml:space="preserve">product-diversified firms.</w:t>
+      </w:r>
+      <w:r>
+        <w:t xml:space="preserve"> </w:t>
+      </w:r>
+      <w:r>
+        <w:rPr>
+          <w:iCs/>
+          <w:i/>
+        </w:rPr>
         <w:t xml:space="preserve">Academy of Management Journal, 40</w:t>
       </w:r>
       <w:r>
@@ -6710,7 +6788,7 @@
       <w:r>
         <w:t xml:space="preserve"> </w:t>
       </w:r>
-      <w:hyperlink r:id="rId54">
+      <w:hyperlink r:id="rId55">
         <w:r>
           <w:rPr>
             <w:rStyle w:val="Hyperlink"/>
@@ -6724,13 +6802,19 @@
         <w:pStyle w:val="BodyText"/>
       </w:pPr>
       <w:r>
-        <w:t xml:space="preserve">Kano, L., Tsang, E. W. K., and Yeung, H. W.-C. (2020). Global value</w:t>
-      </w:r>
-      <w:r>
-        <w:t xml:space="preserve"> </w:t>
-      </w:r>
-      <w:r>
-        <w:t xml:space="preserve">chains: A review of the multi-disciplinary literature.</w:t>
+        <w:t xml:space="preserve">Johanson, J., and Vahlne, J.-E. (1977). The internationalization process</w:t>
+      </w:r>
+      <w:r>
+        <w:t xml:space="preserve"> </w:t>
+      </w:r>
+      <w:r>
+        <w:t xml:space="preserve">of the firm: A model of knowledge development and increasing foreign</w:t>
+      </w:r>
+      <w:r>
+        <w:t xml:space="preserve"> </w:t>
+      </w:r>
+      <w:r>
+        <w:t xml:space="preserve">market commitments.</w:t>
       </w:r>
       <w:r>
         <w:t xml:space="preserve"> </w:t>
@@ -6740,20 +6824,64 @@
           <w:iCs/>
           <w:i/>
         </w:rPr>
-        <w:t xml:space="preserve">Journal of</w:t>
+        <w:t xml:space="preserve">Journal of International Business Studies, 8</w:t>
+      </w:r>
+      <w:r>
+        <w:t xml:space="preserve">(1),</w:t>
+      </w:r>
+      <w:r>
+        <w:t xml:space="preserve"> </w:t>
+      </w:r>
+      <w:r>
+        <w:t xml:space="preserve">23–32.</w:t>
+      </w:r>
+      <w:r>
+        <w:t xml:space="preserve"> </w:t>
+      </w:r>
+      <w:hyperlink r:id="rId56">
+        <w:r>
+          <w:rPr>
+            <w:rStyle w:val="Hyperlink"/>
+          </w:rPr>
+          <w:t xml:space="preserve">https://doi.org/10.1057/palgrave.jibs.8490676</w:t>
+        </w:r>
+      </w:hyperlink>
+    </w:p>
+    <w:p>
+      <w:pPr>
+        <w:pStyle w:val="BodyText"/>
+      </w:pPr>
+      <w:r>
+        <w:t xml:space="preserve">Kano, L., Tsang, E. W. K., and Yeung, H. W.-C. (2020). Global value</w:t>
+      </w:r>
+      <w:r>
+        <w:t xml:space="preserve"> </w:t>
+      </w:r>
+      <w:r>
+        <w:t xml:space="preserve">chains: A review of the multi-disciplinary literature.</w:t>
+      </w:r>
+      <w:r>
+        <w:t xml:space="preserve"> </w:t>
       </w:r>
       <w:r>
         <w:rPr>
           <w:iCs/>
           <w:i/>
         </w:rPr>
-        <w:t xml:space="preserve"> </w:t>
+        <w:t xml:space="preserve">Journal of</w:t>
       </w:r>
       <w:r>
         <w:rPr>
           <w:iCs/>
           <w:i/>
         </w:rPr>
+        <w:t xml:space="preserve"> </w:t>
+      </w:r>
+      <w:r>
+        <w:rPr>
+          <w:iCs/>
+          <w:i/>
+        </w:rPr>
         <w:t xml:space="preserve">International Business Studies, 51</w:t>
       </w:r>
       <w:r>
@@ -6762,7 +6890,7 @@
       <w:r>
         <w:t xml:space="preserve"> </w:t>
       </w:r>
-      <w:hyperlink r:id="rId55">
+      <w:hyperlink r:id="rId57">
         <w:r>
           <w:rPr>
             <w:rStyle w:val="Hyperlink"/>
@@ -6806,7 +6934,7 @@
       <w:r>
         <w:t xml:space="preserve"> </w:t>
       </w:r>
-      <w:hyperlink r:id="rId56">
+      <w:hyperlink r:id="rId58">
         <w:r>
           <w:rPr>
             <w:rStyle w:val="Hyperlink"/>
@@ -6838,7 +6966,7 @@
       <w:r>
         <w:t xml:space="preserve"> </w:t>
       </w:r>
-      <w:hyperlink r:id="rId57">
+      <w:hyperlink r:id="rId59">
         <w:r>
           <w:rPr>
             <w:rStyle w:val="Hyperlink"/>
@@ -6890,7 +7018,7 @@
       <w:r>
         <w:t xml:space="preserve"> </w:t>
       </w:r>
-      <w:hyperlink r:id="rId58">
+      <w:hyperlink r:id="rId60">
         <w:r>
           <w:rPr>
             <w:rStyle w:val="Hyperlink"/>
@@ -6942,7 +7070,7 @@
       <w:r>
         <w:t xml:space="preserve"> </w:t>
       </w:r>
-      <w:hyperlink r:id="rId59">
+      <w:hyperlink r:id="rId61">
         <w:r>
           <w:rPr>
             <w:rStyle w:val="Hyperlink"/>
@@ -6980,7 +7108,7 @@
       <w:r>
         <w:t xml:space="preserve"> </w:t>
       </w:r>
-      <w:hyperlink r:id="rId60">
+      <w:hyperlink r:id="rId62">
         <w:r>
           <w:rPr>
             <w:rStyle w:val="Hyperlink"/>
@@ -7018,7 +7146,7 @@
       <w:r>
         <w:t xml:space="preserve"> </w:t>
       </w:r>
-      <w:hyperlink r:id="rId61">
+      <w:hyperlink r:id="rId63">
         <w:r>
           <w:rPr>
             <w:rStyle w:val="Hyperlink"/>
@@ -7062,7 +7190,7 @@
       <w:r>
         <w:t xml:space="preserve"> </w:t>
       </w:r>
-      <w:hyperlink r:id="rId62">
+      <w:hyperlink r:id="rId64">
         <w:r>
           <w:rPr>
             <w:rStyle w:val="Hyperlink"/>
@@ -7076,19 +7204,19 @@
         <w:pStyle w:val="BodyText"/>
       </w:pPr>
       <w:r>
-        <w:t xml:space="preserve">Meyer, K. E., van Witteloostuijn, A., and Beugelsdijk, S. (2017). What's</w:t>
-      </w:r>
-      <w:r>
-        <w:t xml:space="preserve"> </w:t>
-      </w:r>
-      <w:r>
-        <w:t xml:space="preserve">in a p? Reassessing best practices for conducting and reporting</w:t>
-      </w:r>
-      <w:r>
-        <w:t xml:space="preserve"> </w:t>
-      </w:r>
-      <w:r>
-        <w:t xml:space="preserve">hypothesis-testing research.</w:t>
+        <w:t xml:space="preserve">Nambisan, S., Wright, M., and Feldman, M. (2019). The digital</w:t>
+      </w:r>
+      <w:r>
+        <w:t xml:space="preserve"> </w:t>
+      </w:r>
+      <w:r>
+        <w:t xml:space="preserve">transformation of innovation and entrepreneurship: Progress, challenges</w:t>
+      </w:r>
+      <w:r>
+        <w:t xml:space="preserve"> </w:t>
+      </w:r>
+      <w:r>
+        <w:t xml:space="preserve">and key themes.</w:t>
       </w:r>
       <w:r>
         <w:t xml:space="preserve"> </w:t>
@@ -7098,64 +7226,6 @@
           <w:iCs/>
           <w:i/>
         </w:rPr>
-        <w:t xml:space="preserve">Journal of International Business Studies,</w:t>
-      </w:r>
-      <w:r>
-        <w:rPr>
-          <w:iCs/>
-          <w:i/>
-        </w:rPr>
-        <w:t xml:space="preserve"> </w:t>
-      </w:r>
-      <w:r>
-        <w:rPr>
-          <w:iCs/>
-          <w:i/>
-        </w:rPr>
-        <w:t xml:space="preserve">48</w:t>
-      </w:r>
-      <w:r>
-        <w:t xml:space="preserve">(5), 535–551.</w:t>
-      </w:r>
-      <w:r>
-        <w:t xml:space="preserve"> </w:t>
-      </w:r>
-      <w:hyperlink r:id="rId63">
-        <w:r>
-          <w:rPr>
-            <w:rStyle w:val="Hyperlink"/>
-          </w:rPr>
-          <w:t xml:space="preserve">https://doi.org/10.1057/s41267-017-0078-8</w:t>
-        </w:r>
-      </w:hyperlink>
-    </w:p>
-    <w:p>
-      <w:pPr>
-        <w:pStyle w:val="BodyText"/>
-      </w:pPr>
-      <w:r>
-        <w:t xml:space="preserve">Nambisan, S., Wright, M., and Feldman, M. (2019). The digital</w:t>
-      </w:r>
-      <w:r>
-        <w:t xml:space="preserve"> </w:t>
-      </w:r>
-      <w:r>
-        <w:t xml:space="preserve">transformation of innovation and entrepreneurship: Progress, challenges</w:t>
-      </w:r>
-      <w:r>
-        <w:t xml:space="preserve"> </w:t>
-      </w:r>
-      <w:r>
-        <w:t xml:space="preserve">and key themes.</w:t>
-      </w:r>
-      <w:r>
-        <w:t xml:space="preserve"> </w:t>
-      </w:r>
-      <w:r>
-        <w:rPr>
-          <w:iCs/>
-          <w:i/>
-        </w:rPr>
         <w:t xml:space="preserve">Research Policy, 48</w:t>
       </w:r>
       <w:r>
@@ -7164,7 +7234,7 @@
       <w:r>
         <w:t xml:space="preserve"> </w:t>
       </w:r>
-      <w:hyperlink r:id="rId64">
+      <w:hyperlink r:id="rId65">
         <w:r>
           <w:rPr>
             <w:rStyle w:val="Hyperlink"/>
@@ -7208,7 +7278,7 @@
       <w:r>
         <w:t xml:space="preserve"> </w:t>
       </w:r>
-      <w:hyperlink r:id="rId65">
+      <w:hyperlink r:id="rId66">
         <w:r>
           <w:rPr>
             <w:rStyle w:val="Hyperlink"/>
@@ -7252,7 +7322,7 @@
       <w:r>
         <w:t xml:space="preserve"> </w:t>
       </w:r>
-      <w:hyperlink r:id="rId66">
+      <w:hyperlink r:id="rId67">
         <w:r>
           <w:rPr>
             <w:rStyle w:val="Hyperlink"/>
@@ -7290,7 +7360,7 @@
       <w:r>
         <w:t xml:space="preserve"> </w:t>
       </w:r>
-      <w:hyperlink r:id="rId67">
+      <w:hyperlink r:id="rId68">
         <w:r>
           <w:rPr>
             <w:rStyle w:val="Hyperlink"/>
@@ -7304,7 +7374,7 @@
         <w:pStyle w:val="BodyText"/>
       </w:pPr>
       <w:r>
-        <w:t xml:space="preserve">Schwens, C., Zapkau, F. B., Bierwerth, M., Isidor, R., Knight, G., &amp;</w:t>
+        <w:t xml:space="preserve">Schwens, C., Zapkau, F. B., Bierwerth, M., Isidor, R., Knight, G., and</w:t>
       </w:r>
       <w:r>
         <w:t xml:space="preserve"> </w:t>
@@ -7348,7 +7418,7 @@
       <w:r>
         <w:t xml:space="preserve"> </w:t>
       </w:r>
-      <w:hyperlink r:id="rId68">
+      <w:hyperlink r:id="rId69">
         <w:r>
           <w:rPr>
             <w:rStyle w:val="Hyperlink"/>
@@ -7400,7 +7470,7 @@
       <w:r>
         <w:t xml:space="preserve"> </w:t>
       </w:r>
-      <w:hyperlink r:id="rId69">
+      <w:hyperlink r:id="rId70">
         <w:r>
           <w:rPr>
             <w:rStyle w:val="Hyperlink"/>
@@ -7452,7 +7522,7 @@
       <w:r>
         <w:t xml:space="preserve"> </w:t>
       </w:r>
-      <w:hyperlink r:id="rId70">
+      <w:hyperlink r:id="rId71">
         <w:r>
           <w:rPr>
             <w:rStyle w:val="Hyperlink"/>
@@ -7510,7 +7580,7 @@
       <w:r>
         <w:t xml:space="preserve"> </w:t>
       </w:r>
-      <w:hyperlink r:id="rId71">
+      <w:hyperlink r:id="rId72">
         <w:r>
           <w:rPr>
             <w:rStyle w:val="Hyperlink"/>
@@ -7554,7 +7624,7 @@
       <w:r>
         <w:t xml:space="preserve"> </w:t>
       </w:r>
-      <w:hyperlink r:id="rId72">
+      <w:hyperlink r:id="rId73">
         <w:r>
           <w:rPr>
             <w:rStyle w:val="Hyperlink"/>
@@ -7568,7 +7638,7 @@
         <w:pStyle w:val="BodyText"/>
       </w:pPr>
       <w:r>
-        <w:t xml:space="preserve">Volberda, H. W., Khanagha, S., Baden-Fuller, C., Mihalache, O. R., &amp;</w:t>
+        <w:t xml:space="preserve">Volberda, H. W., Khanagha, S., Baden-Fuller, C., Mihalache, O. R., and</w:t>
       </w:r>
       <w:r>
         <w:t xml:space="preserve"> </w:t>
@@ -7604,7 +7674,7 @@
       <w:r>
         <w:t xml:space="preserve"> </w:t>
       </w:r>
-      <w:hyperlink r:id="rId73">
+      <w:hyperlink r:id="rId74">
         <w:r>
           <w:rPr>
             <w:rStyle w:val="Hyperlink"/>
@@ -7642,7 +7712,7 @@
       <w:r>
         <w:t xml:space="preserve"> </w:t>
       </w:r>
-      <w:hyperlink r:id="rId74">
+      <w:hyperlink r:id="rId75">
         <w:r>
           <w:rPr>
             <w:rStyle w:val="Hyperlink"/>
@@ -7768,7 +7838,7 @@
       <w:r>
         <w:t xml:space="preserve"> </w:t>
       </w:r>
-      <w:hyperlink r:id="rId75">
+      <w:hyperlink r:id="rId76">
         <w:r>
           <w:rPr>
             <w:rStyle w:val="Hyperlink"/>
@@ -7835,7 +7905,7 @@
           <w:iCs/>
           <w:i/>
         </w:rPr>
-        <w:t xml:space="preserve">, *</w:t>
+        <w:t xml:space="preserve">,</w:t>
       </w:r>
       <w:r>
         <w:rPr>
@@ -7845,198 +7915,215 @@
         <w:t xml:space="preserve"> </w:t>
       </w:r>
       <w:r>
+        <w:t xml:space="preserve"> </w:t>
+      </w:r>
+      <w:r>
         <w:rPr>
           <w:rStyle w:val="VerbatimChar"/>
+        </w:rPr>
+        <w:t xml:space="preserve">python/</w:t>
+      </w:r>
+      <w:r>
+        <w:rPr>
           <w:iCs/>
           <w:i/>
         </w:rPr>
-        <w:t xml:space="preserve">python/</w:t>
-      </w:r>
-      <w:r>
-        <w:t xml:space="preserve">, *</w:t>
-      </w:r>
-      <w:r>
-        <w:t xml:space="preserve"> </w:t>
-      </w:r>
-      <w:r>
-        <w:rPr>
-          <w:rStyle w:val="VerbatimChar"/>
-        </w:rPr>
-        <w:t xml:space="preserve">audit/</w:t>
+        <w:t xml:space="preserve">,</w:t>
       </w:r>
       <w:r>
         <w:rPr>
           <w:iCs/>
           <w:i/>
         </w:rPr>
-        <w:t xml:space="preserve">, *</w:t>
+        <w:t xml:space="preserve"> </w:t>
+      </w:r>
+      <w:r>
+        <w:t xml:space="preserve"> </w:t>
+      </w:r>
+      <w:r>
+        <w:rPr>
+          <w:rStyle w:val="VerbatimChar"/>
+        </w:rPr>
+        <w:t xml:space="preserve">audit/</w:t>
       </w:r>
       <w:r>
         <w:rPr>
           <w:iCs/>
           <w:i/>
         </w:rPr>
-        <w:t xml:space="preserve"> </w:t>
-      </w:r>
-      <w:r>
-        <w:rPr>
-          <w:rStyle w:val="VerbatimChar"/>
+        <w:t xml:space="preserve">,</w:t>
+      </w:r>
+      <w:r>
+        <w:rPr>
           <w:iCs/>
           <w:i/>
         </w:rPr>
+        <w:t xml:space="preserve"> </w:t>
+      </w:r>
+      <w:r>
+        <w:t xml:space="preserve"> </w:t>
+      </w:r>
+      <w:r>
+        <w:rPr>
+          <w:rStyle w:val="VerbatimChar"/>
+        </w:rPr>
         <w:t xml:space="preserve">results/</w:t>
-      </w:r>
-      <w:r>
-        <w:t xml:space="preserve">, and*</w:t>
-      </w:r>
-      <w:r>
-        <w:t xml:space="preserve"> </w:t>
-      </w:r>
-      <w:r>
-        <w:rPr>
-          <w:rStyle w:val="VerbatimChar"/>
-        </w:rPr>
-        <w:t xml:space="preserve">apjm/</w:t>
-      </w:r>
-      <w:r>
-        <w:t xml:space="preserve"> </w:t>
       </w:r>
       <w:r>
         <w:rPr>
           <w:iCs/>
           <w:i/>
         </w:rPr>
-        <w:t xml:space="preserve">subfolders.</w:t>
+        <w:t xml:space="preserve">, and</w:t>
+      </w:r>
+      <w:r>
+        <w:t xml:space="preserve"> </w:t>
+      </w:r>
+      <w:r>
+        <w:rPr>
+          <w:rStyle w:val="VerbatimChar"/>
+        </w:rPr>
+        <w:t xml:space="preserve">apjm/</w:t>
+      </w:r>
+      <w:r>
+        <w:t xml:space="preserve"> </w:t>
       </w:r>
       <w:r>
         <w:rPr>
           <w:iCs/>
           <w:i/>
         </w:rPr>
-        <w:t xml:space="preserve"> </w:t>
+        <w:t xml:space="preserve">subfolders.</w:t>
       </w:r>
       <w:r>
         <w:rPr>
           <w:iCs/>
           <w:i/>
         </w:rPr>
-        <w:t xml:space="preserve">The complete v1.8 manuscript is assembled from six section parts</w:t>
+        <w:t xml:space="preserve"> </w:t>
       </w:r>
       <w:r>
         <w:rPr>
           <w:iCs/>
           <w:i/>
         </w:rPr>
-        <w:t xml:space="preserve"> </w:t>
+        <w:t xml:space="preserve">The complete v1.8 manuscript is assembled from six section parts</w:t>
       </w:r>
       <w:r>
         <w:rPr>
           <w:iCs/>
           <w:i/>
         </w:rPr>
-        <w:t xml:space="preserve">(</w:t>
-      </w:r>
-      <w:r>
-        <w:rPr>
-          <w:rStyle w:val="VerbatimChar"/>
-        </w:rPr>
-        <w:t xml:space="preserve">apjm/manuscript_v1_8_blinded_part{1, 2, 3, 4, 5, 6}_*.md</w:t>
+        <w:t xml:space="preserve"> </w:t>
       </w:r>
       <w:r>
         <w:rPr>
           <w:iCs/>
           <w:i/>
         </w:rPr>
-        <w:t xml:space="preserve">) per the build</w:t>
+        <w:t xml:space="preserve">(</w:t>
+      </w:r>
+      <w:r>
+        <w:rPr>
+          <w:rStyle w:val="VerbatimChar"/>
+        </w:rPr>
+        <w:t xml:space="preserve">apjm/manuscript_v1_8_blinded_part{1, 2, 3, 4, 5, 6}_*.md</w:t>
       </w:r>
       <w:r>
         <w:rPr>
           <w:iCs/>
           <w:i/>
         </w:rPr>
-        <w:t xml:space="preserve"> </w:t>
+        <w:t xml:space="preserve">) per the build</w:t>
       </w:r>
       <w:r>
         <w:rPr>
           <w:iCs/>
           <w:i/>
         </w:rPr>
-        <w:t xml:space="preserve">script</w:t>
-      </w:r>
-      <w:r>
-        <w:t xml:space="preserve"> </w:t>
-      </w:r>
-      <w:r>
-        <w:rPr>
-          <w:rStyle w:val="VerbatimChar"/>
-        </w:rPr>
-        <w:t xml:space="preserve">apjm/build_docx.sh</w:t>
+        <w:t xml:space="preserve"> </w:t>
       </w:r>
       <w:r>
         <w:rPr>
           <w:iCs/>
           <w:i/>
         </w:rPr>
-        <w:t xml:space="preserve">. Full replication code (Stata + Python),</w:t>
+        <w:t xml:space="preserve">script</w:t>
+      </w:r>
+      <w:r>
+        <w:t xml:space="preserve"> </w:t>
+      </w:r>
+      <w:r>
+        <w:rPr>
+          <w:rStyle w:val="VerbatimChar"/>
+        </w:rPr>
+        <w:t xml:space="preserve">apjm/build_docx.sh</w:t>
       </w:r>
       <w:r>
         <w:rPr>
           <w:iCs/>
           <w:i/>
         </w:rPr>
-        <w:t xml:space="preserve"> </w:t>
+        <w:t xml:space="preserve">. Full replication code (Stata + Python),</w:t>
       </w:r>
       <w:r>
         <w:rPr>
           <w:iCs/>
           <w:i/>
         </w:rPr>
-        <w:t xml:space="preserve">audit tables, M0–M8 coefficients, three-way moderation results, citation</w:t>
+        <w:t xml:space="preserve"> </w:t>
       </w:r>
       <w:r>
         <w:rPr>
           <w:iCs/>
           <w:i/>
         </w:rPr>
-        <w:t xml:space="preserve"> </w:t>
+        <w:t xml:space="preserve">audit tables, M0–M8 coefficients, three-way moderation results, citation</w:t>
       </w:r>
       <w:r>
         <w:rPr>
           <w:iCs/>
           <w:i/>
         </w:rPr>
-        <w:t xml:space="preserve">verification (</w:t>
-      </w:r>
-      <w:r>
-        <w:rPr>
-          <w:rStyle w:val="VerbatimChar"/>
-        </w:rPr>
-        <w:t xml:space="preserve">apjm/VERIFICATION_RESULTS.md</w:t>
+        <w:t xml:space="preserve"> </w:t>
       </w:r>
       <w:r>
         <w:rPr>
           <w:iCs/>
           <w:i/>
         </w:rPr>
-        <w:t xml:space="preserve">), and figure-rendering</w:t>
+        <w:t xml:space="preserve">verification (</w:t>
+      </w:r>
+      <w:r>
+        <w:rPr>
+          <w:rStyle w:val="VerbatimChar"/>
+        </w:rPr>
+        <w:t xml:space="preserve">apjm/VERIFICATION_RESULTS.md</w:t>
       </w:r>
       <w:r>
         <w:rPr>
           <w:iCs/>
           <w:i/>
         </w:rPr>
-        <w:t xml:space="preserve"> </w:t>
+        <w:t xml:space="preserve">), and figure-rendering</w:t>
       </w:r>
       <w:r>
         <w:rPr>
           <w:iCs/>
           <w:i/>
         </w:rPr>
+        <w:t xml:space="preserve"> </w:t>
+      </w:r>
+      <w:r>
+        <w:rPr>
+          <w:iCs/>
+          <w:i/>
+        </w:rPr>
         <w:t xml:space="preserve">scripts are documented in the repository README.</w:t>
       </w:r>
     </w:p>
-    <w:bookmarkEnd w:id="76"/>
     <w:bookmarkEnd w:id="77"/>
+    <w:bookmarkEnd w:id="78"/>
     <w:sectPr/>
   </w:body>
 </w:document>

</xml_diff>

<commit_message>
fix(p5-ijoem): reconcile Table 2 to raw .dta replication
The IJOEM manuscript's Table 2 carried stale main-model coefficients that
matched neither the committed estimates.csv nor the table's own turning
points (printed beta gave TP 41.8%, not the stated 49.4%). Re-sync Table 2
and the inline beta-prose to make_table2.py output from the raw China WBES
.dta: FSTS +2.07/+1.50/+1.78, FSTS2 -2.09/-1.59/-1.83, lnEmp -0.10/+0.12/
+0.00, R2 .020/.053/.054, with delta-method TP CIs. The 2024 Lind-Mehlum
u-test is p=.029 (not <.001). Turning points (49.4/47.2/48.8%), N, the
three-way moderation table, narrative, and figures are unchanged. Also fix
one connector em-dash. Add make_table2.py + REPRO_NOTE provenance.

Co-Authored-By: Claude Opus 4.8 (1M context) <noreply@anthropic.com>
Claude-Session: https://claude.ai/code/session_01Xumaoraa2DLWLXsgJJ62oq
</commit_message>
<xml_diff>
--- a/p5/submission/ijoem_package/01_manuscript_blinded.docx
+++ b/p5/submission/ijoem_package/01_manuscript_blinded.docx
@@ -677,7 +677,7 @@
       </w:r>
     </w:p>
     <w:bookmarkEnd w:id="21"/>
-    <w:bookmarkStart w:id="22" w:name="Xe3d0fc0bea9a42ce7605565d0964033d7f6ee47"/>
+    <w:bookmarkStart w:id="22" w:name="introduction"/>
     <w:p>
       <w:pPr>
         <w:pStyle w:val="Heading2"/>
@@ -947,7 +947,7 @@
       </w:r>
     </w:p>
     <w:bookmarkEnd w:id="22"/>
-    <w:bookmarkStart w:id="26" w:name="X8bf20a63f0decf7b16e99d564b9958ec4fbbb23"/>
+    <w:bookmarkStart w:id="26" w:name="theory-and-hypotheses"/>
     <w:p>
       <w:pPr>
         <w:pStyle w:val="Heading2"/>
@@ -956,7 +956,7 @@
         <w:t xml:space="preserve">2. Theory and Hypotheses</w:t>
       </w:r>
     </w:p>
-    <w:bookmarkStart w:id="23" w:name="Xe089a51cf00ad631dbcdfa837bfcf2befbbb388"/>
+    <w:bookmarkStart w:id="23" w:name="X80f1b9a6838da6506200db77e2279c8969787f1"/>
     <w:p>
       <w:pPr>
         <w:pStyle w:val="Heading3"/>
@@ -1106,7 +1106,7 @@
       </w:r>
     </w:p>
     <w:bookmarkEnd w:id="23"/>
-    <w:bookmarkStart w:id="24" w:name="Xf1c81d13fe998b882da119ca3ec3b3d40ce5a1b"/>
+    <w:bookmarkStart w:id="24" w:name="temporal-stability-of-the-ip-curvature"/>
     <w:p>
       <w:pPr>
         <w:pStyle w:val="Heading3"/>
@@ -1150,7 +1150,25 @@
         <w:t xml:space="preserve"> </w:t>
       </w:r>
       <w:r>
-        <w:t xml:space="preserve">sensitive to structural context, generating a "wave-specific" pattern</w:t>
+        <w:t xml:space="preserve">sensitive to structural context, generating a</w:t>
+      </w:r>
+      <w:r>
+        <w:t xml:space="preserve"> </w:t>
+      </w:r>
+      <w:r>
+        <w:t xml:space="preserve">“</w:t>
+      </w:r>
+      <w:r>
+        <w:t xml:space="preserve">wave-specific</w:t>
+      </w:r>
+      <w:r>
+        <w:t xml:space="preserve">”</w:t>
+      </w:r>
+      <w:r>
+        <w:t xml:space="preserve"> </w:t>
+      </w:r>
+      <w:r>
+        <w:t xml:space="preserve">pattern</w:t>
       </w:r>
       <w:r>
         <w:t xml:space="preserve"> </w:t>
@@ -1186,7 +1204,7 @@
         <w:t xml:space="preserve"> </w:t>
       </w:r>
       <w:r>
-        <w:t xml:space="preserve">When China's export environment shifts substantially between</w:t>
+        <w:t xml:space="preserve">When China’s export environment shifts substantially between</w:t>
       </w:r>
       <w:r>
         <w:t xml:space="preserve"> </w:t>
@@ -1246,7 +1264,7 @@
         <w:t xml:space="preserve"> </w:t>
       </w:r>
       <w:r>
-        <w:t xml:space="preserve">When China's institutional framework governing export costs</w:t>
+        <w:t xml:space="preserve">When China’s institutional framework governing export costs</w:t>
       </w:r>
       <w:r>
         <w:t xml:space="preserve"> </w:t>
@@ -1298,7 +1316,7 @@
       </w:r>
     </w:p>
     <w:bookmarkEnd w:id="24"/>
-    <w:bookmarkStart w:id="25" w:name="X505f50cd1f9abb1ab06672992aff36a1dc7f136"/>
+    <w:bookmarkStart w:id="25" w:name="technological-capability-as-a-moderator"/>
     <w:p>
       <w:pPr>
         <w:pStyle w:val="Heading3"/>
@@ -1571,7 +1589,7 @@
     </w:p>
     <w:bookmarkEnd w:id="25"/>
     <w:bookmarkEnd w:id="26"/>
-    <w:bookmarkStart w:id="30" w:name="X5eb800a903106e48a684e9ea9de39ed619b9df8"/>
+    <w:bookmarkStart w:id="30" w:name="data-and-methods"/>
     <w:p>
       <w:pPr>
         <w:pStyle w:val="Heading2"/>
@@ -1580,7 +1598,7 @@
         <w:t xml:space="preserve">3. Data and Methods</w:t>
       </w:r>
     </w:p>
-    <w:bookmarkStart w:id="27" w:name="X7539fb3dc2f98232f41138bc75cab658563f4ee"/>
+    <w:bookmarkStart w:id="27" w:name="data"/>
     <w:p>
       <w:pPr>
         <w:pStyle w:val="Heading3"/>
@@ -2027,7 +2045,7 @@
       </w:r>
     </w:p>
     <w:bookmarkEnd w:id="27"/>
-    <w:bookmarkStart w:id="28" w:name="X431a8b355211b47c6e494a5f659051454df4ed1"/>
+    <w:bookmarkStart w:id="28" w:name="measures"/>
     <w:p>
       <w:pPr>
         <w:pStyle w:val="Heading3"/>
@@ -2384,6 +2402,82 @@
           <w:bCs/>
           <w:b/>
         </w:rPr>
+        <w:t xml:space="preserve">Measurement note.</w:t>
+      </w:r>
+      <w:r>
+        <w:t xml:space="preserve"> </w:t>
+      </w:r>
+      <w:r>
+        <w:t xml:space="preserve">TCI_full is a</w:t>
+      </w:r>
+      <w:r>
+        <w:t xml:space="preserve"> </w:t>
+      </w:r>
+      <w:r>
+        <w:rPr>
+          <w:iCs/>
+          <w:i/>
+        </w:rPr>
+        <w:t xml:space="preserve">formative</w:t>
+      </w:r>
+      <w:r>
+        <w:t xml:space="preserve"> </w:t>
+      </w:r>
+      <w:r>
+        <w:t xml:space="preserve">composite, in which its items</w:t>
+      </w:r>
+      <w:r>
+        <w:t xml:space="preserve"> </w:t>
+      </w:r>
+      <w:r>
+        <w:t xml:space="preserve">are defining constituents of technological capability rather than</w:t>
+      </w:r>
+      <w:r>
+        <w:t xml:space="preserve"> </w:t>
+      </w:r>
+      <w:r>
+        <w:t xml:space="preserve">reflective manifestations of a single latent trait, so by the</w:t>
+      </w:r>
+      <w:r>
+        <w:t xml:space="preserve"> </w:t>
+      </w:r>
+      <w:r>
+        <w:t xml:space="preserve">four-criterion test of Coltman et al. (2008) the indicators need not</w:t>
+      </w:r>
+      <w:r>
+        <w:t xml:space="preserve"> </w:t>
+      </w:r>
+      <w:r>
+        <w:t xml:space="preserve">covary and reflective internal-consistency diagnostics do not apply.</w:t>
+      </w:r>
+      <w:r>
+        <w:t xml:space="preserve"> </w:t>
+      </w:r>
+      <w:r>
+        <w:t xml:space="preserve">Consistent with treating digital adoption as a separate baseline domain,</w:t>
+      </w:r>
+      <w:r>
+        <w:t xml:space="preserve"> </w:t>
+      </w:r>
+      <w:r>
+        <w:t xml:space="preserve">TCI and the website indicator are empirically distinct in the China</w:t>
+      </w:r>
+      <w:r>
+        <w:t xml:space="preserve"> </w:t>
+      </w:r>
+      <w:r>
+        <w:t xml:space="preserve">sample (composite correlation r = 0.18; 3 % shared variance).</w:t>
+      </w:r>
+    </w:p>
+    <w:p>
+      <w:pPr>
+        <w:pStyle w:val="BodyText"/>
+      </w:pPr>
+      <w:r>
+        <w:rPr>
+          <w:bCs/>
+          <w:b/>
+        </w:rPr>
         <w:t xml:space="preserve">Controls.</w:t>
       </w:r>
       <w:r>
@@ -2421,7 +2515,7 @@
       </w:r>
     </w:p>
     <w:bookmarkEnd w:id="28"/>
-    <w:bookmarkStart w:id="29" w:name="X88d3b635b18ee197bee6ec760e4576787847be1"/>
+    <w:bookmarkStart w:id="29" w:name="estimation-strategy"/>
     <w:p>
       <w:pPr>
         <w:pStyle w:val="Heading3"/>
@@ -2780,7 +2874,7 @@
     </w:p>
     <w:bookmarkEnd w:id="29"/>
     <w:bookmarkEnd w:id="30"/>
-    <w:bookmarkStart w:id="37" w:name="X121719332867ee227f0a04b486098cee978c6e6"/>
+    <w:bookmarkStart w:id="37" w:name="results"/>
     <w:p>
       <w:pPr>
         <w:pStyle w:val="Heading2"/>
@@ -2789,7 +2883,7 @@
         <w:t xml:space="preserve">4. Results</w:t>
       </w:r>
     </w:p>
-    <w:bookmarkStart w:id="31" w:name="Xcfcbc1028680fbd618b9b585dd17cf608861803"/>
+    <w:bookmarkStart w:id="31" w:name="descriptive-statistics"/>
     <w:p>
       <w:pPr>
         <w:pStyle w:val="Heading3"/>
@@ -2899,14 +2993,14 @@
     <w:tbl>
       <w:tblPr>
         <w:tblStyle w:val="Table"/>
-        <w:tblW w:type="auto" w:w="0"/>
+        <w:tblW w:type="pct" w:w="5000"/>
         <w:tblLook w:firstRow="1" w:lastRow="0" w:firstColumn="0" w:lastColumn="0" w:noHBand="0" w:noVBand="0" w:val="0020"/>
         <w:jc w:val="start"/>
       </w:tblPr>
       <w:tblGrid>
-        <w:gridCol w:w="2640"/>
-        <w:gridCol w:w="2640"/>
-        <w:gridCol w:w="2640"/>
+        <w:gridCol w:w="4168"/>
+        <w:gridCol w:w="1875"/>
+        <w:gridCol w:w="1875"/>
       </w:tblGrid>
       <w:tr>
         <w:trPr>
@@ -3281,7 +3375,7 @@
       </w:r>
     </w:p>
     <w:bookmarkEnd w:id="31"/>
-    <w:bookmarkStart w:id="32" w:name="X34b83cd764295e21fd4e71e3151b388b8f2159e"/>
+    <w:bookmarkStart w:id="32" w:name="main-threshold-results"/>
     <w:p>
       <w:pPr>
         <w:pStyle w:val="Heading3"/>
@@ -3307,7 +3401,7 @@
         <w:t xml:space="preserve"> </w:t>
       </w:r>
       <w:r>
-        <w:t xml:space="preserve">(2012: β = +1.28, SE = 0.38, p = .001; 2024: β = +1.19, SE = 0.46, p =</w:t>
+        <w:t xml:space="preserve">(2012: β = +2.07, SE = 0.38, p &lt; .001; 2024: β = +1.50, SE = 0.58, p =</w:t>
       </w:r>
       <w:r>
         <w:t xml:space="preserve"> </w:t>
@@ -3319,7 +3413,7 @@
         <w:t xml:space="preserve"> </w:t>
       </w:r>
       <w:r>
-        <w:t xml:space="preserve">−1.53, SE = 0.42, p &lt; .001; 2024: β = −1.58, SE = 0.50, p = .002); this</w:t>
+        <w:t xml:space="preserve">−2.09, SE = 0.44, p &lt; .001; 2024: β = −1.59, SE = 0.71, p = .026); this</w:t>
       </w:r>
       <w:r>
         <w:t xml:space="preserve"> </w:t>
@@ -3349,7 +3443,7 @@
         <w:t xml:space="preserve"> </w:t>
       </w:r>
       <w:r>
-        <w:t xml:space="preserve">+1.28 (p = .001), confirming a positive ascending limb; (C2) β₂ = −1.53</w:t>
+        <w:t xml:space="preserve">+2.07 (p &lt; .001), confirming a positive ascending limb; (C2) β₂ = −2.09</w:t>
       </w:r>
       <w:r>
         <w:t xml:space="preserve"> </w:t>
@@ -3385,7 +3479,7 @@
         <w:t xml:space="preserve"> </w:t>
       </w:r>
       <w:r>
-        <w:t xml:space="preserve">the 2024 wave (β₁ = +1.19, β₂ = −1.58, TP* = 47.2%, LM p &lt; .001) and</w:t>
+        <w:t xml:space="preserve">the 2024 wave (β₁ = +1.50, β₂ = −1.59, TP* = 47.2%, LM p = .029) and</w:t>
       </w:r>
       <w:r>
         <w:t xml:space="preserve"> </w:t>
@@ -3399,13 +3493,13 @@
         <w:pStyle w:val="BodyText"/>
       </w:pPr>
       <w:r>
-        <w:t xml:space="preserve">Turning-point estimates are 49.4 % (95 % CI: 43.1–55.7 %) in 2012 and</w:t>
-      </w:r>
-      <w:r>
-        <w:t xml:space="preserve"> </w:t>
-      </w:r>
-      <w:r>
-        <w:t xml:space="preserve">47.2 % (95 % CI: 40.8–53.6 %) in 2024. The CIs overlap substantially,</w:t>
+        <w:t xml:space="preserve">Turning-point estimates are 49.4 % (95 % CI: 43.2–55.6 %) in 2012 and</w:t>
+      </w:r>
+      <w:r>
+        <w:t xml:space="preserve"> </w:t>
+      </w:r>
+      <w:r>
+        <w:t xml:space="preserve">47.2 % (95 % CI: 34.5–59.9 %) in 2024. The CIs overlap substantially,</w:t>
       </w:r>
       <w:r>
         <w:t xml:space="preserve"> </w:t>
@@ -3441,7 +3535,7 @@
         <w:t xml:space="preserve"> </w:t>
       </w:r>
       <w:r>
-        <w:t xml:space="preserve">structurally durable: the 12-year interval spanning China's WTO</w:t>
+        <w:t xml:space="preserve">structurally durable: the 12-year interval spanning China’s WTO</w:t>
       </w:r>
       <w:r>
         <w:t xml:space="preserve"> </w:t>
@@ -3491,19 +3585,19 @@
         <w:pStyle w:val="BodyText"/>
       </w:pPr>
       <w:r>
-        <w:t xml:space="preserve">The pooled model (N = 4,544) yields FSTS β = +1.24 (p &lt; .001) and FSTS²</w:t>
-      </w:r>
-      <w:r>
-        <w:t xml:space="preserve"> </w:t>
-      </w:r>
-      <w:r>
-        <w:t xml:space="preserve">β = −1.55 (p &lt; .001), with turning point at 48.8 % (95 % CI:</w:t>
-      </w:r>
-      <w:r>
-        <w:t xml:space="preserve"> </w:t>
-      </w:r>
-      <w:r>
-        <w:t xml:space="preserve">44.2–53.4 %).</w:t>
+        <w:t xml:space="preserve">The pooled model (N = 4,544) yields FSTS β = +1.78 (p &lt; .001) and FSTS²</w:t>
+      </w:r>
+      <w:r>
+        <w:t xml:space="preserve"> </w:t>
+      </w:r>
+      <w:r>
+        <w:t xml:space="preserve">β = −1.83 (p &lt; .001), with turning point at 48.8 % (95 % CI:</w:t>
+      </w:r>
+      <w:r>
+        <w:t xml:space="preserve"> </w:t>
+      </w:r>
+      <w:r>
+        <w:t xml:space="preserve">42.6–54.9 %).</w:t>
       </w:r>
     </w:p>
     <w:p>
@@ -3533,15 +3627,15 @@
     <w:tbl>
       <w:tblPr>
         <w:tblStyle w:val="Table"/>
-        <w:tblW w:type="auto" w:w="0"/>
+        <w:tblW w:type="pct" w:w="5000"/>
         <w:tblLook w:firstRow="1" w:lastRow="0" w:firstColumn="0" w:lastColumn="0" w:noHBand="0" w:noVBand="0" w:val="0020"/>
         <w:jc w:val="start"/>
       </w:tblPr>
       <w:tblGrid>
-        <w:gridCol w:w="1980"/>
-        <w:gridCol w:w="1980"/>
-        <w:gridCol w:w="1980"/>
-        <w:gridCol w:w="1980"/>
+        <w:gridCol w:w="2043"/>
+        <w:gridCol w:w="1958"/>
+        <w:gridCol w:w="1958"/>
+        <w:gridCol w:w="1958"/>
       </w:tblGrid>
       <w:tr>
         <w:trPr>
@@ -3641,7 +3735,7 @@
               <w:jc w:val="left"/>
             </w:pPr>
             <w:r>
-              <w:t xml:space="preserve">+12.58 (0.067) ***</w:t>
+              <w:t xml:space="preserve">+12.30 (0.066) ***</w:t>
             </w:r>
           </w:p>
         </w:tc>
@@ -3667,31 +3761,31 @@
               <w:jc w:val="left"/>
             </w:pPr>
             <w:r>
-              <w:t xml:space="preserve">+1.28 (0.379) ***</w:t>
-            </w:r>
-          </w:p>
-        </w:tc>
-        <w:tc>
-          <w:tcPr/>
-          <w:p>
-            <w:pPr>
-              <w:pStyle w:val="Compact"/>
-              <w:jc w:val="left"/>
-            </w:pPr>
-            <w:r>
-              <w:t xml:space="preserve">+1.19 (0.461) **</w:t>
-            </w:r>
-          </w:p>
-        </w:tc>
-        <w:tc>
-          <w:tcPr/>
-          <w:p>
-            <w:pPr>
-              <w:pStyle w:val="Compact"/>
-              <w:jc w:val="left"/>
-            </w:pPr>
-            <w:r>
-              <w:t xml:space="preserve">+1.24 (0.290) ***</w:t>
+              <w:t xml:space="preserve">+2.07 (0.379) ***</w:t>
+            </w:r>
+          </w:p>
+        </w:tc>
+        <w:tc>
+          <w:tcPr/>
+          <w:p>
+            <w:pPr>
+              <w:pStyle w:val="Compact"/>
+              <w:jc w:val="left"/>
+            </w:pPr>
+            <w:r>
+              <w:t xml:space="preserve">+1.50 (0.578) **</w:t>
+            </w:r>
+          </w:p>
+        </w:tc>
+        <w:tc>
+          <w:tcPr/>
+          <w:p>
+            <w:pPr>
+              <w:pStyle w:val="Compact"/>
+              <w:jc w:val="left"/>
+            </w:pPr>
+            <w:r>
+              <w:t xml:space="preserve">+1.78 (0.319) ***</w:t>
             </w:r>
           </w:p>
         </w:tc>
@@ -3717,31 +3811,31 @@
               <w:jc w:val="left"/>
             </w:pPr>
             <w:r>
-              <w:t xml:space="preserve">−1.53 (0.420) ***</w:t>
-            </w:r>
-          </w:p>
-        </w:tc>
-        <w:tc>
-          <w:tcPr/>
-          <w:p>
-            <w:pPr>
-              <w:pStyle w:val="Compact"/>
-              <w:jc w:val="left"/>
-            </w:pPr>
-            <w:r>
-              <w:t xml:space="preserve">−1.58 (0.503) ***</w:t>
-            </w:r>
-          </w:p>
-        </w:tc>
-        <w:tc>
-          <w:tcPr/>
-          <w:p>
-            <w:pPr>
-              <w:pStyle w:val="Compact"/>
-              <w:jc w:val="left"/>
-            </w:pPr>
-            <w:r>
-              <w:t xml:space="preserve">−1.55 (0.330) ***</w:t>
+              <w:t xml:space="preserve">−2.09 (0.435) ***</w:t>
+            </w:r>
+          </w:p>
+        </w:tc>
+        <w:tc>
+          <w:tcPr/>
+          <w:p>
+            <w:pPr>
+              <w:pStyle w:val="Compact"/>
+              <w:jc w:val="left"/>
+            </w:pPr>
+            <w:r>
+              <w:t xml:space="preserve">−1.59 (0.712) *</w:t>
+            </w:r>
+          </w:p>
+        </w:tc>
+        <w:tc>
+          <w:tcPr/>
+          <w:p>
+            <w:pPr>
+              <w:pStyle w:val="Compact"/>
+              <w:jc w:val="left"/>
+            </w:pPr>
+            <w:r>
+              <w:t xml:space="preserve">−1.83 (0.375) ***</w:t>
             </w:r>
           </w:p>
         </w:tc>
@@ -3767,31 +3861,31 @@
               <w:jc w:val="left"/>
             </w:pPr>
             <w:r>
-              <w:t xml:space="preserve">+0.31 (0.025) ***</w:t>
-            </w:r>
-          </w:p>
-        </w:tc>
-        <w:tc>
-          <w:tcPr/>
-          <w:p>
-            <w:pPr>
-              <w:pStyle w:val="Compact"/>
-              <w:jc w:val="left"/>
-            </w:pPr>
-            <w:r>
-              <w:t xml:space="preserve">+0.39 (0.031) ***</w:t>
-            </w:r>
-          </w:p>
-        </w:tc>
-        <w:tc>
-          <w:tcPr/>
-          <w:p>
-            <w:pPr>
-              <w:pStyle w:val="Compact"/>
-              <w:jc w:val="left"/>
-            </w:pPr>
-            <w:r>
-              <w:t xml:space="preserve">+0.35 (0.019) ***</w:t>
+              <w:t xml:space="preserve">−0.10 (0.023) ***</w:t>
+            </w:r>
+          </w:p>
+        </w:tc>
+        <w:tc>
+          <w:tcPr/>
+          <w:p>
+            <w:pPr>
+              <w:pStyle w:val="Compact"/>
+              <w:jc w:val="left"/>
+            </w:pPr>
+            <w:r>
+              <w:t xml:space="preserve">+0.12 (0.023) ***</w:t>
+            </w:r>
+          </w:p>
+        </w:tc>
+        <w:tc>
+          <w:tcPr/>
+          <w:p>
+            <w:pPr>
+              <w:pStyle w:val="Compact"/>
+              <w:jc w:val="left"/>
+            </w:pPr>
+            <w:r>
+              <w:t xml:space="preserve">+0.00 (0.016)</w:t>
             </w:r>
           </w:p>
         </w:tc>
@@ -3817,31 +3911,31 @@
               <w:jc w:val="left"/>
             </w:pPr>
             <w:r>
-              <w:t xml:space="preserve">+0.007 (0.003) *</w:t>
-            </w:r>
-          </w:p>
-        </w:tc>
-        <w:tc>
-          <w:tcPr/>
-          <w:p>
-            <w:pPr>
-              <w:pStyle w:val="Compact"/>
-              <w:jc w:val="left"/>
-            </w:pPr>
-            <w:r>
-              <w:t xml:space="preserve">+0.010 (0.003) ***</w:t>
-            </w:r>
-          </w:p>
-        </w:tc>
-        <w:tc>
-          <w:tcPr/>
-          <w:p>
-            <w:pPr>
-              <w:pStyle w:val="Compact"/>
-              <w:jc w:val="left"/>
-            </w:pPr>
-            <w:r>
-              <w:t xml:space="preserve">+0.009 (0.002) ***</w:t>
+              <w:t xml:space="preserve">+0.008 (0.004)</w:t>
+            </w:r>
+          </w:p>
+        </w:tc>
+        <w:tc>
+          <w:tcPr/>
+          <w:p>
+            <w:pPr>
+              <w:pStyle w:val="Compact"/>
+              <w:jc w:val="left"/>
+            </w:pPr>
+            <w:r>
+              <w:t xml:space="preserve">+0.012 (0.003) ***</w:t>
+            </w:r>
+          </w:p>
+        </w:tc>
+        <w:tc>
+          <w:tcPr/>
+          <w:p>
+            <w:pPr>
+              <w:pStyle w:val="Compact"/>
+              <w:jc w:val="left"/>
+            </w:pPr>
+            <w:r>
+              <w:t xml:space="preserve">+0.012 (0.002) ***</w:t>
             </w:r>
           </w:p>
         </w:tc>
@@ -3867,31 +3961,31 @@
               <w:jc w:val="left"/>
             </w:pPr>
             <w:r>
-              <w:t xml:space="preserve">+0.24 (0.109) **</w:t>
-            </w:r>
-          </w:p>
-        </w:tc>
-        <w:tc>
-          <w:tcPr/>
-          <w:p>
-            <w:pPr>
-              <w:pStyle w:val="Compact"/>
-              <w:jc w:val="left"/>
-            </w:pPr>
-            <w:r>
-              <w:t xml:space="preserve">+0.18 (0.147)</w:t>
-            </w:r>
-          </w:p>
-        </w:tc>
-        <w:tc>
-          <w:tcPr/>
-          <w:p>
-            <w:pPr>
-              <w:pStyle w:val="Compact"/>
-              <w:jc w:val="left"/>
-            </w:pPr>
-            <w:r>
-              <w:t xml:space="preserve">+0.21 (0.086) **</w:t>
+              <w:t xml:space="preserve">+0.11 (0.095)</w:t>
+            </w:r>
+          </w:p>
+        </w:tc>
+        <w:tc>
+          <w:tcPr/>
+          <w:p>
+            <w:pPr>
+              <w:pStyle w:val="Compact"/>
+              <w:jc w:val="left"/>
+            </w:pPr>
+            <w:r>
+              <w:t xml:space="preserve">+0.26 (0.119) *</w:t>
+            </w:r>
+          </w:p>
+        </w:tc>
+        <w:tc>
+          <w:tcPr/>
+          <w:p>
+            <w:pPr>
+              <w:pStyle w:val="Compact"/>
+              <w:jc w:val="left"/>
+            </w:pPr>
+            <w:r>
+              <w:t xml:space="preserve">+0.22 (0.074) **</w:t>
             </w:r>
           </w:p>
         </w:tc>
@@ -3983,31 +4077,31 @@
               <w:jc w:val="left"/>
             </w:pPr>
             <w:r>
-              <w:t xml:space="preserve">[43.1, 55.7]</w:t>
-            </w:r>
-          </w:p>
-        </w:tc>
-        <w:tc>
-          <w:tcPr/>
-          <w:p>
-            <w:pPr>
-              <w:pStyle w:val="Compact"/>
-              <w:jc w:val="left"/>
-            </w:pPr>
-            <w:r>
-              <w:t xml:space="preserve">[40.8, 53.6]</w:t>
-            </w:r>
-          </w:p>
-        </w:tc>
-        <w:tc>
-          <w:tcPr/>
-          <w:p>
-            <w:pPr>
-              <w:pStyle w:val="Compact"/>
-              <w:jc w:val="left"/>
-            </w:pPr>
-            <w:r>
-              <w:t xml:space="preserve">[44.2, 53.4]</w:t>
+              <w:t xml:space="preserve">[43.2, 55.6]</w:t>
+            </w:r>
+          </w:p>
+        </w:tc>
+        <w:tc>
+          <w:tcPr/>
+          <w:p>
+            <w:pPr>
+              <w:pStyle w:val="Compact"/>
+              <w:jc w:val="left"/>
+            </w:pPr>
+            <w:r>
+              <w:t xml:space="preserve">[34.5, 59.9]</w:t>
+            </w:r>
+          </w:p>
+        </w:tc>
+        <w:tc>
+          <w:tcPr/>
+          <w:p>
+            <w:pPr>
+              <w:pStyle w:val="Compact"/>
+              <w:jc w:val="left"/>
+            </w:pPr>
+            <w:r>
+              <w:t xml:space="preserve">[42.6, 54.9]</w:t>
             </w:r>
           </w:p>
         </w:tc>
@@ -4033,31 +4127,31 @@
               <w:jc w:val="left"/>
             </w:pPr>
             <w:r>
-              <w:t xml:space="preserve">.142</w:t>
-            </w:r>
-          </w:p>
-        </w:tc>
-        <w:tc>
-          <w:tcPr/>
-          <w:p>
-            <w:pPr>
-              <w:pStyle w:val="Compact"/>
-              <w:jc w:val="left"/>
-            </w:pPr>
-            <w:r>
-              <w:t xml:space="preserve">.179</w:t>
-            </w:r>
-          </w:p>
-        </w:tc>
-        <w:tc>
-          <w:tcPr/>
-          <w:p>
-            <w:pPr>
-              <w:pStyle w:val="Compact"/>
-              <w:jc w:val="left"/>
-            </w:pPr>
-            <w:r>
-              <w:t xml:space="preserve">.158</w:t>
+              <w:t xml:space="preserve">.020</w:t>
+            </w:r>
+          </w:p>
+        </w:tc>
+        <w:tc>
+          <w:tcPr/>
+          <w:p>
+            <w:pPr>
+              <w:pStyle w:val="Compact"/>
+              <w:jc w:val="left"/>
+            </w:pPr>
+            <w:r>
+              <w:t xml:space="preserve">.053</w:t>
+            </w:r>
+          </w:p>
+        </w:tc>
+        <w:tc>
+          <w:tcPr/>
+          <w:p>
+            <w:pPr>
+              <w:pStyle w:val="Compact"/>
+              <w:jc w:val="left"/>
+            </w:pPr>
+            <w:r>
+              <w:t xml:space="preserve">.054</w:t>
             </w:r>
           </w:p>
         </w:tc>
@@ -4083,31 +4177,31 @@
               <w:jc w:val="left"/>
             </w:pPr>
             <w:r>
-              <w:t xml:space="preserve">28.4***</w:t>
-            </w:r>
-          </w:p>
-        </w:tc>
-        <w:tc>
-          <w:tcPr/>
-          <w:p>
-            <w:pPr>
-              <w:pStyle w:val="Compact"/>
-              <w:jc w:val="left"/>
-            </w:pPr>
-            <w:r>
-              <w:t xml:space="preserve">22.7***</w:t>
-            </w:r>
-          </w:p>
-        </w:tc>
-        <w:tc>
-          <w:tcPr/>
-          <w:p>
-            <w:pPr>
-              <w:pStyle w:val="Compact"/>
-              <w:jc w:val="left"/>
-            </w:pPr>
-            <w:r>
-              <w:t xml:space="preserve">48.3***</w:t>
+              <w:t xml:space="preserve">8.8***</w:t>
+            </w:r>
+          </w:p>
+        </w:tc>
+        <w:tc>
+          <w:tcPr/>
+          <w:p>
+            <w:pPr>
+              <w:pStyle w:val="Compact"/>
+              <w:jc w:val="left"/>
+            </w:pPr>
+            <w:r>
+              <w:t xml:space="preserve">24.4***</w:t>
+            </w:r>
+          </w:p>
+        </w:tc>
+        <w:tc>
+          <w:tcPr/>
+          <w:p>
+            <w:pPr>
+              <w:pStyle w:val="Compact"/>
+              <w:jc w:val="left"/>
+            </w:pPr>
+            <w:r>
+              <w:t xml:space="preserve">47.4***</w:t>
             </w:r>
           </w:p>
         </w:tc>
@@ -4172,7 +4266,7 @@
       </w:r>
     </w:p>
     <w:bookmarkEnd w:id="32"/>
-    <w:bookmarkStart w:id="33" w:name="Xfe3c331420c241aa73c6296372277a6d3f913cb"/>
+    <w:bookmarkStart w:id="33" w:name="predicted-ip-curves"/>
     <w:p>
       <w:pPr>
         <w:pStyle w:val="Heading3"/>
@@ -4270,7 +4364,7 @@
       </w:r>
     </w:p>
     <w:bookmarkEnd w:id="33"/>
-    <w:bookmarkStart w:id="34" w:name="X86f6006676d1e9a822b51b562b1655386d9e86b"/>
+    <w:bookmarkStart w:id="34" w:name="capability-moderation"/>
     <w:p>
       <w:pPr>
         <w:pStyle w:val="Heading3"/>
@@ -4382,15 +4476,15 @@
     <w:tbl>
       <w:tblPr>
         <w:tblStyle w:val="Table"/>
-        <w:tblW w:type="auto" w:w="0"/>
+        <w:tblW w:type="pct" w:w="5000"/>
         <w:tblLook w:firstRow="1" w:lastRow="0" w:firstColumn="0" w:lastColumn="0" w:noHBand="0" w:noVBand="0" w:val="0020"/>
         <w:jc w:val="start"/>
       </w:tblPr>
       <w:tblGrid>
-        <w:gridCol w:w="1980"/>
-        <w:gridCol w:w="1980"/>
-        <w:gridCol w:w="1980"/>
-        <w:gridCol w:w="1980"/>
+        <w:gridCol w:w="4601"/>
+        <w:gridCol w:w="1508"/>
+        <w:gridCol w:w="754"/>
+        <w:gridCol w:w="1056"/>
       </w:tblGrid>
       <w:tr>
         <w:trPr>
@@ -5209,7 +5303,7 @@
       </w:r>
     </w:p>
     <w:bookmarkEnd w:id="34"/>
-    <w:bookmarkStart w:id="35" w:name="Xdf31b4a83ae47f030a08265332b3138989411fc"/>
+    <w:bookmarkStart w:id="35" w:name="mechanism-analysis-digital-adoption"/>
     <w:p>
       <w:pPr>
         <w:pStyle w:val="Heading3"/>
@@ -5283,7 +5377,25 @@
         <w:t xml:space="preserve"> </w:t>
       </w:r>
       <w:r>
-        <w:t xml:space="preserve">reported as a "descriptive mechanism sketch" rather than a causal</w:t>
+        <w:t xml:space="preserve">reported as a</w:t>
+      </w:r>
+      <w:r>
+        <w:t xml:space="preserve"> </w:t>
+      </w:r>
+      <w:r>
+        <w:t xml:space="preserve">“</w:t>
+      </w:r>
+      <w:r>
+        <w:t xml:space="preserve">descriptive mechanism sketch</w:t>
+      </w:r>
+      <w:r>
+        <w:t xml:space="preserve">”</w:t>
+      </w:r>
+      <w:r>
+        <w:t xml:space="preserve"> </w:t>
+      </w:r>
+      <w:r>
+        <w:t xml:space="preserve">rather than a causal</w:t>
       </w:r>
       <w:r>
         <w:t xml:space="preserve"> </w:t>
@@ -5293,7 +5405,7 @@
       </w:r>
     </w:p>
     <w:bookmarkEnd w:id="35"/>
-    <w:bookmarkStart w:id="36" w:name="X7b68f907ed55e65a2ee44288bf21fafeaedb955"/>
+    <w:bookmarkStart w:id="36" w:name="robustness-checks"/>
     <w:p>
       <w:pPr>
         <w:pStyle w:val="Heading3"/>
@@ -5496,7 +5608,7 @@
     </w:p>
     <w:bookmarkEnd w:id="36"/>
     <w:bookmarkEnd w:id="37"/>
-    <w:bookmarkStart w:id="43" w:name="X735612638e4e736e4693e459c258977262c0dfc"/>
+    <w:bookmarkStart w:id="43" w:name="discussion"/>
     <w:p>
       <w:pPr>
         <w:pStyle w:val="Heading2"/>
@@ -5505,7 +5617,7 @@
         <w:t xml:space="preserve">5. Discussion</w:t>
       </w:r>
     </w:p>
-    <w:bookmarkStart w:id="38" w:name="Xa0c03496b4c04a1649263a3e01d0b00bd039955"/>
+    <w:bookmarkStart w:id="38" w:name="temporal-stability-of-the-ip-threshold"/>
     <w:p>
       <w:pPr>
         <w:pStyle w:val="Heading3"/>
@@ -5567,7 +5679,7 @@
         <w:t xml:space="preserve"> </w:t>
       </w:r>
       <w:r>
-        <w:t xml:space="preserve">(2007) meta-analytic evidence and Marano et al. (2016) institutional</w:t>
+        <w:t xml:space="preserve">(2007) meta-analytic evidence and Marano et al. (2016) institutional</w:t>
       </w:r>
       <w:r>
         <w:t xml:space="preserve"> </w:t>
@@ -5633,7 +5745,7 @@
       </w:r>
     </w:p>
     <w:bookmarkEnd w:id="38"/>
-    <w:bookmarkStart w:id="39" w:name="X662147d669ae611953db259d7b4d93f76a97e61"/>
+    <w:bookmarkStart w:id="39" w:name="X433fb1e034c39d563b08fc3391a6162a4e2331e"/>
     <w:p>
       <w:pPr>
         <w:pStyle w:val="Heading3"/>
@@ -5695,7 +5807,22 @@
         <w:t xml:space="preserve"> </w:t>
       </w:r>
       <w:r>
-        <w:t xml:space="preserve">a curvature-moderator to a "level-shifter": capability elevates</w:t>
+        <w:t xml:space="preserve">a curvature-moderator to a</w:t>
+      </w:r>
+      <w:r>
+        <w:t xml:space="preserve"> </w:t>
+      </w:r>
+      <w:r>
+        <w:t xml:space="preserve">“</w:t>
+      </w:r>
+      <w:r>
+        <w:t xml:space="preserve">level-shifter</w:t>
+      </w:r>
+      <w:r>
+        <w:t xml:space="preserve">”</w:t>
+      </w:r>
+      <w:r>
+        <w:t xml:space="preserve">: capability elevates</w:t>
       </w:r>
       <w:r>
         <w:t xml:space="preserve"> </w:t>
@@ -5739,7 +5866,7 @@
         <w:pStyle w:val="BodyText"/>
       </w:pPr>
       <w:r>
-        <w:t xml:space="preserve">This finding is consistent with Avenyo et al. (2021), who find that</w:t>
+        <w:t xml:space="preserve">This finding is consistent with Avenyo et al. (2021), who find that</w:t>
       </w:r>
       <w:r>
         <w:t xml:space="preserve"> </w:t>
@@ -5841,7 +5968,7 @@
       </w:r>
     </w:p>
     <w:bookmarkEnd w:id="39"/>
-    <w:bookmarkStart w:id="40" w:name="Xeab358fda242154d2e818677c8845f988021d48"/>
+    <w:bookmarkStart w:id="40" w:name="digital-adoption-as-baseline-control"/>
     <w:p>
       <w:pPr>
         <w:pStyle w:val="Heading3"/>
@@ -5919,7 +6046,7 @@
       </w:r>
     </w:p>
     <w:bookmarkEnd w:id="40"/>
-    <w:bookmarkStart w:id="41" w:name="X47b33dbf897054d79ce3d759da46f0a1ef21be8"/>
+    <w:bookmarkStart w:id="41" w:name="limitations"/>
     <w:p>
       <w:pPr>
         <w:pStyle w:val="Heading3"/>
@@ -6045,7 +6172,7 @@
       </w:r>
     </w:p>
     <w:bookmarkEnd w:id="41"/>
-    <w:bookmarkStart w:id="42" w:name="X6239b91c09f491af0efd332004cb71e9de7a16c"/>
+    <w:bookmarkStart w:id="42" w:name="future-research"/>
     <w:p>
       <w:pPr>
         <w:pStyle w:val="Heading3"/>
@@ -6136,7 +6263,7 @@
     </w:p>
     <w:bookmarkEnd w:id="42"/>
     <w:bookmarkEnd w:id="43"/>
-    <w:bookmarkStart w:id="44" w:name="X6b297cc947e0db5526be369b1f0f4ddc67b2415"/>
+    <w:bookmarkStart w:id="44" w:name="conclusion"/>
     <w:p>
       <w:pPr>
         <w:pStyle w:val="Heading2"/>
@@ -6264,14 +6391,12 @@
         <w:t xml:space="preserve"> </w:t>
       </w:r>
       <w:hyperlink r:id="rId45">
-        <w:hyperlink r:id="rId45">
-          <w:r>
-            <w:rPr>
-              <w:rStyle w:val="Hyperlink"/>
-            </w:rPr>
-            <w:t xml:space="preserve">www.enterprisesurveys.org</w:t>
-          </w:r>
-        </w:hyperlink>
+        <w:r>
+          <w:rPr>
+            <w:rStyle w:val="Hyperlink"/>
+          </w:rPr>
+          <w:t xml:space="preserve">www.enterprisesurveys.org</w:t>
+        </w:r>
       </w:hyperlink>
       <w:r>
         <w:t xml:space="preserve">. We thank</w:t>
@@ -6462,7 +6587,22 @@
         <w:pStyle w:val="FirstParagraph"/>
       </w:pPr>
       <w:r>
-        <w:t xml:space="preserve">Antonakis, J., Bendahan, S., Jacquart, P. and Lalive, R. (2010), "On making causal claims: A review and recommendations",</w:t>
+        <w:t xml:space="preserve">Antonakis, J., Bendahan, S., Jacquart, P. and Lalive, R. (2010),</w:t>
+      </w:r>
+      <w:r>
+        <w:t xml:space="preserve"> </w:t>
+      </w:r>
+      <w:r>
+        <w:t xml:space="preserve">“</w:t>
+      </w:r>
+      <w:r>
+        <w:t xml:space="preserve">On making causal claims: A review and recommendations</w:t>
+      </w:r>
+      <w:r>
+        <w:t xml:space="preserve">”</w:t>
+      </w:r>
+      <w:r>
+        <w:t xml:space="preserve">,</w:t>
       </w:r>
       <w:r>
         <w:t xml:space="preserve"> </w:t>
@@ -6475,7 +6615,7 @@
         <w:t xml:space="preserve">The Leadership Quarterly</w:t>
       </w:r>
       <w:r>
-        <w:t xml:space="preserve">, Vol. 21 No. 6, pp. 1086-1120, doi: 10.1016/j.leaqua.2010.10.010.</w:t>
+        <w:t xml:space="preserve">, Vol. 21 No. 6, pp. 1086-1120, doi: 10.1016/j.leaqua.2010.10.010.</w:t>
       </w:r>
     </w:p>
     <w:p>
@@ -6483,7 +6623,22 @@
         <w:pStyle w:val="BodyText"/>
       </w:pPr>
       <w:r>
-        <w:t xml:space="preserve">Avenyo, E.K., Tregenna, F. and Kraemer-Mbula, E. (2021), "Do productive capabilities affect export performance? Evidence from African firms",</w:t>
+        <w:t xml:space="preserve">Avenyo, E.K., Tregenna, F. and Kraemer-Mbula, E. (2021),</w:t>
+      </w:r>
+      <w:r>
+        <w:t xml:space="preserve"> </w:t>
+      </w:r>
+      <w:r>
+        <w:t xml:space="preserve">“</w:t>
+      </w:r>
+      <w:r>
+        <w:t xml:space="preserve">Do productive capabilities affect export performance? Evidence from African firms</w:t>
+      </w:r>
+      <w:r>
+        <w:t xml:space="preserve">”</w:t>
+      </w:r>
+      <w:r>
+        <w:t xml:space="preserve">,</w:t>
       </w:r>
       <w:r>
         <w:t xml:space="preserve"> </w:t>
@@ -6496,7 +6651,7 @@
         <w:t xml:space="preserve">European Journal of Development Research</w:t>
       </w:r>
       <w:r>
-        <w:t xml:space="preserve">, Vol. 33 No. 2, pp. 304-329, doi: 10.1057/s41287-021-00364-6.</w:t>
+        <w:t xml:space="preserve">, Vol. 33 No. 2, pp. 304-329, doi: 10.1057/s41287-021-00364-6.</w:t>
       </w:r>
     </w:p>
     <w:p>
@@ -6504,7 +6659,22 @@
         <w:pStyle w:val="BodyText"/>
       </w:pPr>
       <w:r>
-        <w:t xml:space="preserve">Bausch, A. and Krist, M. (2007), "The effect of context-related moderators on the internationalization–performance relationship: A meta-analysis",</w:t>
+        <w:t xml:space="preserve">Bausch, A. and Krist, M. (2007),</w:t>
+      </w:r>
+      <w:r>
+        <w:t xml:space="preserve"> </w:t>
+      </w:r>
+      <w:r>
+        <w:t xml:space="preserve">“</w:t>
+      </w:r>
+      <w:r>
+        <w:t xml:space="preserve">The effect of context-related moderators on the internationalization–performance relationship: A meta-analysis</w:t>
+      </w:r>
+      <w:r>
+        <w:t xml:space="preserve">”</w:t>
+      </w:r>
+      <w:r>
+        <w:t xml:space="preserve">,</w:t>
       </w:r>
       <w:r>
         <w:t xml:space="preserve"> </w:t>
@@ -6517,7 +6687,7 @@
         <w:t xml:space="preserve">Management International Review</w:t>
       </w:r>
       <w:r>
-        <w:t xml:space="preserve">, Vol. 47 No. 3, pp. 423-452, doi: 10.1007/s11575-007-0022-4.</w:t>
+        <w:t xml:space="preserve">, Vol. 47 No. 3, pp. 423-452, doi: 10.1007/s11575-007-0022-4.</w:t>
       </w:r>
     </w:p>
     <w:p>
@@ -6525,15 +6695,22 @@
         <w:pStyle w:val="BodyText"/>
       </w:pPr>
       <w:r>
-        <w:t xml:space="preserve">Authors (2026), details omitted for double-blind review.</w:t>
-      </w:r>
-    </w:p>
-    <w:p>
-      <w:pPr>
-        <w:pStyle w:val="BodyText"/>
-      </w:pPr>
-      <w:r>
-        <w:t xml:space="preserve">Haans, R.F.J., Pieters, C. and He, Z.-L. (2016), "Thinking about U: Theorizing and testing U- and inverted U-shaped relationships in strategy research",</w:t>
+        <w:t xml:space="preserve">Coltman, T., Devinney, T.M., Midgley, D.F. and Venaik, S. (2008),</w:t>
+      </w:r>
+      <w:r>
+        <w:t xml:space="preserve"> </w:t>
+      </w:r>
+      <w:r>
+        <w:t xml:space="preserve">“</w:t>
+      </w:r>
+      <w:r>
+        <w:t xml:space="preserve">Formative versus reflective measurement models: Two applications of formative measurement</w:t>
+      </w:r>
+      <w:r>
+        <w:t xml:space="preserve">”</w:t>
+      </w:r>
+      <w:r>
+        <w:t xml:space="preserve">,</w:t>
       </w:r>
       <w:r>
         <w:t xml:space="preserve"> </w:t>
@@ -6543,10 +6720,10 @@
           <w:iCs/>
           <w:i/>
         </w:rPr>
-        <w:t xml:space="preserve">Strategic Management Journal</w:t>
-      </w:r>
-      <w:r>
-        <w:t xml:space="preserve">, Vol. 37 No. 7, pp. 1177-1195, doi: 10.1002/smj.2399.</w:t>
+        <w:t xml:space="preserve">Journal of Business Research</w:t>
+      </w:r>
+      <w:r>
+        <w:t xml:space="preserve">, Vol. 61 No. 12, pp. 1250-1262, doi: 10.1016/j.jbusres.2008.01.013.</w:t>
       </w:r>
     </w:p>
     <w:p>
@@ -6554,7 +6731,30 @@
         <w:pStyle w:val="BodyText"/>
       </w:pPr>
       <w:r>
-        <w:t xml:space="preserve">Helpman, E., Melitz, M.J. and Yeaple, S.R. (2004), "Export versus FDI with heterogeneous firms",</w:t>
+        <w:t xml:space="preserve">Authors (2026), details omitted for double-blind review.</w:t>
+      </w:r>
+    </w:p>
+    <w:p>
+      <w:pPr>
+        <w:pStyle w:val="BodyText"/>
+      </w:pPr>
+      <w:r>
+        <w:t xml:space="preserve">Haans, R.F.J., Pieters, C. and He, Z.-L. (2016),</w:t>
+      </w:r>
+      <w:r>
+        <w:t xml:space="preserve"> </w:t>
+      </w:r>
+      <w:r>
+        <w:t xml:space="preserve">“</w:t>
+      </w:r>
+      <w:r>
+        <w:t xml:space="preserve">Thinking about U: Theorizing and testing U- and inverted U-shaped relationships in strategy research</w:t>
+      </w:r>
+      <w:r>
+        <w:t xml:space="preserve">”</w:t>
+      </w:r>
+      <w:r>
+        <w:t xml:space="preserve">,</w:t>
       </w:r>
       <w:r>
         <w:t xml:space="preserve"> </w:t>
@@ -6564,10 +6764,10 @@
           <w:iCs/>
           <w:i/>
         </w:rPr>
-        <w:t xml:space="preserve">American Economic Review</w:t>
-      </w:r>
-      <w:r>
-        <w:t xml:space="preserve">, Vol. 94 No. 1, pp. 300-316, doi: 10.1257/000282804322970814.</w:t>
+        <w:t xml:space="preserve">Strategic Management Journal</w:t>
+      </w:r>
+      <w:r>
+        <w:t xml:space="preserve">, Vol. 37 No. 7, pp. 1177-1195, doi: 10.1002/smj.2399.</w:t>
       </w:r>
     </w:p>
     <w:p>
@@ -6575,7 +6775,22 @@
         <w:pStyle w:val="BodyText"/>
       </w:pPr>
       <w:r>
-        <w:t xml:space="preserve">Hitt, M.A., Hoskisson, R.E. and Kim, H. (1997), "International diversification: Effects on innovation and firm performance in product-diversified firms",</w:t>
+        <w:t xml:space="preserve">Helpman, E., Melitz, M.J. and Yeaple, S.R. (2004),</w:t>
+      </w:r>
+      <w:r>
+        <w:t xml:space="preserve"> </w:t>
+      </w:r>
+      <w:r>
+        <w:t xml:space="preserve">“</w:t>
+      </w:r>
+      <w:r>
+        <w:t xml:space="preserve">Export versus FDI with heterogeneous firms</w:t>
+      </w:r>
+      <w:r>
+        <w:t xml:space="preserve">”</w:t>
+      </w:r>
+      <w:r>
+        <w:t xml:space="preserve">,</w:t>
       </w:r>
       <w:r>
         <w:t xml:space="preserve"> </w:t>
@@ -6585,10 +6800,10 @@
           <w:iCs/>
           <w:i/>
         </w:rPr>
-        <w:t xml:space="preserve">Academy of Management Journal</w:t>
-      </w:r>
-      <w:r>
-        <w:t xml:space="preserve">, Vol. 40 No. 4, pp. 767-798, doi: 10.5465/256948.</w:t>
+        <w:t xml:space="preserve">American Economic Review</w:t>
+      </w:r>
+      <w:r>
+        <w:t xml:space="preserve">, Vol. 94 No. 1, pp. 300-316, doi: 10.1257/000282804322970814.</w:t>
       </w:r>
     </w:p>
     <w:p>
@@ -6596,7 +6811,22 @@
         <w:pStyle w:val="BodyText"/>
       </w:pPr>
       <w:r>
-        <w:t xml:space="preserve">Johanson, J. and Vahlne, J.-E. (1977), "The internationalization process of the firm: A model of knowledge development and increasing foreign market commitments",</w:t>
+        <w:t xml:space="preserve">Hitt, M.A., Hoskisson, R.E. and Kim, H. (1997),</w:t>
+      </w:r>
+      <w:r>
+        <w:t xml:space="preserve"> </w:t>
+      </w:r>
+      <w:r>
+        <w:t xml:space="preserve">“</w:t>
+      </w:r>
+      <w:r>
+        <w:t xml:space="preserve">International diversification: Effects on innovation and firm performance in product-diversified firms</w:t>
+      </w:r>
+      <w:r>
+        <w:t xml:space="preserve">”</w:t>
+      </w:r>
+      <w:r>
+        <w:t xml:space="preserve">,</w:t>
       </w:r>
       <w:r>
         <w:t xml:space="preserve"> </w:t>
@@ -6606,10 +6836,10 @@
           <w:iCs/>
           <w:i/>
         </w:rPr>
-        <w:t xml:space="preserve">Journal of International Business Studies</w:t>
-      </w:r>
-      <w:r>
-        <w:t xml:space="preserve">, Vol. 8 No. 1, pp. 23-32, doi: 10.1057/palgrave.jibs.8490676.</w:t>
+        <w:t xml:space="preserve">Academy of Management Journal</w:t>
+      </w:r>
+      <w:r>
+        <w:t xml:space="preserve">, Vol. 40 No. 4, pp. 767-798, doi: 10.5465/256948.</w:t>
       </w:r>
     </w:p>
     <w:p>
@@ -6617,7 +6847,22 @@
         <w:pStyle w:val="BodyText"/>
       </w:pPr>
       <w:r>
-        <w:t xml:space="preserve">Kano, L., Tsang, E.W.K. and Yeung, H.W.-C. (2020), "Global value chains: A review of the multi-disciplinary literature",</w:t>
+        <w:t xml:space="preserve">Johanson, J. and Vahlne, J.-E. (1977),</w:t>
+      </w:r>
+      <w:r>
+        <w:t xml:space="preserve"> </w:t>
+      </w:r>
+      <w:r>
+        <w:t xml:space="preserve">“</w:t>
+      </w:r>
+      <w:r>
+        <w:t xml:space="preserve">The internationalization process of the firm: A model of knowledge development and increasing foreign market commitments</w:t>
+      </w:r>
+      <w:r>
+        <w:t xml:space="preserve">”</w:t>
+      </w:r>
+      <w:r>
+        <w:t xml:space="preserve">,</w:t>
       </w:r>
       <w:r>
         <w:t xml:space="preserve"> </w:t>
@@ -6630,7 +6875,7 @@
         <w:t xml:space="preserve">Journal of International Business Studies</w:t>
       </w:r>
       <w:r>
-        <w:t xml:space="preserve">, Vol. 51 No. 4, pp. 577-622, doi: 10.1057/s41267-020-00304-2.</w:t>
+        <w:t xml:space="preserve">, Vol. 8 No. 1, pp. 23-32, doi: 10.1057/palgrave.jibs.8490676.</w:t>
       </w:r>
     </w:p>
     <w:p>
@@ -6638,7 +6883,22 @@
         <w:pStyle w:val="BodyText"/>
       </w:pPr>
       <w:r>
-        <w:t xml:space="preserve">Kirca, A.H., Roth, K., Hult, G.T.M. and Cavusgil, S.T. (2012), "The role of context in the multinationality–performance relationship: A meta-analytic review",</w:t>
+        <w:t xml:space="preserve">Kano, L., Tsang, E.W.K. and Yeung, H.W.-C. (2020),</w:t>
+      </w:r>
+      <w:r>
+        <w:t xml:space="preserve"> </w:t>
+      </w:r>
+      <w:r>
+        <w:t xml:space="preserve">“</w:t>
+      </w:r>
+      <w:r>
+        <w:t xml:space="preserve">Global value chains: A review of the multi-disciplinary literature</w:t>
+      </w:r>
+      <w:r>
+        <w:t xml:space="preserve">”</w:t>
+      </w:r>
+      <w:r>
+        <w:t xml:space="preserve">,</w:t>
       </w:r>
       <w:r>
         <w:t xml:space="preserve"> </w:t>
@@ -6648,10 +6908,10 @@
           <w:iCs/>
           <w:i/>
         </w:rPr>
-        <w:t xml:space="preserve">Global Strategy Journal</w:t>
-      </w:r>
-      <w:r>
-        <w:t xml:space="preserve">, Vol. 2 No. 2, pp. 108-121, doi: 10.1111/j.2042-5805.2012.01028.x.</w:t>
+        <w:t xml:space="preserve">Journal of International Business Studies</w:t>
+      </w:r>
+      <w:r>
+        <w:t xml:space="preserve">, Vol. 51 No. 4, pp. 577-622, doi: 10.1057/s41267-020-00304-2.</w:t>
       </w:r>
     </w:p>
     <w:p>
@@ -6659,7 +6919,22 @@
         <w:pStyle w:val="BodyText"/>
       </w:pPr>
       <w:r>
-        <w:t xml:space="preserve">Lall, S. (1992), "Technological capabilities and industrialization",</w:t>
+        <w:t xml:space="preserve">Kirca, A.H., Roth, K., Hult, G.T.M. and Cavusgil, S.T. (2012),</w:t>
+      </w:r>
+      <w:r>
+        <w:t xml:space="preserve"> </w:t>
+      </w:r>
+      <w:r>
+        <w:t xml:space="preserve">“</w:t>
+      </w:r>
+      <w:r>
+        <w:t xml:space="preserve">The role of context in the multinationality–performance relationship: A meta-analytic review</w:t>
+      </w:r>
+      <w:r>
+        <w:t xml:space="preserve">”</w:t>
+      </w:r>
+      <w:r>
+        <w:t xml:space="preserve">,</w:t>
       </w:r>
       <w:r>
         <w:t xml:space="preserve"> </w:t>
@@ -6669,10 +6944,10 @@
           <w:iCs/>
           <w:i/>
         </w:rPr>
-        <w:t xml:space="preserve">World Development</w:t>
-      </w:r>
-      <w:r>
-        <w:t xml:space="preserve">, Vol. 20 No. 2, pp. 165-186, doi: 10.1016/0305-750X(92)90097-F.</w:t>
+        <w:t xml:space="preserve">Global Strategy Journal</w:t>
+      </w:r>
+      <w:r>
+        <w:t xml:space="preserve">, Vol. 2 No. 2, pp. 108-121, doi: 10.1111/j.2042-5805.2012.01028.x.</w:t>
       </w:r>
     </w:p>
     <w:p>
@@ -6680,7 +6955,22 @@
         <w:pStyle w:val="BodyText"/>
       </w:pPr>
       <w:r>
-        <w:t xml:space="preserve">Lind, J.T. and Mehlum, H. (2010), "With or without U? The appropriate test for a U-shaped relationship",</w:t>
+        <w:t xml:space="preserve">Lall, S. (1992),</w:t>
+      </w:r>
+      <w:r>
+        <w:t xml:space="preserve"> </w:t>
+      </w:r>
+      <w:r>
+        <w:t xml:space="preserve">“</w:t>
+      </w:r>
+      <w:r>
+        <w:t xml:space="preserve">Technological capabilities and industrialization</w:t>
+      </w:r>
+      <w:r>
+        <w:t xml:space="preserve">”</w:t>
+      </w:r>
+      <w:r>
+        <w:t xml:space="preserve">,</w:t>
       </w:r>
       <w:r>
         <w:t xml:space="preserve"> </w:t>
@@ -6690,10 +6980,10 @@
           <w:iCs/>
           <w:i/>
         </w:rPr>
-        <w:t xml:space="preserve">Oxford Bulletin of Economics and Statistics</w:t>
-      </w:r>
-      <w:r>
-        <w:t xml:space="preserve">, Vol. 72 No. 1, pp. 109-118, doi: 10.1111/j.1468-0084.2009.00569.x.</w:t>
+        <w:t xml:space="preserve">World Development</w:t>
+      </w:r>
+      <w:r>
+        <w:t xml:space="preserve">, Vol. 20 No. 2, pp. 165-186, doi: 10.1016/0305-750X(92)90097-F.</w:t>
       </w:r>
     </w:p>
     <w:p>
@@ -6701,7 +6991,22 @@
         <w:pStyle w:val="BodyText"/>
       </w:pPr>
       <w:r>
-        <w:t xml:space="preserve">Lu, J.W. and Beamish, P.W. (2004), "International diversification and firm performance: The S-curve hypothesis",</w:t>
+        <w:t xml:space="preserve">Lind, J.T. and Mehlum, H. (2010),</w:t>
+      </w:r>
+      <w:r>
+        <w:t xml:space="preserve"> </w:t>
+      </w:r>
+      <w:r>
+        <w:t xml:space="preserve">“</w:t>
+      </w:r>
+      <w:r>
+        <w:t xml:space="preserve">With or without U? The appropriate test for a U-shaped relationship</w:t>
+      </w:r>
+      <w:r>
+        <w:t xml:space="preserve">”</w:t>
+      </w:r>
+      <w:r>
+        <w:t xml:space="preserve">,</w:t>
       </w:r>
       <w:r>
         <w:t xml:space="preserve"> </w:t>
@@ -6711,10 +7016,10 @@
           <w:iCs/>
           <w:i/>
         </w:rPr>
-        <w:t xml:space="preserve">Academy of Management Journal</w:t>
-      </w:r>
-      <w:r>
-        <w:t xml:space="preserve">, Vol. 47 No. 4, pp. 598-609, doi: 10.5465/20159604.</w:t>
+        <w:t xml:space="preserve">Oxford Bulletin of Economics and Statistics</w:t>
+      </w:r>
+      <w:r>
+        <w:t xml:space="preserve">, Vol. 72 No. 1, pp. 109-118, doi: 10.1111/j.1468-0084.2009.00569.x.</w:t>
       </w:r>
     </w:p>
     <w:p>
@@ -6722,7 +7027,22 @@
         <w:pStyle w:val="BodyText"/>
       </w:pPr>
       <w:r>
-        <w:t xml:space="preserve">MacKinnon, J.G. and White, H. (1985), "Some heteroskedasticity-consistent covariance matrix estimators with improved finite sample properties",</w:t>
+        <w:t xml:space="preserve">Lu, J.W. and Beamish, P.W. (2004),</w:t>
+      </w:r>
+      <w:r>
+        <w:t xml:space="preserve"> </w:t>
+      </w:r>
+      <w:r>
+        <w:t xml:space="preserve">“</w:t>
+      </w:r>
+      <w:r>
+        <w:t xml:space="preserve">International diversification and firm performance: The S-curve hypothesis</w:t>
+      </w:r>
+      <w:r>
+        <w:t xml:space="preserve">”</w:t>
+      </w:r>
+      <w:r>
+        <w:t xml:space="preserve">,</w:t>
       </w:r>
       <w:r>
         <w:t xml:space="preserve"> </w:t>
@@ -6732,10 +7052,10 @@
           <w:iCs/>
           <w:i/>
         </w:rPr>
-        <w:t xml:space="preserve">Journal of Econometrics</w:t>
-      </w:r>
-      <w:r>
-        <w:t xml:space="preserve">, Vol. 29 No. 3, pp. 305-325, doi: 10.1016/0304-4076(85)90158-7.</w:t>
+        <w:t xml:space="preserve">Academy of Management Journal</w:t>
+      </w:r>
+      <w:r>
+        <w:t xml:space="preserve">, Vol. 47 No. 4, pp. 598-609, doi: 10.5465/20159604.</w:t>
       </w:r>
     </w:p>
     <w:p>
@@ -6743,7 +7063,22 @@
         <w:pStyle w:val="BodyText"/>
       </w:pPr>
       <w:r>
-        <w:t xml:space="preserve">Manova, K. (2013), "Credit constraints, heterogeneous firms, and international trade",</w:t>
+        <w:t xml:space="preserve">MacKinnon, J.G. and White, H. (1985),</w:t>
+      </w:r>
+      <w:r>
+        <w:t xml:space="preserve"> </w:t>
+      </w:r>
+      <w:r>
+        <w:t xml:space="preserve">“</w:t>
+      </w:r>
+      <w:r>
+        <w:t xml:space="preserve">Some heteroskedasticity-consistent covariance matrix estimators with improved finite sample properties</w:t>
+      </w:r>
+      <w:r>
+        <w:t xml:space="preserve">”</w:t>
+      </w:r>
+      <w:r>
+        <w:t xml:space="preserve">,</w:t>
       </w:r>
       <w:r>
         <w:t xml:space="preserve"> </w:t>
@@ -6753,10 +7088,10 @@
           <w:iCs/>
           <w:i/>
         </w:rPr>
-        <w:t xml:space="preserve">Review of Economic Studies</w:t>
-      </w:r>
-      <w:r>
-        <w:t xml:space="preserve">, Vol. 80 No. 2, pp. 711-744, doi: 10.1093/restud/rds036.</w:t>
+        <w:t xml:space="preserve">Journal of Econometrics</w:t>
+      </w:r>
+      <w:r>
+        <w:t xml:space="preserve">, Vol. 29 No. 3, pp. 305-325, doi: 10.1016/0304-4076(85)90158-7.</w:t>
       </w:r>
     </w:p>
     <w:p>
@@ -6764,7 +7099,22 @@
         <w:pStyle w:val="BodyText"/>
       </w:pPr>
       <w:r>
-        <w:t xml:space="preserve">Marano, V., Arregle, J.-L., Hitt, M.A., Spadafora, E. and van Essen, M. (2016), "Home country institutions and the internationalization–performance relationship: A meta-analytic review",</w:t>
+        <w:t xml:space="preserve">Manova, K. (2013),</w:t>
+      </w:r>
+      <w:r>
+        <w:t xml:space="preserve"> </w:t>
+      </w:r>
+      <w:r>
+        <w:t xml:space="preserve">“</w:t>
+      </w:r>
+      <w:r>
+        <w:t xml:space="preserve">Credit constraints, heterogeneous firms, and international trade</w:t>
+      </w:r>
+      <w:r>
+        <w:t xml:space="preserve">”</w:t>
+      </w:r>
+      <w:r>
+        <w:t xml:space="preserve">,</w:t>
       </w:r>
       <w:r>
         <w:t xml:space="preserve"> </w:t>
@@ -6774,10 +7124,10 @@
           <w:iCs/>
           <w:i/>
         </w:rPr>
-        <w:t xml:space="preserve">Journal of Management</w:t>
-      </w:r>
-      <w:r>
-        <w:t xml:space="preserve">, Vol. 42 No. 5, pp. 1075-1110, doi: 10.1177/0149206315624963.</w:t>
+        <w:t xml:space="preserve">Review of Economic Studies</w:t>
+      </w:r>
+      <w:r>
+        <w:t xml:space="preserve">, Vol. 80 No. 2, pp. 711-744, doi: 10.1093/restud/rds036.</w:t>
       </w:r>
     </w:p>
     <w:p>
@@ -6785,7 +7135,22 @@
         <w:pStyle w:val="BodyText"/>
       </w:pPr>
       <w:r>
-        <w:t xml:space="preserve">Nambisan, S., Wright, M. and Feldman, M. (2019), "The digital transformation of innovation and entrepreneurship: Progress, challenges and key themes",</w:t>
+        <w:t xml:space="preserve">Marano, V., Arregle, J.-L., Hitt, M.A., Spadafora, E. and van Essen, M. (2016),</w:t>
+      </w:r>
+      <w:r>
+        <w:t xml:space="preserve"> </w:t>
+      </w:r>
+      <w:r>
+        <w:t xml:space="preserve">“</w:t>
+      </w:r>
+      <w:r>
+        <w:t xml:space="preserve">Home country institutions and the internationalization–performance relationship: A meta-analytic review</w:t>
+      </w:r>
+      <w:r>
+        <w:t xml:space="preserve">”</w:t>
+      </w:r>
+      <w:r>
+        <w:t xml:space="preserve">,</w:t>
       </w:r>
       <w:r>
         <w:t xml:space="preserve"> </w:t>
@@ -6795,10 +7160,10 @@
           <w:iCs/>
           <w:i/>
         </w:rPr>
-        <w:t xml:space="preserve">Research Policy</w:t>
-      </w:r>
-      <w:r>
-        <w:t xml:space="preserve">, Vol. 48 No. 8, pp. 103773, doi: 10.1016/j.respol.2019.03.018.</w:t>
+        <w:t xml:space="preserve">Journal of Management</w:t>
+      </w:r>
+      <w:r>
+        <w:t xml:space="preserve">, Vol. 42 No. 5, pp. 1075-1110, doi: 10.1177/0149206315624963.</w:t>
       </w:r>
     </w:p>
     <w:p>
@@ -6806,7 +7171,22 @@
         <w:pStyle w:val="BodyText"/>
       </w:pPr>
       <w:r>
-        <w:t xml:space="preserve">Niepmann, F. and Schmidt-Eisenlohr, T. (2017), "International trade, risk and the role of banks",</w:t>
+        <w:t xml:space="preserve">Nambisan, S., Wright, M. and Feldman, M. (2019),</w:t>
+      </w:r>
+      <w:r>
+        <w:t xml:space="preserve"> </w:t>
+      </w:r>
+      <w:r>
+        <w:t xml:space="preserve">“</w:t>
+      </w:r>
+      <w:r>
+        <w:t xml:space="preserve">The digital transformation of innovation and entrepreneurship: Progress, challenges and key themes</w:t>
+      </w:r>
+      <w:r>
+        <w:t xml:space="preserve">”</w:t>
+      </w:r>
+      <w:r>
+        <w:t xml:space="preserve">,</w:t>
       </w:r>
       <w:r>
         <w:t xml:space="preserve"> </w:t>
@@ -6816,10 +7196,10 @@
           <w:iCs/>
           <w:i/>
         </w:rPr>
-        <w:t xml:space="preserve">Journal of International Economics</w:t>
-      </w:r>
-      <w:r>
-        <w:t xml:space="preserve">, Vol. 107, pp. 111-126, doi: 10.1016/j.jinteco.2017.03.007.</w:t>
+        <w:t xml:space="preserve">Research Policy</w:t>
+      </w:r>
+      <w:r>
+        <w:t xml:space="preserve">, Vol. 48 No. 8, pp. 103773, doi: 10.1016/j.respol.2019.03.018.</w:t>
       </w:r>
     </w:p>
     <w:p>
@@ -6827,7 +7207,22 @@
         <w:pStyle w:val="BodyText"/>
       </w:pPr>
       <w:r>
-        <w:t xml:space="preserve">Paternoster, R., Brame, R., Mazerolle, P. and Piquero, A. (1998), "Using the correct statistical test for the equality of regression coefficients",</w:t>
+        <w:t xml:space="preserve">Niepmann, F. and Schmidt-Eisenlohr, T. (2017),</w:t>
+      </w:r>
+      <w:r>
+        <w:t xml:space="preserve"> </w:t>
+      </w:r>
+      <w:r>
+        <w:t xml:space="preserve">“</w:t>
+      </w:r>
+      <w:r>
+        <w:t xml:space="preserve">International trade, risk and the role of banks</w:t>
+      </w:r>
+      <w:r>
+        <w:t xml:space="preserve">”</w:t>
+      </w:r>
+      <w:r>
+        <w:t xml:space="preserve">,</w:t>
       </w:r>
       <w:r>
         <w:t xml:space="preserve"> </w:t>
@@ -6837,10 +7232,10 @@
           <w:iCs/>
           <w:i/>
         </w:rPr>
-        <w:t xml:space="preserve">Criminology</w:t>
-      </w:r>
-      <w:r>
-        <w:t xml:space="preserve">, Vol. 36 No. 4, pp. 859-866, doi: 10.1111/j.1745-9125.1998.tb01268.x.</w:t>
+        <w:t xml:space="preserve">Journal of International Economics</w:t>
+      </w:r>
+      <w:r>
+        <w:t xml:space="preserve">, Vol. 107, pp. 111-126, doi: 10.1016/j.jinteco.2017.03.007.</w:t>
       </w:r>
     </w:p>
     <w:p>
@@ -6848,7 +7243,22 @@
         <w:pStyle w:val="BodyText"/>
       </w:pPr>
       <w:r>
-        <w:t xml:space="preserve">Pierce, J.R. and Aguinis, H. (2013), "The too-much-of-a-good-thing effect in management",</w:t>
+        <w:t xml:space="preserve">Paternoster, R., Brame, R., Mazerolle, P. and Piquero, A. (1998),</w:t>
+      </w:r>
+      <w:r>
+        <w:t xml:space="preserve"> </w:t>
+      </w:r>
+      <w:r>
+        <w:t xml:space="preserve">“</w:t>
+      </w:r>
+      <w:r>
+        <w:t xml:space="preserve">Using the correct statistical test for the equality of regression coefficients</w:t>
+      </w:r>
+      <w:r>
+        <w:t xml:space="preserve">”</w:t>
+      </w:r>
+      <w:r>
+        <w:t xml:space="preserve">,</w:t>
       </w:r>
       <w:r>
         <w:t xml:space="preserve"> </w:t>
@@ -6858,10 +7268,10 @@
           <w:iCs/>
           <w:i/>
         </w:rPr>
-        <w:t xml:space="preserve">Journal of Management</w:t>
-      </w:r>
-      <w:r>
-        <w:t xml:space="preserve">, Vol. 39 No. 2, pp. 313-338, doi: 10.1177/0149206311410060.</w:t>
+        <w:t xml:space="preserve">Criminology</w:t>
+      </w:r>
+      <w:r>
+        <w:t xml:space="preserve">, Vol. 36 No. 4, pp. 859-866, doi: 10.1111/j.1745-9125.1998.tb01268.x.</w:t>
       </w:r>
     </w:p>
     <w:p>
@@ -6869,7 +7279,22 @@
         <w:pStyle w:val="BodyText"/>
       </w:pPr>
       <w:r>
-        <w:t xml:space="preserve">Schwens, C., Zapkau, F.B., Bierwerth, M., Isidor, R., Knight, G. and Kabst, R. (2018), "International entrepreneurship: A meta-analysis on the internationalization and performance relationship",</w:t>
+        <w:t xml:space="preserve">Pierce, J.R. and Aguinis, H. (2013),</w:t>
+      </w:r>
+      <w:r>
+        <w:t xml:space="preserve"> </w:t>
+      </w:r>
+      <w:r>
+        <w:t xml:space="preserve">“</w:t>
+      </w:r>
+      <w:r>
+        <w:t xml:space="preserve">The too-much-of-a-good-thing effect in management</w:t>
+      </w:r>
+      <w:r>
+        <w:t xml:space="preserve">”</w:t>
+      </w:r>
+      <w:r>
+        <w:t xml:space="preserve">,</w:t>
       </w:r>
       <w:r>
         <w:t xml:space="preserve"> </w:t>
@@ -6879,10 +7304,10 @@
           <w:iCs/>
           <w:i/>
         </w:rPr>
-        <w:t xml:space="preserve">Entrepreneurship Theory and Practice</w:t>
-      </w:r>
-      <w:r>
-        <w:t xml:space="preserve">, Vol. 42 No. 5, pp. 734-768, doi: 10.1177/1042258718795346.</w:t>
+        <w:t xml:space="preserve">Journal of Management</w:t>
+      </w:r>
+      <w:r>
+        <w:t xml:space="preserve">, Vol. 39 No. 2, pp. 313-338, doi: 10.1177/0149206311410060.</w:t>
       </w:r>
     </w:p>
     <w:p>
@@ -6890,7 +7315,22 @@
         <w:pStyle w:val="BodyText"/>
       </w:pPr>
       <w:r>
-        <w:t xml:space="preserve">Shaver, J.M. (2020), "Causal identification through a cumulative body of research in the study of strategy and organizations",</w:t>
+        <w:t xml:space="preserve">Schwens, C., Zapkau, F.B., Bierwerth, M., Isidor, R., Knight, G. and Kabst, R. (2018),</w:t>
+      </w:r>
+      <w:r>
+        <w:t xml:space="preserve"> </w:t>
+      </w:r>
+      <w:r>
+        <w:t xml:space="preserve">“</w:t>
+      </w:r>
+      <w:r>
+        <w:t xml:space="preserve">International entrepreneurship: A meta-analysis on the internationalization and performance relationship</w:t>
+      </w:r>
+      <w:r>
+        <w:t xml:space="preserve">”</w:t>
+      </w:r>
+      <w:r>
+        <w:t xml:space="preserve">,</w:t>
       </w:r>
       <w:r>
         <w:t xml:space="preserve"> </w:t>
@@ -6900,10 +7340,10 @@
           <w:iCs/>
           <w:i/>
         </w:rPr>
-        <w:t xml:space="preserve">Journal of Management</w:t>
-      </w:r>
-      <w:r>
-        <w:t xml:space="preserve">, Vol. 46 No. 7, pp. 1244-1256, doi: 10.1177/0149206319846272.</w:t>
+        <w:t xml:space="preserve">Entrepreneurship Theory and Practice</w:t>
+      </w:r>
+      <w:r>
+        <w:t xml:space="preserve">, Vol. 42 No. 5, pp. 734-768, doi: 10.1177/1042258718795346.</w:t>
       </w:r>
     </w:p>
     <w:p>
@@ -6911,7 +7351,22 @@
         <w:pStyle w:val="BodyText"/>
       </w:pPr>
       <w:r>
-        <w:t xml:space="preserve">Teece, D.J. (2007), "Explicating dynamic capabilities: The nature and microfoundations of (sustainable) enterprise performance",</w:t>
+        <w:t xml:space="preserve">Shaver, J.M. (2020),</w:t>
+      </w:r>
+      <w:r>
+        <w:t xml:space="preserve"> </w:t>
+      </w:r>
+      <w:r>
+        <w:t xml:space="preserve">“</w:t>
+      </w:r>
+      <w:r>
+        <w:t xml:space="preserve">Causal identification through a cumulative body of research in the study of strategy and organizations</w:t>
+      </w:r>
+      <w:r>
+        <w:t xml:space="preserve">”</w:t>
+      </w:r>
+      <w:r>
+        <w:t xml:space="preserve">,</w:t>
       </w:r>
       <w:r>
         <w:t xml:space="preserve"> </w:t>
@@ -6921,10 +7376,10 @@
           <w:iCs/>
           <w:i/>
         </w:rPr>
-        <w:t xml:space="preserve">Strategic Management Journal</w:t>
-      </w:r>
-      <w:r>
-        <w:t xml:space="preserve">, Vol. 28 No. 13, pp. 1319-1350, doi: 10.1002/smj.640.</w:t>
+        <w:t xml:space="preserve">Journal of Management</w:t>
+      </w:r>
+      <w:r>
+        <w:t xml:space="preserve">, Vol. 46 No. 7, pp. 1244-1256, doi: 10.1177/0149206319846272.</w:t>
       </w:r>
     </w:p>
     <w:p>
@@ -6932,7 +7387,22 @@
         <w:pStyle w:val="BodyText"/>
       </w:pPr>
       <w:r>
-        <w:t xml:space="preserve">Verhoef, P.C., Broekhuizen, T., Bart, Y., Bhattacharya, A., Dong, J.Q., Fabian, N. and Haenlein, M. (2021), "Digital transformation: A multidisciplinary reflection and research agenda",</w:t>
+        <w:t xml:space="preserve">Teece, D.J. (2007),</w:t>
+      </w:r>
+      <w:r>
+        <w:t xml:space="preserve"> </w:t>
+      </w:r>
+      <w:r>
+        <w:t xml:space="preserve">“</w:t>
+      </w:r>
+      <w:r>
+        <w:t xml:space="preserve">Explicating dynamic capabilities: The nature and microfoundations of (sustainable) enterprise performance</w:t>
+      </w:r>
+      <w:r>
+        <w:t xml:space="preserve">”</w:t>
+      </w:r>
+      <w:r>
+        <w:t xml:space="preserve">,</w:t>
       </w:r>
       <w:r>
         <w:t xml:space="preserve"> </w:t>
@@ -6942,10 +7412,10 @@
           <w:iCs/>
           <w:i/>
         </w:rPr>
-        <w:t xml:space="preserve">Journal of Business Research</w:t>
-      </w:r>
-      <w:r>
-        <w:t xml:space="preserve">, Vol. 122, pp. 889-901, doi: 10.1016/j.jbusres.2019.09.022.</w:t>
+        <w:t xml:space="preserve">Strategic Management Journal</w:t>
+      </w:r>
+      <w:r>
+        <w:t xml:space="preserve">, Vol. 28 No. 13, pp. 1319-1350, doi: 10.1002/smj.640.</w:t>
       </w:r>
     </w:p>
     <w:p>
@@ -6953,7 +7423,22 @@
         <w:pStyle w:val="BodyText"/>
       </w:pPr>
       <w:r>
-        <w:t xml:space="preserve">Vial, G. (2019), "Understanding digital transformation: A review and a research agenda",</w:t>
+        <w:t xml:space="preserve">Verhoef, P.C., Broekhuizen, T., Bart, Y., Bhattacharya, A., Dong, J.Q., Fabian, N. and Haenlein, M. (2021),</w:t>
+      </w:r>
+      <w:r>
+        <w:t xml:space="preserve"> </w:t>
+      </w:r>
+      <w:r>
+        <w:t xml:space="preserve">“</w:t>
+      </w:r>
+      <w:r>
+        <w:t xml:space="preserve">Digital transformation: A multidisciplinary reflection and research agenda</w:t>
+      </w:r>
+      <w:r>
+        <w:t xml:space="preserve">”</w:t>
+      </w:r>
+      <w:r>
+        <w:t xml:space="preserve">,</w:t>
       </w:r>
       <w:r>
         <w:t xml:space="preserve"> </w:t>
@@ -6963,10 +7448,10 @@
           <w:iCs/>
           <w:i/>
         </w:rPr>
-        <w:t xml:space="preserve">The Journal of Strategic Information Systems</w:t>
-      </w:r>
-      <w:r>
-        <w:t xml:space="preserve">, Vol. 28 No. 2, pp. 118-144, doi: 10.1016/j.jsis.2019.01.003.</w:t>
+        <w:t xml:space="preserve">Journal of Business Research</w:t>
+      </w:r>
+      <w:r>
+        <w:t xml:space="preserve">, Vol. 122, pp. 889-901, doi: 10.1016/j.jbusres.2019.09.022.</w:t>
       </w:r>
     </w:p>
     <w:p>
@@ -6974,7 +7459,22 @@
         <w:pStyle w:val="BodyText"/>
       </w:pPr>
       <w:r>
-        <w:t xml:space="preserve">Volberda, H.W., Khanagha, S., Baden-Fuller, C., Mihalache, O.R. and Birkinshaw, J. (2021), "Strategizing in a digital world: Overcoming cognitive barriers, reconfiguring routines and introducing new organizational forms",</w:t>
+        <w:t xml:space="preserve">Vial, G. (2019),</w:t>
+      </w:r>
+      <w:r>
+        <w:t xml:space="preserve"> </w:t>
+      </w:r>
+      <w:r>
+        <w:t xml:space="preserve">“</w:t>
+      </w:r>
+      <w:r>
+        <w:t xml:space="preserve">Understanding digital transformation: A review and a research agenda</w:t>
+      </w:r>
+      <w:r>
+        <w:t xml:space="preserve">”</w:t>
+      </w:r>
+      <w:r>
+        <w:t xml:space="preserve">,</w:t>
       </w:r>
       <w:r>
         <w:t xml:space="preserve"> </w:t>
@@ -6984,10 +7484,10 @@
           <w:iCs/>
           <w:i/>
         </w:rPr>
-        <w:t xml:space="preserve">Long Range Planning</w:t>
-      </w:r>
-      <w:r>
-        <w:t xml:space="preserve">, Vol. 54 No. 5, pp. 102110, doi: 10.1016/j.lrp.2021.102110.</w:t>
+        <w:t xml:space="preserve">The Journal of Strategic Information Systems</w:t>
+      </w:r>
+      <w:r>
+        <w:t xml:space="preserve">, Vol. 28 No. 2, pp. 118-144, doi: 10.1016/j.jsis.2019.01.003.</w:t>
       </w:r>
     </w:p>
     <w:p>
@@ -6995,7 +7495,22 @@
         <w:pStyle w:val="BodyText"/>
       </w:pPr>
       <w:r>
-        <w:t xml:space="preserve">Wagner, J. (2007), "Exports and productivity: A survey of the evidence from firm-level data",</w:t>
+        <w:t xml:space="preserve">Volberda, H.W., Khanagha, S., Baden-Fuller, C., Mihalache, O.R. and Birkinshaw, J. (2021),</w:t>
+      </w:r>
+      <w:r>
+        <w:t xml:space="preserve"> </w:t>
+      </w:r>
+      <w:r>
+        <w:t xml:space="preserve">“</w:t>
+      </w:r>
+      <w:r>
+        <w:t xml:space="preserve">Strategizing in a digital world: Overcoming cognitive barriers, reconfiguring routines and introducing new organizational forms</w:t>
+      </w:r>
+      <w:r>
+        <w:t xml:space="preserve">”</w:t>
+      </w:r>
+      <w:r>
+        <w:t xml:space="preserve">,</w:t>
       </w:r>
       <w:r>
         <w:t xml:space="preserve"> </w:t>
@@ -7005,10 +7520,10 @@
           <w:iCs/>
           <w:i/>
         </w:rPr>
-        <w:t xml:space="preserve">The World Economy</w:t>
-      </w:r>
-      <w:r>
-        <w:t xml:space="preserve">, Vol. 30 No. 1, pp. 60-82, doi: 10.1111/j.1467-9701.2007.00872.x.</w:t>
+        <w:t xml:space="preserve">Long Range Planning</w:t>
+      </w:r>
+      <w:r>
+        <w:t xml:space="preserve">, Vol. 54 No. 5, pp. 102110, doi: 10.1016/j.lrp.2021.102110.</w:t>
       </w:r>
     </w:p>
     <w:p>
@@ -7016,7 +7531,22 @@
         <w:pStyle w:val="BodyText"/>
       </w:pPr>
       <w:r>
-        <w:t xml:space="preserve">World Bank (2013),</w:t>
+        <w:t xml:space="preserve">Wagner, J. (2007),</w:t>
+      </w:r>
+      <w:r>
+        <w:t xml:space="preserve"> </w:t>
+      </w:r>
+      <w:r>
+        <w:t xml:space="preserve">“</w:t>
+      </w:r>
+      <w:r>
+        <w:t xml:space="preserve">Exports and productivity: A survey of the evidence from firm-level data</w:t>
+      </w:r>
+      <w:r>
+        <w:t xml:space="preserve">”</w:t>
+      </w:r>
+      <w:r>
+        <w:t xml:space="preserve">,</w:t>
       </w:r>
       <w:r>
         <w:t xml:space="preserve"> </w:t>
@@ -7026,27 +7556,10 @@
           <w:iCs/>
           <w:i/>
         </w:rPr>
-        <w:t xml:space="preserve">China Enterprise Survey 2012</w:t>
-      </w:r>
-      <w:r>
-        <w:t xml:space="preserve"> </w:t>
-      </w:r>
-      <w:r>
-        <w:t xml:space="preserve">[Data file], World Bank Enterprise Surveys, available at:</w:t>
-      </w:r>
-      <w:r>
-        <w:t xml:space="preserve"> </w:t>
-      </w:r>
-      <w:hyperlink r:id="rId48">
-        <w:r>
-          <w:rPr>
-            <w:rStyle w:val="Hyperlink"/>
-          </w:rPr>
-          <w:t xml:space="preserve">https://www.enterprisesurveys.org</w:t>
-        </w:r>
-      </w:hyperlink>
-      <w:r>
-        <w:t xml:space="preserve">.</w:t>
+        <w:t xml:space="preserve">The World Economy</w:t>
+      </w:r>
+      <w:r>
+        <w:t xml:space="preserve">, Vol. 30 No. 1, pp. 60-82, doi: 10.1111/j.1467-9701.2007.00872.x.</w:t>
       </w:r>
     </w:p>
     <w:p>
@@ -7054,7 +7567,7 @@
         <w:pStyle w:val="BodyText"/>
       </w:pPr>
       <w:r>
-        <w:t xml:space="preserve">World Bank (2025),</w:t>
+        <w:t xml:space="preserve">World Bank (2013),</w:t>
       </w:r>
       <w:r>
         <w:t xml:space="preserve"> </w:t>
@@ -7064,27 +7577,13 @@
           <w:iCs/>
           <w:i/>
         </w:rPr>
-        <w:t xml:space="preserve">China Enterprise Survey 2024</w:t>
-      </w:r>
-      <w:r>
-        <w:t xml:space="preserve"> </w:t>
-      </w:r>
-      <w:r>
-        <w:t xml:space="preserve">[Data file], World Bank Enterprise Surveys, available at:</w:t>
-      </w:r>
-      <w:r>
-        <w:t xml:space="preserve"> </w:t>
-      </w:r>
-      <w:hyperlink r:id="rId48">
-        <w:r>
-          <w:rPr>
-            <w:rStyle w:val="Hyperlink"/>
-          </w:rPr>
-          <w:t xml:space="preserve">https://www.enterprisesurveys.org</w:t>
-        </w:r>
-      </w:hyperlink>
-      <w:r>
-        <w:t xml:space="preserve">.</w:t>
+        <w:t xml:space="preserve">China Enterprise Survey 2012</w:t>
+      </w:r>
+      <w:r>
+        <w:t xml:space="preserve"> </w:t>
+      </w:r>
+      <w:r>
+        <w:t xml:space="preserve">[Data file], World Bank Enterprise Surveys, available at: https://www.enterprisesurveys.org.</w:t>
       </w:r>
     </w:p>
     <w:p>
@@ -7092,7 +7591,7 @@
         <w:pStyle w:val="BodyText"/>
       </w:pPr>
       <w:r>
-        <w:t xml:space="preserve">Xiao, S.S., Jeong, I., Moon, J.J., Chung, C.C. and Chung, J. (2013), "Internationalization and performance of firms in China: Moderating effects of governance structure and the degree of centralized control",</w:t>
+        <w:t xml:space="preserve">World Bank (2025),</w:t>
       </w:r>
       <w:r>
         <w:t xml:space="preserve"> </w:t>
@@ -7102,105 +7601,133 @@
           <w:iCs/>
           <w:i/>
         </w:rPr>
-        <w:t xml:space="preserve">Journal of International Management</w:t>
-      </w:r>
-      <w:r>
-        <w:t xml:space="preserve">, Vol. 19 No. 2, pp. 118-137, doi: 10.1016/j.intman.2012.12.003.</w:t>
+        <w:t xml:space="preserve">China Enterprise Survey 2024</w:t>
+      </w:r>
+      <w:r>
+        <w:t xml:space="preserve"> </w:t>
+      </w:r>
+      <w:r>
+        <w:t xml:space="preserve">[Data file], World Bank Enterprise Surveys, available at: https://www.enterprisesurveys.org.</w:t>
       </w:r>
     </w:p>
     <w:p>
       <w:pPr>
         <w:pStyle w:val="BodyText"/>
       </w:pPr>
+      <w:r>
+        <w:t xml:space="preserve">Xiao, S.S., Jeong, I., Moon, J.J., Chung, C.C. and Chung, J. (2013),</w:t>
+      </w:r>
+      <w:r>
+        <w:t xml:space="preserve"> </w:t>
+      </w:r>
+      <w:r>
+        <w:t xml:space="preserve">“</w:t>
+      </w:r>
+      <w:r>
+        <w:t xml:space="preserve">Internationalization and performance of firms in China: Moderating effects of governance structure and the degree of centralized control</w:t>
+      </w:r>
+      <w:r>
+        <w:t xml:space="preserve">”</w:t>
+      </w:r>
+      <w:r>
+        <w:t xml:space="preserve">,</w:t>
+      </w:r>
+      <w:r>
+        <w:t xml:space="preserve"> </w:t>
+      </w:r>
       <w:r>
         <w:rPr>
           <w:iCs/>
           <w:i/>
         </w:rPr>
-        <w:t xml:space="preserve">Replication package: see</w:t>
-      </w:r>
-      <w:r>
-        <w:t xml:space="preserve"> </w:t>
-      </w:r>
-      <w:r>
-        <w:rPr>
-          <w:rStyle w:val="VerbatimChar"/>
-        </w:rPr>
-        <w:t xml:space="preserve">p5-china/</w:t>
-      </w:r>
-      <w:r>
-        <w:t xml:space="preserve"> </w:t>
-      </w:r>
+        <w:t xml:space="preserve">Journal of International Management</w:t>
+      </w:r>
+      <w:r>
+        <w:t xml:space="preserve">, Vol. 19 No. 2, pp. 118-137, doi: 10.1016/j.intman.2012.12.003.</w:t>
+      </w:r>
+    </w:p>
+    <w:p>
+      <w:pPr>
+        <w:pStyle w:val="BodyText"/>
+      </w:pPr>
       <w:r>
         <w:rPr>
           <w:iCs/>
           <w:i/>
         </w:rPr>
-        <w:t xml:space="preserve">directory in the corresponding</w:t>
+        <w:t xml:space="preserve">Replication package: see</w:t>
+      </w:r>
+      <w:r>
+        <w:t xml:space="preserve"> </w:t>
+      </w:r>
+      <w:r>
+        <w:rPr>
+          <w:rStyle w:val="VerbatimChar"/>
+        </w:rPr>
+        <w:t xml:space="preserve">p5-china/</w:t>
+      </w:r>
+      <w:r>
+        <w:t xml:space="preserve"> </w:t>
       </w:r>
       <w:r>
         <w:rPr>
           <w:iCs/>
           <w:i/>
         </w:rPr>
-        <w:t xml:space="preserve"> </w:t>
+        <w:t xml:space="preserve">directory in the corresponding</w:t>
       </w:r>
       <w:r>
         <w:rPr>
           <w:iCs/>
           <w:i/>
         </w:rPr>
-        <w:t xml:space="preserve">author’s repository (handle withheld for blind review), including</w:t>
-      </w:r>
-      <w:r>
-        <w:t xml:space="preserve"> </w:t>
-      </w:r>
-      <w:r>
-        <w:rPr>
-          <w:rStyle w:val="VerbatimChar"/>
-        </w:rPr>
-        <w:t xml:space="preserve">do/</w:t>
+        <w:t xml:space="preserve"> </w:t>
       </w:r>
       <w:r>
         <w:rPr>
           <w:iCs/>
           <w:i/>
         </w:rPr>
-        <w:t xml:space="preserve">, *</w:t>
+        <w:t xml:space="preserve">author’s repository (handle withheld for blind review), including</w:t>
+      </w:r>
+      <w:r>
+        <w:t xml:space="preserve"> </w:t>
+      </w:r>
+      <w:r>
+        <w:rPr>
+          <w:rStyle w:val="VerbatimChar"/>
+        </w:rPr>
+        <w:t xml:space="preserve">do/</w:t>
       </w:r>
       <w:r>
         <w:rPr>
           <w:iCs/>
           <w:i/>
         </w:rPr>
-        <w:t xml:space="preserve"> </w:t>
-      </w:r>
-      <w:r>
-        <w:rPr>
-          <w:rStyle w:val="VerbatimChar"/>
+        <w:t xml:space="preserve">,</w:t>
+      </w:r>
+      <w:r>
+        <w:rPr>
           <w:iCs/>
           <w:i/>
         </w:rPr>
+        <w:t xml:space="preserve"> </w:t>
+      </w:r>
+      <w:r>
+        <w:t xml:space="preserve"> </w:t>
+      </w:r>
+      <w:r>
+        <w:rPr>
+          <w:rStyle w:val="VerbatimChar"/>
+        </w:rPr>
         <w:t xml:space="preserve">python/</w:t>
-      </w:r>
-      <w:r>
-        <w:t xml:space="preserve">, *</w:t>
-      </w:r>
-      <w:r>
-        <w:t xml:space="preserve"> </w:t>
-      </w:r>
-      <w:r>
-        <w:rPr>
-          <w:rStyle w:val="VerbatimChar"/>
-        </w:rPr>
-        <w:t xml:space="preserve">audit/</w:t>
       </w:r>
       <w:r>
         <w:rPr>
           <w:iCs/>
           <w:i/>
         </w:rPr>
-        <w:t xml:space="preserve">, *</w:t>
+        <w:t xml:space="preserve">,</w:t>
       </w:r>
       <w:r>
         <w:rPr>
@@ -7210,40 +7737,54 @@
         <w:t xml:space="preserve"> </w:t>
       </w:r>
       <w:r>
+        <w:t xml:space="preserve"> </w:t>
+      </w:r>
+      <w:r>
         <w:rPr>
           <w:rStyle w:val="VerbatimChar"/>
+        </w:rPr>
+        <w:t xml:space="preserve">audit/</w:t>
+      </w:r>
+      <w:r>
+        <w:rPr>
           <w:iCs/>
           <w:i/>
         </w:rPr>
-        <w:t xml:space="preserve">results/</w:t>
-      </w:r>
-      <w:r>
-        <w:t xml:space="preserve">, and*</w:t>
-      </w:r>
-      <w:r>
-        <w:t xml:space="preserve"> </w:t>
-      </w:r>
-      <w:r>
-        <w:rPr>
-          <w:rStyle w:val="VerbatimChar"/>
-        </w:rPr>
-        <w:t xml:space="preserve">apjm/</w:t>
-      </w:r>
-      <w:r>
-        <w:t xml:space="preserve"> </w:t>
+        <w:t xml:space="preserve">,</w:t>
       </w:r>
       <w:r>
         <w:rPr>
           <w:iCs/>
           <w:i/>
         </w:rPr>
-        <w:t xml:space="preserve">subfolders.</w:t>
+        <w:t xml:space="preserve"> </w:t>
+      </w:r>
+      <w:r>
+        <w:t xml:space="preserve"> </w:t>
+      </w:r>
+      <w:r>
+        <w:rPr>
+          <w:rStyle w:val="VerbatimChar"/>
+        </w:rPr>
+        <w:t xml:space="preserve">results/</w:t>
       </w:r>
       <w:r>
         <w:rPr>
           <w:iCs/>
           <w:i/>
         </w:rPr>
+        <w:t xml:space="preserve">, and</w:t>
+      </w:r>
+      <w:r>
+        <w:t xml:space="preserve"> </w:t>
+      </w:r>
+      <w:r>
+        <w:rPr>
+          <w:rStyle w:val="VerbatimChar"/>
+        </w:rPr>
+        <w:t xml:space="preserve">apjm/</w:t>
+      </w:r>
+      <w:r>
         <w:t xml:space="preserve"> </w:t>
       </w:r>
       <w:r>
@@ -7251,7 +7792,7 @@
           <w:iCs/>
           <w:i/>
         </w:rPr>
-        <w:t xml:space="preserve">The complete v1.8 manuscript is assembled from six section parts</w:t>
+        <w:t xml:space="preserve">subfolders.</w:t>
       </w:r>
       <w:r>
         <w:rPr>
@@ -7265,64 +7806,64 @@
           <w:iCs/>
           <w:i/>
         </w:rPr>
-        <w:t xml:space="preserve">(</w:t>
-      </w:r>
-      <w:r>
-        <w:rPr>
-          <w:rStyle w:val="VerbatimChar"/>
-        </w:rPr>
-        <w:t xml:space="preserve">apjm/manuscript_v1_8_blinded_part{1, 2, 3, 4, 5, 6}_*.md</w:t>
+        <w:t xml:space="preserve">The complete v1.8 manuscript is assembled from six section parts</w:t>
       </w:r>
       <w:r>
         <w:rPr>
           <w:iCs/>
           <w:i/>
         </w:rPr>
-        <w:t xml:space="preserve">) per the build</w:t>
+        <w:t xml:space="preserve"> </w:t>
       </w:r>
       <w:r>
         <w:rPr>
           <w:iCs/>
           <w:i/>
         </w:rPr>
-        <w:t xml:space="preserve"> </w:t>
+        <w:t xml:space="preserve">(</w:t>
+      </w:r>
+      <w:r>
+        <w:rPr>
+          <w:rStyle w:val="VerbatimChar"/>
+        </w:rPr>
+        <w:t xml:space="preserve">apjm/manuscript_v1_8_blinded_part{1, 2, 3, 4, 5, 6}_*.md</w:t>
       </w:r>
       <w:r>
         <w:rPr>
           <w:iCs/>
           <w:i/>
         </w:rPr>
-        <w:t xml:space="preserve">script</w:t>
-      </w:r>
-      <w:r>
-        <w:t xml:space="preserve"> </w:t>
-      </w:r>
-      <w:r>
-        <w:rPr>
-          <w:rStyle w:val="VerbatimChar"/>
-        </w:rPr>
-        <w:t xml:space="preserve">apjm/build_docx.sh</w:t>
+        <w:t xml:space="preserve">) per the build</w:t>
       </w:r>
       <w:r>
         <w:rPr>
           <w:iCs/>
           <w:i/>
         </w:rPr>
-        <w:t xml:space="preserve">. Full replication code (Stata + Python),</w:t>
+        <w:t xml:space="preserve"> </w:t>
       </w:r>
       <w:r>
         <w:rPr>
           <w:iCs/>
           <w:i/>
         </w:rPr>
-        <w:t xml:space="preserve"> </w:t>
+        <w:t xml:space="preserve">script</w:t>
+      </w:r>
+      <w:r>
+        <w:t xml:space="preserve"> </w:t>
+      </w:r>
+      <w:r>
+        <w:rPr>
+          <w:rStyle w:val="VerbatimChar"/>
+        </w:rPr>
+        <w:t xml:space="preserve">apjm/build_docx.sh</w:t>
       </w:r>
       <w:r>
         <w:rPr>
           <w:iCs/>
           <w:i/>
         </w:rPr>
-        <w:t xml:space="preserve">audit tables, M0–M8 coefficients, three-way moderation results, citation</w:t>
+        <w:t xml:space="preserve">. Full replication code (Stata + Python),</w:t>
       </w:r>
       <w:r>
         <w:rPr>
@@ -7336,42 +7877,53 @@
           <w:iCs/>
           <w:i/>
         </w:rPr>
-        <w:t xml:space="preserve">verification (</w:t>
-      </w:r>
-      <w:r>
-        <w:rPr>
-          <w:rStyle w:val="VerbatimChar"/>
-        </w:rPr>
-        <w:t xml:space="preserve">apjm/VERIFICATION_RESULTS.md</w:t>
+        <w:t xml:space="preserve">audit tables, M0–M8 coefficients, three-way moderation results, citation</w:t>
       </w:r>
       <w:r>
         <w:rPr>
           <w:iCs/>
           <w:i/>
         </w:rPr>
-        <w:t xml:space="preserve">), and figure-rendering</w:t>
+        <w:t xml:space="preserve"> </w:t>
       </w:r>
       <w:r>
         <w:rPr>
           <w:iCs/>
           <w:i/>
         </w:rPr>
-        <w:t xml:space="preserve"> </w:t>
+        <w:t xml:space="preserve">verification (</w:t>
+      </w:r>
+      <w:r>
+        <w:rPr>
+          <w:rStyle w:val="VerbatimChar"/>
+        </w:rPr>
+        <w:t xml:space="preserve">apjm/VERIFICATION_RESULTS.md</w:t>
       </w:r>
       <w:r>
         <w:rPr>
           <w:iCs/>
           <w:i/>
         </w:rPr>
+        <w:t xml:space="preserve">), and figure-rendering</w:t>
+      </w:r>
+      <w:r>
+        <w:rPr>
+          <w:iCs/>
+          <w:i/>
+        </w:rPr>
+        <w:t xml:space="preserve"> </w:t>
+      </w:r>
+      <w:r>
+        <w:rPr>
+          <w:iCs/>
+          <w:i/>
+        </w:rPr>
         <w:t xml:space="preserve">scripts are documented in the repository README.</w:t>
       </w:r>
     </w:p>
     <w:bookmarkEnd w:id="52"/>
     <w:bookmarkEnd w:id="53"/>
-    <w:sectPr>
-      <w:pgSz w:h="16838" w:w="11906"/>
-      <w:pgMar w:bottom="1417" w:left="1417" w:right="1417" w:top="1417"/>
-    </w:sectPr>
+    <w:sectPr/>
   </w:body>
 </w:document>
 </file>
@@ -7583,59 +8135,29 @@
   <w:style w:default="1" w:styleId="Normal" w:type="paragraph">
     <w:name w:val="Normal"/>
     <w:qFormat/>
-    <w:pPr>
-      <w:spacing w:line="276" w:lineRule="auto"/>
-      <w:jc w:val="both"/>
-    </w:pPr>
-    <w:rPr>
-      <w:rFonts w:ascii="Times New Roman" w:eastAsia="Times New Roman" w:hAnsi="Times New Roman"/>
-      <w:color w:val="000000"/>
-      <w:sz w:val="24"/>
-    </w:rPr>
   </w:style>
   <w:style w:styleId="BodyText" w:type="paragraph">
     <w:name w:val="Body Text"/>
     <w:basedOn w:val="Normal"/>
     <w:link w:val="BodyTextChar"/>
     <w:pPr>
-      <w:spacing w:after="180" w:before="180" w:line="276" w:lineRule="auto"/>
-      <w:jc w:val="both"/>
+      <w:spacing w:after="180" w:before="180"/>
     </w:pPr>
     <w:qFormat/>
-    <w:rPr>
-      <w:rFonts w:ascii="Times New Roman" w:eastAsia="Times New Roman" w:hAnsi="Times New Roman"/>
-      <w:color w:val="000000"/>
-      <w:sz w:val="24"/>
-    </w:rPr>
   </w:style>
   <w:style w:customStyle="1" w:styleId="FirstParagraph" w:type="paragraph">
     <w:name w:val="First Paragraph"/>
     <w:basedOn w:val="BodyText"/>
     <w:next w:val="BodyText"/>
     <w:qFormat/>
-    <w:pPr>
-      <w:spacing w:line="276" w:lineRule="auto"/>
-      <w:jc w:val="both"/>
-    </w:pPr>
-    <w:rPr>
-      <w:rFonts w:ascii="Times New Roman" w:eastAsia="Times New Roman" w:hAnsi="Times New Roman"/>
-      <w:color w:val="000000"/>
-      <w:sz w:val="24"/>
-    </w:rPr>
   </w:style>
   <w:style w:customStyle="1" w:styleId="Compact" w:type="paragraph">
     <w:name w:val="Compact"/>
     <w:basedOn w:val="BodyText"/>
     <w:qFormat/>
     <w:pPr>
-      <w:spacing w:after="36" w:before="36" w:line="276" w:lineRule="auto"/>
-      <w:jc w:val="both"/>
+      <w:spacing w:after="36" w:before="36"/>
     </w:pPr>
-    <w:rPr>
-      <w:rFonts w:ascii="Times New Roman" w:eastAsia="Times New Roman" w:hAnsi="Times New Roman"/>
-      <w:color w:val="000000"/>
-      <w:sz w:val="24"/>
-    </w:rPr>
   </w:style>
   <w:style w:styleId="Title" w:type="paragraph">
     <w:name w:val="Title"/>
@@ -7645,15 +8167,15 @@
     <w:pPr>
       <w:keepNext/>
       <w:keepLines/>
-      <w:spacing w:after="240" w:before="480" w:line="276" w:lineRule="auto"/>
-      <w:jc w:val="both"/>
+      <w:spacing w:after="240" w:before="480"/>
+      <w:jc w:val="center"/>
     </w:pPr>
     <w:rPr>
-      <w:rFonts w:ascii="Times New Roman" w:asciiTheme="majorHAnsi" w:cstheme="majorBidi" w:eastAsia="Times New Roman" w:eastAsiaTheme="majorEastAsia" w:hAnsi="Times New Roman" w:hAnsiTheme="majorHAnsi"/>
+      <w:rFonts w:asciiTheme="majorHAnsi" w:cstheme="majorBidi" w:eastAsiaTheme="majorEastAsia" w:hAnsiTheme="majorHAnsi"/>
       <w:b/>
       <w:bCs/>
-      <w:color w:val="000000"/>
-      <w:sz w:val="24"/>
+      <w:color w:themeColor="accent1" w:themeShade="B5" w:val="345A8A"/>
+      <w:sz w:val="36"/>
       <w:szCs w:val="36"/>
     </w:rPr>
   </w:style>
@@ -7665,13 +8187,11 @@
     <w:pPr>
       <w:keepNext/>
       <w:keepLines/>
-      <w:spacing w:after="240" w:before="240" w:line="276" w:lineRule="auto"/>
-      <w:jc w:val="both"/>
+      <w:spacing w:after="240" w:before="240"/>
+      <w:jc w:val="center"/>
     </w:pPr>
     <w:rPr>
-      <w:rFonts w:ascii="Times New Roman" w:eastAsia="Times New Roman" w:hAnsi="Times New Roman"/>
-      <w:color w:val="000000"/>
-      <w:sz w:val="24"/>
+      <w:sz w:val="30"/>
       <w:szCs w:val="30"/>
     </w:rPr>
   </w:style>
@@ -7682,14 +8202,8 @@
     <w:pPr>
       <w:keepNext/>
       <w:keepLines/>
-      <w:spacing w:line="276" w:lineRule="auto"/>
-      <w:jc w:val="both"/>
+      <w:jc w:val="center"/>
     </w:pPr>
-    <w:rPr>
-      <w:rFonts w:ascii="Times New Roman" w:eastAsia="Times New Roman" w:hAnsi="Times New Roman"/>
-      <w:color w:val="000000"/>
-      <w:sz w:val="24"/>
-    </w:rPr>
   </w:style>
   <w:style w:styleId="Date" w:type="paragraph">
     <w:name w:val="Date"/>
@@ -7698,14 +8212,8 @@
     <w:pPr>
       <w:keepNext/>
       <w:keepLines/>
-      <w:spacing w:line="276" w:lineRule="auto"/>
-      <w:jc w:val="both"/>
+      <w:jc w:val="center"/>
     </w:pPr>
-    <w:rPr>
-      <w:rFonts w:ascii="Times New Roman" w:eastAsia="Times New Roman" w:hAnsi="Times New Roman"/>
-      <w:color w:val="000000"/>
-      <w:sz w:val="24"/>
-    </w:rPr>
   </w:style>
   <w:style w:customStyle="1" w:styleId="AbstractTitle" w:type="paragraph">
     <w:name w:val="Abstract Title"/>
@@ -7715,15 +8223,15 @@
     <w:pPr>
       <w:keepNext/>
       <w:keepLines/>
-      <w:jc w:val="both"/>
-      <w:spacing w:after="0" w:before="300" w:line="276" w:lineRule="auto"/>
+      <w:jc w:val="center"/>
+      <w:spacing w:after="0" w:before="300"/>
     </w:pPr>
     <w:rPr>
-      <w:color w:val="000000"/>
-      <w:sz w:val="24"/>
+      <w:sz w:val="20"/>
       <w:szCs w:val="20"/>
-      <w:rFonts w:ascii="Times New Roman" w:eastAsia="Times New Roman" w:hAnsi="Times New Roman"/>
       <w:b/>
+      <w:color w:val="345A8A"/>
+      &gt;
     </w:rPr>
   </w:style>
   <w:style w:customStyle="1" w:styleId="Abstract" w:type="paragraph">
@@ -7734,13 +8242,10 @@
     <w:pPr>
       <w:keepNext/>
       <w:keepLines/>
-      <w:spacing w:after="300" w:before="100" w:line="276" w:lineRule="auto"/>
-      <w:jc w:val="both"/>
+      <w:spacing w:after="300" w:before="100"/>
     </w:pPr>
     <w:rPr>
-      <w:rFonts w:ascii="Times New Roman" w:eastAsia="Times New Roman" w:hAnsi="Times New Roman"/>
-      <w:color w:val="000000"/>
-      <w:sz w:val="24"/>
+      <w:sz w:val="20"/>
       <w:szCs w:val="20"/>
     </w:rPr>
   </w:style>
@@ -7749,15 +8254,8 @@
     <w:basedOn w:val="Normal"/>
     <w:next w:val="Bibliography"/>
     <w:qFormat/>
-    <w:pPr>
-      <w:spacing w:line="276" w:lineRule="auto"/>
-      <w:jc w:val="both"/>
-    </w:pPr>
-    <w:rPr>
-      <w:rFonts w:ascii="Times New Roman" w:eastAsia="Times New Roman" w:hAnsi="Times New Roman"/>
-      <w:color w:val="000000"/>
-      <w:sz w:val="24"/>
-    </w:rPr>
+    <w:pPr/>
+    <w:rPr/>
   </w:style>
   <w:style w:styleId="Heading1" w:type="paragraph">
     <w:name w:val="Heading 1"/>
@@ -7768,16 +8266,15 @@
     <w:pPr>
       <w:keepNext/>
       <w:keepLines/>
-      <w:spacing w:after="0" w:before="480" w:line="276" w:lineRule="auto"/>
-      <w:jc w:val="both"/>
+      <w:spacing w:after="0" w:before="480"/>
       <w:outlineLvl w:val="0"/>
     </w:pPr>
     <w:rPr>
-      <w:rFonts w:ascii="Times New Roman" w:asciiTheme="majorHAnsi" w:cstheme="majorBidi" w:eastAsia="Times New Roman" w:eastAsiaTheme="majorEastAsia" w:hAnsi="Times New Roman" w:hAnsiTheme="majorHAnsi"/>
+      <w:rFonts w:asciiTheme="majorHAnsi" w:cstheme="majorBidi" w:eastAsiaTheme="majorEastAsia" w:hAnsiTheme="majorHAnsi"/>
       <w:b/>
       <w:bCs/>
-      <w:color w:val="000000"/>
-      <w:sz w:val="24"/>
+      <w:color w:themeColor="accent1" w:val="4F81BD"/>
+      <w:sz w:val="32"/>
       <w:szCs w:val="32"/>
     </w:rPr>
   </w:style>
@@ -7791,16 +8288,15 @@
     <w:pPr>
       <w:keepNext/>
       <w:keepLines/>
-      <w:spacing w:after="0" w:before="200" w:line="276" w:lineRule="auto"/>
-      <w:jc w:val="both"/>
+      <w:spacing w:after="0" w:before="200"/>
       <w:outlineLvl w:val="1"/>
     </w:pPr>
     <w:rPr>
-      <w:rFonts w:ascii="Times New Roman" w:asciiTheme="majorHAnsi" w:cstheme="majorBidi" w:eastAsia="Times New Roman" w:eastAsiaTheme="majorEastAsia" w:hAnsi="Times New Roman" w:hAnsiTheme="majorHAnsi"/>
+      <w:rFonts w:asciiTheme="majorHAnsi" w:cstheme="majorBidi" w:eastAsiaTheme="majorEastAsia" w:hAnsiTheme="majorHAnsi"/>
       <w:b/>
       <w:bCs/>
-      <w:color w:val="000000"/>
-      <w:sz w:val="24"/>
+      <w:color w:themeColor="accent1" w:val="4F81BD"/>
+      <w:sz w:val="28"/>
       <w:szCs w:val="28"/>
     </w:rPr>
   </w:style>
@@ -7814,15 +8310,14 @@
     <w:pPr>
       <w:keepNext/>
       <w:keepLines/>
-      <w:spacing w:after="0" w:before="200" w:line="276" w:lineRule="auto"/>
-      <w:jc w:val="both"/>
+      <w:spacing w:after="0" w:before="200"/>
       <w:outlineLvl w:val="2"/>
     </w:pPr>
     <w:rPr>
-      <w:rFonts w:ascii="Times New Roman" w:asciiTheme="majorHAnsi" w:cstheme="majorBidi" w:eastAsia="Times New Roman" w:eastAsiaTheme="majorEastAsia" w:hAnsi="Times New Roman" w:hAnsiTheme="majorHAnsi"/>
+      <w:rFonts w:asciiTheme="majorHAnsi" w:cstheme="majorBidi" w:eastAsiaTheme="majorEastAsia" w:hAnsiTheme="majorHAnsi"/>
       <w:b/>
       <w:bCs/>
-      <w:color w:val="000000"/>
+      <w:color w:themeColor="accent1" w:val="4F81BD"/>
       <w:sz w:val="24"/>
       <w:szCs w:val="24"/>
     </w:rPr>
@@ -7837,15 +8332,14 @@
     <w:pPr>
       <w:keepNext/>
       <w:keepLines/>
-      <w:spacing w:after="0" w:before="200" w:line="276" w:lineRule="auto"/>
-      <w:jc w:val="both"/>
+      <w:spacing w:after="0" w:before="200"/>
       <w:outlineLvl w:val="3"/>
     </w:pPr>
     <w:rPr>
-      <w:rFonts w:ascii="Times New Roman" w:asciiTheme="majorHAnsi" w:cstheme="majorBidi" w:eastAsia="Times New Roman" w:eastAsiaTheme="majorEastAsia" w:hAnsi="Times New Roman" w:hAnsiTheme="majorHAnsi"/>
+      <w:rFonts w:asciiTheme="majorHAnsi" w:cstheme="majorBidi" w:eastAsiaTheme="majorEastAsia" w:hAnsiTheme="majorHAnsi"/>
       <w:i/>
       <w:bCs/>
-      <w:color w:val="000000"/>
+      <w:color w:themeColor="accent1" w:val="4F81BD"/>
       <w:sz w:val="24"/>
       <w:szCs w:val="24"/>
     </w:rPr>
@@ -7860,14 +8354,13 @@
     <w:pPr>
       <w:keepNext/>
       <w:keepLines/>
-      <w:spacing w:after="0" w:before="200" w:line="276" w:lineRule="auto"/>
-      <w:jc w:val="both"/>
+      <w:spacing w:after="0" w:before="200"/>
       <w:outlineLvl w:val="4"/>
     </w:pPr>
     <w:rPr>
-      <w:rFonts w:ascii="Times New Roman" w:asciiTheme="majorHAnsi" w:cstheme="majorBidi" w:eastAsia="Times New Roman" w:eastAsiaTheme="majorEastAsia" w:hAnsi="Times New Roman" w:hAnsiTheme="majorHAnsi"/>
+      <w:rFonts w:asciiTheme="majorHAnsi" w:cstheme="majorBidi" w:eastAsiaTheme="majorEastAsia" w:hAnsiTheme="majorHAnsi"/>
       <w:iCs/>
-      <w:color w:val="000000"/>
+      <w:color w:themeColor="accent1" w:val="4F81BD"/>
       <w:sz w:val="24"/>
       <w:szCs w:val="24"/>
     </w:rPr>
@@ -7882,13 +8375,12 @@
     <w:pPr>
       <w:keepNext/>
       <w:keepLines/>
-      <w:spacing w:after="0" w:before="200" w:line="276" w:lineRule="auto"/>
-      <w:jc w:val="both"/>
+      <w:spacing w:after="0" w:before="200"/>
       <w:outlineLvl w:val="5"/>
     </w:pPr>
     <w:rPr>
-      <w:rFonts w:ascii="Times New Roman" w:asciiTheme="majorHAnsi" w:cstheme="majorBidi" w:eastAsia="Times New Roman" w:eastAsiaTheme="majorEastAsia" w:hAnsi="Times New Roman" w:hAnsiTheme="majorHAnsi"/>
-      <w:color w:val="000000"/>
+      <w:rFonts w:asciiTheme="majorHAnsi" w:cstheme="majorBidi" w:eastAsiaTheme="majorEastAsia" w:hAnsiTheme="majorHAnsi"/>
+      <w:color w:themeColor="accent1" w:val="4F81BD"/>
       <w:sz w:val="24"/>
       <w:szCs w:val="24"/>
     </w:rPr>
@@ -7903,13 +8395,12 @@
     <w:pPr>
       <w:keepNext/>
       <w:keepLines/>
-      <w:spacing w:after="0" w:before="200" w:line="276" w:lineRule="auto"/>
-      <w:jc w:val="both"/>
+      <w:spacing w:after="0" w:before="200"/>
       <w:outlineLvl w:val="6"/>
     </w:pPr>
     <w:rPr>
-      <w:rFonts w:ascii="Times New Roman" w:asciiTheme="majorHAnsi" w:cstheme="majorBidi" w:eastAsia="Times New Roman" w:eastAsiaTheme="majorEastAsia" w:hAnsi="Times New Roman" w:hAnsiTheme="majorHAnsi"/>
-      <w:color w:val="000000"/>
+      <w:rFonts w:asciiTheme="majorHAnsi" w:cstheme="majorBidi" w:eastAsiaTheme="majorEastAsia" w:hAnsiTheme="majorHAnsi"/>
+      <w:color w:themeColor="accent1" w:val="4F81BD"/>
       <w:sz w:val="24"/>
       <w:szCs w:val="24"/>
     </w:rPr>
@@ -7924,13 +8415,12 @@
     <w:pPr>
       <w:keepNext/>
       <w:keepLines/>
-      <w:spacing w:after="0" w:before="200" w:line="276" w:lineRule="auto"/>
-      <w:jc w:val="both"/>
+      <w:spacing w:after="0" w:before="200"/>
       <w:outlineLvl w:val="7"/>
     </w:pPr>
     <w:rPr>
-      <w:rFonts w:ascii="Times New Roman" w:asciiTheme="majorHAnsi" w:cstheme="majorBidi" w:eastAsia="Times New Roman" w:eastAsiaTheme="majorEastAsia" w:hAnsi="Times New Roman" w:hAnsiTheme="majorHAnsi"/>
-      <w:color w:val="000000"/>
+      <w:rFonts w:asciiTheme="majorHAnsi" w:cstheme="majorBidi" w:eastAsiaTheme="majorEastAsia" w:hAnsiTheme="majorHAnsi"/>
+      <w:color w:themeColor="accent1" w:val="4F81BD"/>
       <w:sz w:val="24"/>
       <w:szCs w:val="24"/>
     </w:rPr>
@@ -7945,13 +8435,12 @@
     <w:pPr>
       <w:keepNext/>
       <w:keepLines/>
-      <w:spacing w:after="0" w:before="200" w:line="276" w:lineRule="auto"/>
-      <w:jc w:val="both"/>
+      <w:spacing w:after="0" w:before="200"/>
       <w:outlineLvl w:val="8"/>
     </w:pPr>
     <w:rPr>
-      <w:rFonts w:ascii="Times New Roman" w:asciiTheme="majorHAnsi" w:cstheme="majorBidi" w:eastAsia="Times New Roman" w:eastAsiaTheme="majorEastAsia" w:hAnsi="Times New Roman" w:hAnsiTheme="majorHAnsi"/>
-      <w:color w:val="000000"/>
+      <w:rFonts w:asciiTheme="majorHAnsi" w:cstheme="majorBidi" w:eastAsiaTheme="majorEastAsia" w:hAnsiTheme="majorHAnsi"/>
+      <w:color w:themeColor="accent1" w:val="4F81BD"/>
       <w:sz w:val="24"/>
       <w:szCs w:val="24"/>
     </w:rPr>
@@ -7964,15 +8453,9 @@
     <w:unhideWhenUsed/>
     <w:qFormat/>
     <w:pPr>
-      <w:spacing w:after="100" w:before="100" w:line="276" w:lineRule="auto"/>
+      <w:spacing w:after="100" w:before="100"/>
       <w:ind w:firstLine="0" w:left="480" w:right="480"/>
-      <w:jc w:val="both"/>
     </w:pPr>
-    <w:rPr>
-      <w:rFonts w:ascii="Times New Roman" w:eastAsia="Times New Roman" w:hAnsi="Times New Roman"/>
-      <w:color w:val="000000"/>
-      <w:sz w:val="24"/>
-    </w:rPr>
   </w:style>
   <w:style w:styleId="FootnoteText" w:type="paragraph">
     <w:name w:val="Footnote Text"/>
@@ -7981,25 +8464,11 @@
     <w:uiPriority w:val="9"/>
     <w:unhideWhenUsed/>
     <w:qFormat/>
-    <w:pPr>
-      <w:spacing w:line="276" w:lineRule="auto"/>
-      <w:jc w:val="both"/>
-    </w:pPr>
-    <w:rPr>
-      <w:rFonts w:ascii="Times New Roman" w:eastAsia="Times New Roman" w:hAnsi="Times New Roman"/>
-      <w:color w:val="000000"/>
-      <w:sz w:val="24"/>
-    </w:rPr>
   </w:style>
   <w:style w:default="1" w:styleId="DefaultParagraphFont" w:type="character">
     <w:name w:val="Default Paragraph Font"/>
     <w:semiHidden/>
     <w:unhideWhenUsed/>
-    <w:rPr>
-      <w:rFonts w:ascii="Times New Roman" w:eastAsia="Times New Roman" w:hAnsi="Times New Roman"/>
-      <w:color w:val="000000"/>
-      <w:sz w:val="24"/>
-    </w:rPr>
   </w:style>
   <w:style w:default="1" w:styleId="Table" w:type="table">
     <w:name w:val="Table"/>
@@ -8007,15 +8476,6 @@
     <w:semiHidden/>
     <w:unhideWhenUsed/>
     <w:qFormat/>
-    <w:pPr>
-      <w:spacing w:line="276" w:lineRule="auto"/>
-      <w:jc w:val="both"/>
-    </w:pPr>
-    <w:rPr>
-      <w:rFonts w:ascii="Times New Roman" w:eastAsia="Times New Roman" w:hAnsi="Times New Roman"/>
-      <w:color w:val="000000"/>
-      <w:sz w:val="24"/>
-    </w:rPr>
     <w:tblPr>
       <w:tblInd w:type="dxa" w:w="0"/>
       <w:tblCellMar>
@@ -8048,42 +8508,25 @@
     <w:pPr>
       <w:keepNext/>
       <w:keepLines/>
-      <w:spacing w:after="0" w:line="276" w:lineRule="auto"/>
-      <w:jc w:val="both"/>
+      <w:spacing w:after="0"/>
     </w:pPr>
     <w:rPr>
-      <w:rFonts w:ascii="Times New Roman" w:eastAsia="Times New Roman" w:hAnsi="Times New Roman"/>
       <w:b/>
-      <w:color w:val="000000"/>
-      <w:sz w:val="24"/>
     </w:rPr>
   </w:style>
   <w:style w:customStyle="1" w:styleId="Definition" w:type="paragraph">
     <w:name w:val="Definition"/>
     <w:basedOn w:val="Normal"/>
-    <w:pPr>
-      <w:spacing w:line="276" w:lineRule="auto"/>
-      <w:jc w:val="both"/>
-    </w:pPr>
-    <w:rPr>
-      <w:rFonts w:ascii="Times New Roman" w:eastAsia="Times New Roman" w:hAnsi="Times New Roman"/>
-      <w:color w:val="000000"/>
-      <w:sz w:val="24"/>
-    </w:rPr>
   </w:style>
   <w:style w:styleId="Caption" w:type="paragraph">
     <w:name w:val="Caption"/>
     <w:basedOn w:val="Normal"/>
     <w:link w:val="BodyTextChar"/>
     <w:pPr>
-      <w:spacing w:after="120" w:before="0" w:line="276" w:lineRule="auto"/>
-      <w:jc w:val="both"/>
+      <w:spacing w:after="120" w:before="0"/>
     </w:pPr>
     <w:rPr>
-      <w:rFonts w:ascii="Times New Roman" w:eastAsia="Times New Roman" w:hAnsi="Times New Roman"/>
       <w:i/>
-      <w:color w:val="000000"/>
-      <w:sz w:val="24"/>
     </w:rPr>
   </w:style>
   <w:style w:customStyle="1" w:styleId="TableCaption" w:type="paragraph">
@@ -8091,90 +8534,44 @@
     <w:basedOn w:val="Caption"/>
     <w:pPr>
       <w:keepNext/>
-      <w:spacing w:line="276" w:lineRule="auto"/>
-      <w:jc w:val="both"/>
     </w:pPr>
-    <w:rPr>
-      <w:rFonts w:ascii="Times New Roman" w:eastAsia="Times New Roman" w:hAnsi="Times New Roman"/>
-      <w:color w:val="000000"/>
-      <w:sz w:val="24"/>
-    </w:rPr>
   </w:style>
   <w:style w:customStyle="1" w:styleId="ImageCaption" w:type="paragraph">
     <w:name w:val="Image Caption"/>
     <w:basedOn w:val="Caption"/>
-    <w:pPr>
-      <w:spacing w:line="276" w:lineRule="auto"/>
-      <w:jc w:val="both"/>
-    </w:pPr>
-    <w:rPr>
-      <w:rFonts w:ascii="Times New Roman" w:eastAsia="Times New Roman" w:hAnsi="Times New Roman"/>
-      <w:color w:val="000000"/>
-      <w:sz w:val="24"/>
-    </w:rPr>
   </w:style>
   <w:style w:customStyle="1" w:styleId="Figure" w:type="paragraph">
     <w:name w:val="Figure"/>
     <w:basedOn w:val="Normal"/>
-    <w:pPr>
-      <w:spacing w:line="276" w:lineRule="auto"/>
-      <w:jc w:val="both"/>
-    </w:pPr>
-    <w:rPr>
-      <w:rFonts w:ascii="Times New Roman" w:eastAsia="Times New Roman" w:hAnsi="Times New Roman"/>
-      <w:color w:val="000000"/>
-      <w:sz w:val="24"/>
-    </w:rPr>
   </w:style>
   <w:style w:customStyle="1" w:styleId="CaptionedFigure" w:type="paragraph">
     <w:name w:val="Captioned Figure"/>
     <w:basedOn w:val="Figure"/>
     <w:pPr>
       <w:keepNext/>
-      <w:spacing w:line="276" w:lineRule="auto"/>
-      <w:jc w:val="both"/>
     </w:pPr>
-    <w:rPr>
-      <w:rFonts w:ascii="Times New Roman" w:eastAsia="Times New Roman" w:hAnsi="Times New Roman"/>
-      <w:color w:val="000000"/>
-      <w:sz w:val="24"/>
-    </w:rPr>
   </w:style>
   <w:style w:customStyle="1" w:styleId="BodyTextChar" w:type="character">
     <w:name w:val="Body Text Char"/>
     <w:basedOn w:val="DefaultParagraphFont"/>
     <w:link w:val="BodyText"/>
-    <w:rPr>
-      <w:rFonts w:ascii="Times New Roman" w:eastAsia="Times New Roman" w:hAnsi="Times New Roman"/>
-      <w:color w:val="000000"/>
-      <w:sz w:val="24"/>
-    </w:rPr>
   </w:style>
   <w:style w:customStyle="1" w:styleId="VerbatimChar" w:type="character">
     <w:name w:val="Verbatim Char"/>
     <w:basedOn w:val="BodyTextChar"/>
     <w:rPr>
-      <w:rFonts w:ascii="Times New Roman" w:eastAsia="Times New Roman" w:hAnsi="Times New Roman"/>
-      <w:color w:val="000000"/>
-      <w:sz w:val="24"/>
+      <w:rFonts w:ascii="Consolas" w:hAnsi="Consolas"/>
+      <w:sz w:val="22"/>
     </w:rPr>
   </w:style>
   <w:style w:customStyle="1" w:styleId="SectionNumber" w:type="character">
     <w:name w:val="Section Number"/>
     <w:basedOn w:val="BodyTextChar"/>
-    <w:rPr>
-      <w:rFonts w:ascii="Times New Roman" w:eastAsia="Times New Roman" w:hAnsi="Times New Roman"/>
-      <w:color w:val="000000"/>
-      <w:sz w:val="24"/>
-    </w:rPr>
   </w:style>
   <w:style w:styleId="FootnoteReference" w:type="character">
     <w:name w:val="Footnote Reference"/>
     <w:basedOn w:val="BodyTextChar"/>
     <w:rPr>
-      <w:rFonts w:ascii="Times New Roman" w:eastAsia="Times New Roman" w:hAnsi="Times New Roman"/>
-      <w:color w:val="000000"/>
-      <w:sz w:val="24"/>
       <w:vertAlign w:val="superscript"/>
     </w:rPr>
   </w:style>
@@ -8182,9 +8579,7 @@
     <w:name w:val="Hyperlink"/>
     <w:basedOn w:val="BodyTextChar"/>
     <w:rPr>
-      <w:rFonts w:ascii="Times New Roman" w:eastAsia="Times New Roman" w:hAnsi="Times New Roman"/>
-      <w:color w:val="000000"/>
-      <w:sz w:val="24"/>
+      <w:color w:themeColor="accent1" w:val="4F81BD"/>
     </w:rPr>
   </w:style>
   <w:style w:styleId="TOCHeading" w:type="paragraph">
@@ -8195,16 +8590,14 @@
     <w:unhideWhenUsed/>
     <w:qFormat/>
     <w:pPr>
-      <w:spacing w:before="240" w:line="276" w:lineRule="auto"/>
-      <w:jc w:val="both"/>
+      <w:spacing w:before="240" w:line="259" w:lineRule="auto"/>
       <w:outlineLvl w:val="9"/>
     </w:pPr>
     <w:rPr>
-      <w:rFonts w:ascii="Times New Roman" w:asciiTheme="majorHAnsi" w:cstheme="majorBidi" w:eastAsia="Times New Roman" w:eastAsiaTheme="majorEastAsia" w:hAnsi="Times New Roman" w:hAnsiTheme="majorHAnsi"/>
+      <w:rFonts w:asciiTheme="majorHAnsi" w:cstheme="majorBidi" w:eastAsiaTheme="majorEastAsia" w:hAnsiTheme="majorHAnsi"/>
       <w:b w:val="0"/>
       <w:bCs w:val="0"/>
-      <w:color w:val="000000"/>
-      <w:sz w:val="24"/>
+      <w:color w:themeColor="accent1" w:themeShade="BF" w:val="365F91"/>
     </w:rPr>
   </w:style>
   <w:style w:type="paragraph" w:customStyle="1" w:styleId="SourceCode">

</xml_diff>